<commit_message>
Add thesis template DOCX and temp files
Add updated Predlozak_za_ocjenske_radove_fepr-novo-2024-10.docx and two Word temporary/lock files (~$edlozak_...docx and ~WRL2402.tmp). The temporary files are editor artifacts and should be ignored in future commits—consider adding common MS Office temp patterns to .gitignore.
</commit_message>
<xml_diff>
--- a/Predlozak_za_ocjenske_radove_fepr-novo-2024-10 (1) (2).docx
+++ b/Predlozak_za_ocjenske_radove_fepr-novo-2024-10 (1) (2).docx
@@ -2961,6 +2961,7 @@
         <w:rPr>
           <w:b/>
           <w:i/>
+          <w:noProof/>
           <w:sz w:val="24"/>
         </w:rPr>
         <w:lastRenderedPageBreak/>
@@ -3188,7 +3189,7 @@
           </mc:Choice>
           <mc:Fallback>
             <w:pict>
-              <v:group w14:anchorId="12509383" id="Group 2" o:spid="_x0000_s1026" style="position:absolute;margin-left:252.9pt;margin-top:271.25pt;width:296.2pt;height:100.45pt;z-index:15729152;mso-wrap-distance-left:0;mso-wrap-distance-right:0;mso-position-horizontal-relative:page;mso-position-vertical-relative:page" coordsize="37617,12757" o:gfxdata="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">
+              <v:group w14:anchorId="45ECD8B1" id="Group 2" o:spid="_x0000_s1026" style="position:absolute;margin-left:252.9pt;margin-top:271.25pt;width:296.2pt;height:100.45pt;z-index:15729152;mso-wrap-distance-left:0;mso-wrap-distance-right:0;mso-position-horizontal-relative:page;mso-position-vertical-relative:page" coordsize="37617,12757" o:gfxdata="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">
                 <v:shapetype id="_x0000_t75" coordsize="21600,21600" o:spt="75" o:preferrelative="t" path="m@4@5l@4@11@9@11@9@5xe" filled="f" stroked="f">
                   <v:stroke joinstyle="miter"/>
                   <v:formulas>
@@ -3245,6 +3246,7 @@
         <w:rPr>
           <w:b/>
           <w:i/>
+          <w:noProof/>
           <w:sz w:val="24"/>
         </w:rPr>
         <mc:AlternateContent>
@@ -3471,7 +3473,7 @@
           </mc:Choice>
           <mc:Fallback>
             <w:pict>
-              <v:group w14:anchorId="622AFFCF" id="Group 5" o:spid="_x0000_s1026" style="position:absolute;margin-left:451.35pt;margin-top:44.6pt;width:91.7pt;height:104.45pt;z-index:15728640;mso-wrap-distance-left:0;mso-wrap-distance-right:0;mso-position-horizontal-relative:page" coordsize="11645,13265" o:gfxdata="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">
+              <v:group w14:anchorId="022EA490" id="Group 5" o:spid="_x0000_s1026" style="position:absolute;margin-left:451.35pt;margin-top:44.6pt;width:91.7pt;height:104.45pt;z-index:15728640;mso-wrap-distance-left:0;mso-wrap-distance-right:0;mso-position-horizontal-relative:page" coordsize="11645,13265" o:gfxdata="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">
                 <v:shape id="Image 6" o:spid="_x0000_s1027" type="#_x0000_t75" style="position:absolute;top:127;width:11518;height:13138;visibility:visible;mso-wrap-style:square" o:gfxdata="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">
                   <v:imagedata r:id="rId14" o:title=""/>
                 </v:shape>
@@ -4637,6 +4639,7 @@
         <w:rPr>
           <w:b/>
           <w:i/>
+          <w:noProof/>
           <w:sz w:val="24"/>
         </w:rPr>
         <mc:AlternateContent>
@@ -4884,7 +4887,7 @@
           </mc:Choice>
           <mc:Fallback>
             <w:pict>
-              <v:group w14:anchorId="2C2B75FF" id="Group 8" o:spid="_x0000_s1026" style="position:absolute;margin-left:376.5pt;margin-top:35.4pt;width:165.6pt;height:121.1pt;z-index:-16143872;mso-wrap-distance-left:0;mso-wrap-distance-right:0;mso-position-horizontal-relative:page" coordsize="21031,15379" o:gfxdata="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">
+              <v:group w14:anchorId="48D70E2D" id="Group 8" o:spid="_x0000_s1026" style="position:absolute;margin-left:376.5pt;margin-top:35.4pt;width:165.6pt;height:121.1pt;z-index:-16143872;mso-wrap-distance-left:0;mso-wrap-distance-right:0;mso-position-horizontal-relative:page" coordsize="21031,15379" o:gfxdata="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">
                 <v:shape id="Image 9" o:spid="_x0000_s1027" type="#_x0000_t75" style="position:absolute;left:2534;top:4086;width:18497;height:11293;visibility:visible;mso-wrap-style:square" o:gfxdata="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">
                   <v:imagedata r:id="rId17" o:title=""/>
                 </v:shape>
@@ -5087,6 +5090,7 @@
         <w:rPr>
           <w:b/>
           <w:i/>
+          <w:noProof/>
           <w:sz w:val="24"/>
         </w:rPr>
         <mc:AlternateContent>
@@ -5313,7 +5317,7 @@
           </mc:Choice>
           <mc:Fallback>
             <w:pict>
-              <v:group w14:anchorId="08131264" id="Group 12" o:spid="_x0000_s1026" style="position:absolute;margin-left:76.85pt;margin-top:101.25pt;width:200.65pt;height:206.8pt;z-index:15730176;mso-wrap-distance-left:0;mso-wrap-distance-right:0;mso-position-horizontal-relative:page" coordsize="25482,26263" o:gfxdata="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">
+              <v:group w14:anchorId="21E54162" id="Group 12" o:spid="_x0000_s1026" style="position:absolute;margin-left:76.85pt;margin-top:101.25pt;width:200.65pt;height:206.8pt;z-index:15730176;mso-wrap-distance-left:0;mso-wrap-distance-right:0;mso-position-horizontal-relative:page" coordsize="25482,26263" o:gfxdata="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">
                 <v:shape id="Image 13" o:spid="_x0000_s1027" type="#_x0000_t75" style="position:absolute;top:127;width:24270;height:26136;visibility:visible;mso-wrap-style:square" o:gfxdata="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">
                   <v:imagedata r:id="rId20" o:title=""/>
                 </v:shape>
@@ -6042,6 +6046,42 @@
         <w:jc w:val="both"/>
       </w:pPr>
       <w:r>
+        <w:t>Nagli razvoj umjetne inteligencije i dubokog učenja, posljednjih je godina značajno unaprijedio mogućnost analize slika. Posebno važnu ulogu u tom području ima računalni vid, čiji je cilj</w:t>
+      </w:r>
+      <w:r>
+        <w:t xml:space="preserve"> omogućiti računalnim sustavima izdvajanje i interpretaciju korisnih informacija iz slika i videozapisa. Primjena računalnog vida obuhvaća razne zadatke, među kojima se ističu klasifikacija slika, detekcija objekata, segmentacija i prepoznavanje scena</w:t>
+      </w:r>
+    </w:p>
+    <w:p>
+      <w:pPr>
+        <w:pStyle w:val="BodyText"/>
+        <w:spacing w:before="320"/>
+        <w:ind w:left="141"/>
+        <w:jc w:val="both"/>
+      </w:pPr>
+      <w:r>
+        <w:t>Izreka kaže kako slika govori tisuću rijeći, no koliko zapravo informacija možemo izvući iz jedne slike?</w:t>
+      </w:r>
+    </w:p>
+    <w:p>
+      <w:pPr>
+        <w:pStyle w:val="BodyText"/>
+        <w:spacing w:before="320"/>
+        <w:ind w:left="141"/>
+        <w:jc w:val="both"/>
+      </w:pPr>
+      <w:r>
+        <w:t xml:space="preserve">Jedno od zanimljivijih područja primjene računalnog vida je </w:t>
+      </w:r>
+    </w:p>
+    <w:p>
+      <w:pPr>
+        <w:pStyle w:val="BodyText"/>
+        <w:spacing w:before="320"/>
+        <w:ind w:left="141"/>
+        <w:jc w:val="both"/>
+      </w:pPr>
+      <w:r>
         <w:t>Uvod</w:t>
       </w:r>
       <w:r>
@@ -7341,6 +7381,7 @@
         <w:rPr>
           <w:b/>
           <w:i/>
+          <w:noProof/>
           <w:sz w:val="24"/>
         </w:rPr>
         <w:drawing>
@@ -13042,6 +13083,9 @@
         <w:jc w:val="both"/>
       </w:pPr>
       <w:r>
+        <w:rPr>
+          <w:noProof/>
+        </w:rPr>
         <mc:AlternateContent>
           <mc:Choice Requires="wpg">
             <w:drawing>
@@ -15435,6 +15479,7 @@
       </w:pPr>
       <w:r>
         <w:rPr>
+          <w:noProof/>
           <w:sz w:val="14"/>
         </w:rPr>
         <mc:AlternateContent>
@@ -20113,6 +20158,7 @@
         <w:rPr>
           <w:b/>
           <w:i/>
+          <w:noProof/>
           <w:sz w:val="24"/>
         </w:rPr>
         <mc:AlternateContent>
@@ -20339,7 +20385,7 @@
           </mc:Choice>
           <mc:Fallback>
             <w:pict>
-              <v:group w14:anchorId="587A6F8D" id="Group 30" o:spid="_x0000_s1026" style="position:absolute;margin-left:326.15pt;margin-top:9.2pt;width:211.95pt;height:78.7pt;z-index:251642880;mso-wrap-distance-left:0;mso-wrap-distance-right:0;mso-position-horizontal-relative:page" coordsize="26917,9994" o:gfxdata="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">
+              <v:group w14:anchorId="2DDE5E7D" id="Group 30" o:spid="_x0000_s1026" style="position:absolute;margin-left:326.15pt;margin-top:9.2pt;width:211.95pt;height:78.7pt;z-index:251642880;mso-wrap-distance-left:0;mso-wrap-distance-right:0;mso-position-horizontal-relative:page" coordsize="26917,9994" o:gfxdata="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">
                 <v:shape id="Image 31" o:spid="_x0000_s1027" type="#_x0000_t75" style="position:absolute;width:25985;height:9994;visibility:visible;mso-wrap-style:square" o:gfxdata="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">
                   <v:imagedata r:id="rId25" o:title=""/>
                 </v:shape>
@@ -20522,6 +20568,7 @@
         <w:rPr>
           <w:b/>
           <w:i/>
+          <w:noProof/>
           <w:sz w:val="20"/>
         </w:rPr>
         <w:drawing>
@@ -20572,6 +20619,7 @@
         <w:rPr>
           <w:b/>
           <w:i/>
+          <w:noProof/>
           <w:sz w:val="20"/>
         </w:rPr>
         <w:drawing>
@@ -23579,6 +23627,7 @@
       </w:pPr>
       <w:r>
         <w:rPr>
+          <w:noProof/>
           <w:sz w:val="14"/>
         </w:rPr>
         <mc:AlternateContent>
@@ -27866,6 +27915,7 @@
       </w:pPr>
       <w:r>
         <w:rPr>
+          <w:noProof/>
           <w:sz w:val="20"/>
         </w:rPr>
         <w:lastRenderedPageBreak/>
@@ -30741,6 +30791,7 @@
       </w:pPr>
       <w:r>
         <w:rPr>
+          <w:noProof/>
           <w:sz w:val="14"/>
         </w:rPr>
         <mc:AlternateContent>
@@ -33862,6 +33913,7 @@
       </w:pPr>
       <w:r>
         <w:rPr>
+          <w:noProof/>
           <w:sz w:val="20"/>
         </w:rPr>
         <w:lastRenderedPageBreak/>
@@ -36188,6 +36240,7 @@
         <w:rPr>
           <w:b/>
           <w:i/>
+          <w:noProof/>
           <w:sz w:val="24"/>
         </w:rPr>
         <w:lastRenderedPageBreak/>
@@ -36481,7 +36534,7 @@
           </mc:Choice>
           <mc:Fallback>
             <w:pict>
-              <v:group w14:anchorId="5BD7F415" id="Group 39" o:spid="_x0000_s1026" style="position:absolute;margin-left:252.9pt;margin-top:217.5pt;width:301.9pt;height:273.35pt;z-index:15736320;mso-wrap-distance-left:0;mso-wrap-distance-right:0;mso-position-horizontal-relative:page;mso-position-vertical-relative:page" coordsize="38341,34715" o:gfxdata="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">
+              <v:group w14:anchorId="6D5B82EC" id="Group 39" o:spid="_x0000_s1026" style="position:absolute;margin-left:252.9pt;margin-top:217.5pt;width:301.9pt;height:273.35pt;z-index:15736320;mso-wrap-distance-left:0;mso-wrap-distance-right:0;mso-position-horizontal-relative:page;mso-position-vertical-relative:page" coordsize="38341,34715" o:gfxdata="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">
                 <v:shape id="Image 40" o:spid="_x0000_s1027" type="#_x0000_t75" style="position:absolute;top:127;width:38341;height:34588;visibility:visible;mso-wrap-style:square" o:gfxdata="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">
                   <v:imagedata r:id="rId39" o:title=""/>
                 </v:shape>
@@ -37541,6 +37594,7 @@
         <w:rPr>
           <w:b/>
           <w:i/>
+          <w:noProof/>
           <w:sz w:val="8"/>
         </w:rPr>
         <mc:AlternateContent>
@@ -37701,7 +37755,7 @@
           </mc:Choice>
           <mc:Fallback>
             <w:pict>
-              <v:group w14:anchorId="740466C8" id="Group 42" o:spid="_x0000_s1026" style="position:absolute;margin-left:72.05pt;margin-top:6pt;width:447pt;height:114.9pt;z-index:-15721472;mso-wrap-distance-left:0;mso-wrap-distance-right:0;mso-position-horizontal-relative:page" coordsize="56769,14592" o:gfxdata="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">
+              <v:group w14:anchorId="03599806" id="Group 42" o:spid="_x0000_s1026" style="position:absolute;margin-left:72.05pt;margin-top:6pt;width:447pt;height:114.9pt;z-index:-15721472;mso-wrap-distance-left:0;mso-wrap-distance-right:0;mso-position-horizontal-relative:page" coordsize="56769,14592" o:gfxdata="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">
                 <v:shape id="Image 43" o:spid="_x0000_s1027" type="#_x0000_t75" style="position:absolute;width:56766;height:14587;visibility:visible;mso-wrap-style:square" o:gfxdata="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">
                   <v:imagedata r:id="rId41" o:title=""/>
                 </v:shape>
@@ -37745,6 +37799,7 @@
         <w:rPr>
           <w:b/>
           <w:i/>
+          <w:noProof/>
           <w:sz w:val="24"/>
         </w:rPr>
         <w:lastRenderedPageBreak/>
@@ -38335,6 +38390,7 @@
         <w:rPr>
           <w:b/>
           <w:i/>
+          <w:noProof/>
           <w:sz w:val="24"/>
         </w:rPr>
         <w:lastRenderedPageBreak/>
@@ -38412,7 +38468,7 @@
           </mc:Choice>
           <mc:Fallback>
             <w:pict>
-              <v:shape w14:anchorId="0992D3D8" id="Graphic 46" o:spid="_x0000_s1026" style="position:absolute;margin-left:70.8pt;margin-top:16.4pt;width:57.25pt;height:1.2pt;z-index:15737344;visibility:visible;mso-wrap-style:square;mso-wrap-distance-left:0;mso-wrap-distance-top:0;mso-wrap-distance-right:0;mso-wrap-distance-bottom:0;mso-position-horizontal:absolute;mso-position-horizontal-relative:page;mso-position-vertical:absolute;mso-position-vertical-relative:text;v-text-anchor:top" coordsize="727075,15240" o:gfxdata="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" path="m726947,l,,,15240r726947,l726947,xe" fillcolor="black" stroked="f">
+              <v:shape w14:anchorId="4544EE89" id="Graphic 46" o:spid="_x0000_s1026" style="position:absolute;margin-left:70.8pt;margin-top:16.4pt;width:57.25pt;height:1.2pt;z-index:15737344;visibility:visible;mso-wrap-style:square;mso-wrap-distance-left:0;mso-wrap-distance-top:0;mso-wrap-distance-right:0;mso-wrap-distance-bottom:0;mso-position-horizontal:absolute;mso-position-horizontal-relative:page;mso-position-vertical:absolute;mso-position-vertical-relative:text;v-text-anchor:top" coordsize="727075,15240" o:gfxdata="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" path="m726947,l,,,15240r726947,l726947,xe" fillcolor="black" stroked="f">
                 <v:path arrowok="t"/>
                 <w10:wrap anchorx="page"/>
               </v:shape>
@@ -38705,6 +38761,7 @@
         <w:rPr>
           <w:b/>
           <w:i/>
+          <w:noProof/>
           <w:sz w:val="24"/>
         </w:rPr>
         <mc:AlternateContent>
@@ -38781,7 +38838,7 @@
           </mc:Choice>
           <mc:Fallback>
             <w:pict>
-              <v:shape w14:anchorId="761FA627" id="Graphic 47" o:spid="_x0000_s1026" style="position:absolute;margin-left:127.1pt;margin-top:24.65pt;width:96.4pt;height:1.2pt;z-index:15737856;visibility:visible;mso-wrap-style:square;mso-wrap-distance-left:0;mso-wrap-distance-top:0;mso-wrap-distance-right:0;mso-wrap-distance-bottom:0;mso-position-horizontal:absolute;mso-position-horizontal-relative:page;mso-position-vertical:absolute;mso-position-vertical-relative:text;v-text-anchor:top" coordsize="1224280,15240" o:gfxdata="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" path="m1224076,l,,,15240r1224076,l1224076,xe" fillcolor="black" stroked="f">
+              <v:shape w14:anchorId="53D41521" id="Graphic 47" o:spid="_x0000_s1026" style="position:absolute;margin-left:127.1pt;margin-top:24.65pt;width:96.4pt;height:1.2pt;z-index:15737856;visibility:visible;mso-wrap-style:square;mso-wrap-distance-left:0;mso-wrap-distance-top:0;mso-wrap-distance-right:0;mso-wrap-distance-bottom:0;mso-position-horizontal:absolute;mso-position-horizontal-relative:page;mso-position-vertical:absolute;mso-position-vertical-relative:text;v-text-anchor:top" coordsize="1224280,15240" o:gfxdata="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" path="m1224076,l,,,15240r1224076,l1224076,xe" fillcolor="black" stroked="f">
                 <v:path arrowok="t"/>
                 <w10:wrap anchorx="page"/>
               </v:shape>
@@ -39435,6 +39492,7 @@
     </w:pPr>
     <w:r>
       <w:rPr>
+        <w:noProof/>
         <w:sz w:val="20"/>
       </w:rPr>
       <mc:AlternateContent>
@@ -39694,6 +39752,7 @@
     </w:pPr>
     <w:r>
       <w:rPr>
+        <w:noProof/>
         <w:sz w:val="18"/>
       </w:rPr>
       <mc:AlternateContent>
@@ -39758,13 +39817,7 @@
                             <w:rPr>
                               <w:spacing w:val="-5"/>
                             </w:rPr>
-                            <w:t>1</w:t>
-                          </w:r>
-                          <w:r>
-                            <w:rPr>
-                              <w:spacing w:val="-5"/>
-                            </w:rPr>
-                            <w:t>0</w:t>
+                            <w:t>10</w:t>
                           </w:r>
                           <w:r>
                             <w:rPr>
@@ -39820,13 +39873,7 @@
                       <w:rPr>
                         <w:spacing w:val="-5"/>
                       </w:rPr>
-                      <w:t>1</w:t>
-                    </w:r>
-                    <w:r>
-                      <w:rPr>
-                        <w:spacing w:val="-5"/>
-                      </w:rPr>
-                      <w:t>0</w:t>
+                      <w:t>10</w:t>
                     </w:r>
                     <w:r>
                       <w:rPr>

</xml_diff>

<commit_message>
Update DOCX template and add temp file
Replace binary template Predlozak_za_ocjenske_radove_fepr-novo-2024-10 (1) (2).docx with an updated version and add a new temporary editor file ~WRL2385.tmp. The added ~WRL2385.tmp appears to be an unintended editor/temporary artifact.
</commit_message>
<xml_diff>
--- a/Predlozak_za_ocjenske_radove_fepr-novo-2024-10 (1) (2).docx
+++ b/Predlozak_za_ocjenske_radove_fepr-novo-2024-10 (1) (2).docx
@@ -1,6 +1,6 @@
 
 <file path=word/document.xml><?xml version="1.0" encoding="utf-8"?>
-<w:document xmlns:wpc="http://schemas.microsoft.com/office/word/2010/wordprocessingCanvas" xmlns:cx="http://schemas.microsoft.com/office/drawing/2014/chartex" xmlns:cx1="http://schemas.microsoft.com/office/drawing/2015/9/8/chartex" xmlns:cx2="http://schemas.microsoft.com/office/drawing/2015/10/21/chartex" xmlns:cx3="http://schemas.microsoft.com/office/drawing/2016/5/9/chartex" xmlns:cx4="http://schemas.microsoft.com/office/drawing/2016/5/10/chartex" xmlns:cx5="http://schemas.microsoft.com/office/drawing/2016/5/11/chartex" xmlns:cx6="http://schemas.microsoft.com/office/drawing/2016/5/12/chartex" xmlns:cx7="http://schemas.microsoft.com/office/drawing/2016/5/13/chartex" xmlns:cx8="http://schemas.microsoft.com/office/drawing/2016/5/14/chartex" xmlns:mc="http://schemas.openxmlformats.org/markup-compatibility/2006" xmlns:aink="http://schemas.microsoft.com/office/drawing/2016/ink" xmlns:am3d="http://schemas.microsoft.com/office/drawing/2017/model3d" xmlns:o="urn:schemas-microsoft-com:office:office" xmlns:oel="http://schemas.microsoft.com/office/2019/extlst" xmlns:r="http://schemas.openxmlformats.org/officeDocument/2006/relationships" xmlns:m="http://schemas.openxmlformats.org/officeDocument/2006/math" xmlns:v="urn:schemas-microsoft-com:vml" xmlns:wp14="http://schemas.microsoft.com/office/word/2010/wordprocessingDrawing" xmlns:wp="http://schemas.openxmlformats.org/drawingml/2006/wordprocessingDrawing" xmlns:w10="urn:schemas-microsoft-com:office:word" xmlns:w="http://schemas.openxmlformats.org/wordprocessingml/2006/main" xmlns:w14="http://schemas.microsoft.com/office/word/2010/wordml" xmlns:w15="http://schemas.microsoft.com/office/word/2012/wordml" xmlns:w16cei="http://schemas.microsoft.com/office/word/2026/wordml/cei" xmlns:w16cex="http://schemas.microsoft.com/office/word/2018/wordml/cex" xmlns:w16cid="http://schemas.microsoft.com/office/word/2016/wordml/cid" xmlns:w16="http://schemas.microsoft.com/office/word/2018/wordml" xmlns:w16du="http://schemas.microsoft.com/office/word/2023/wordml/word16du" xmlns:w16sdtdh="http://schemas.microsoft.com/office/word/2020/wordml/sdtdatahash" xmlns:w16sdtfl="http://schemas.microsoft.com/office/word/2024/wordml/sdtformatlock" xmlns:w16se="http://schemas.microsoft.com/office/word/2015/wordml/symex" xmlns:wpg="http://schemas.microsoft.com/office/word/2010/wordprocessingGroup" xmlns:wpi="http://schemas.microsoft.com/office/word/2010/wordprocessingInk" xmlns:wne="http://schemas.microsoft.com/office/word/2006/wordml" xmlns:wps="http://schemas.microsoft.com/office/word/2010/wordprocessingShape" mc:Ignorable="w14 w15 w16se w16cid w16 w16cex w16sdtdh w16sdtfl w16du wp14">
+<w:document xmlns:wpc="http://schemas.microsoft.com/office/word/2010/wordprocessingCanvas" xmlns:cx="http://schemas.microsoft.com/office/drawing/2014/chartex" xmlns:cx1="http://schemas.microsoft.com/office/drawing/2015/9/8/chartex" xmlns:cx2="http://schemas.microsoft.com/office/drawing/2015/10/21/chartex" xmlns:cx3="http://schemas.microsoft.com/office/drawing/2016/5/9/chartex" xmlns:cx4="http://schemas.microsoft.com/office/drawing/2016/5/10/chartex" xmlns:cx5="http://schemas.microsoft.com/office/drawing/2016/5/11/chartex" xmlns:cx6="http://schemas.microsoft.com/office/drawing/2016/5/12/chartex" xmlns:cx7="http://schemas.microsoft.com/office/drawing/2016/5/13/chartex" xmlns:cx8="http://schemas.microsoft.com/office/drawing/2016/5/14/chartex" xmlns:mc="http://schemas.openxmlformats.org/markup-compatibility/2006" xmlns:aink="http://schemas.microsoft.com/office/drawing/2016/ink" xmlns:am3d="http://schemas.microsoft.com/office/drawing/2017/model3d" xmlns:o="urn:schemas-microsoft-com:office:office" xmlns:oel="http://schemas.microsoft.com/office/2019/extlst" xmlns:r="http://schemas.openxmlformats.org/officeDocument/2006/relationships" xmlns:m="http://schemas.openxmlformats.org/officeDocument/2006/math" xmlns:v="urn:schemas-microsoft-com:vml" xmlns:wp14="http://schemas.microsoft.com/office/word/2010/wordprocessingDrawing" xmlns:wp="http://schemas.openxmlformats.org/drawingml/2006/wordprocessingDrawing" xmlns:w10="urn:schemas-microsoft-com:office:word" xmlns:w="http://schemas.openxmlformats.org/wordprocessingml/2006/main" xmlns:w14="http://schemas.microsoft.com/office/word/2010/wordml" xmlns:w15="http://schemas.microsoft.com/office/word/2012/wordml" xmlns:w16cex="http://schemas.microsoft.com/office/word/2018/wordml/cex" xmlns:w16cid="http://schemas.microsoft.com/office/word/2016/wordml/cid" xmlns:w16="http://schemas.microsoft.com/office/word/2018/wordml" xmlns:w16du="http://schemas.microsoft.com/office/word/2023/wordml/word16du" xmlns:w16sdtdh="http://schemas.microsoft.com/office/word/2020/wordml/sdtdatahash" xmlns:w16sdtfl="http://schemas.microsoft.com/office/word/2024/wordml/sdtformatlock" xmlns:w16se="http://schemas.microsoft.com/office/word/2015/wordml/symex" xmlns:wpg="http://schemas.microsoft.com/office/word/2010/wordprocessingGroup" xmlns:wpi="http://schemas.microsoft.com/office/word/2010/wordprocessingInk" xmlns:wne="http://schemas.microsoft.com/office/word/2006/wordml" xmlns:wps="http://schemas.microsoft.com/office/word/2010/wordprocessingShape" mc:Ignorable="w14 w15 w16se w16cid w16 w16cex w16sdtdh w16sdtfl w16du wp14">
   <w:body>
     <w:p>
       <w:pPr>
@@ -116,7 +116,7 @@
     </w:p>
     <w:p>
       <w:pPr>
-        <w:pStyle w:val="BodyText"/>
+        <w:pStyle w:val="Tijeloteksta"/>
         <w:rPr>
           <w:sz w:val="28"/>
         </w:rPr>
@@ -124,7 +124,7 @@
     </w:p>
     <w:p>
       <w:pPr>
-        <w:pStyle w:val="BodyText"/>
+        <w:pStyle w:val="Tijeloteksta"/>
         <w:rPr>
           <w:sz w:val="28"/>
         </w:rPr>
@@ -132,7 +132,7 @@
     </w:p>
     <w:p>
       <w:pPr>
-        <w:pStyle w:val="BodyText"/>
+        <w:pStyle w:val="Tijeloteksta"/>
         <w:rPr>
           <w:sz w:val="28"/>
         </w:rPr>
@@ -140,7 +140,7 @@
     </w:p>
     <w:p>
       <w:pPr>
-        <w:pStyle w:val="BodyText"/>
+        <w:pStyle w:val="Tijeloteksta"/>
         <w:rPr>
           <w:sz w:val="28"/>
         </w:rPr>
@@ -148,7 +148,7 @@
     </w:p>
     <w:p>
       <w:pPr>
-        <w:pStyle w:val="BodyText"/>
+        <w:pStyle w:val="Tijeloteksta"/>
         <w:rPr>
           <w:sz w:val="28"/>
         </w:rPr>
@@ -156,7 +156,7 @@
     </w:p>
     <w:p>
       <w:pPr>
-        <w:pStyle w:val="BodyText"/>
+        <w:pStyle w:val="Tijeloteksta"/>
         <w:rPr>
           <w:sz w:val="28"/>
         </w:rPr>
@@ -164,7 +164,7 @@
     </w:p>
     <w:p>
       <w:pPr>
-        <w:pStyle w:val="BodyText"/>
+        <w:pStyle w:val="Tijeloteksta"/>
         <w:rPr>
           <w:sz w:val="28"/>
         </w:rPr>
@@ -172,7 +172,7 @@
     </w:p>
     <w:p>
       <w:pPr>
-        <w:pStyle w:val="BodyText"/>
+        <w:pStyle w:val="Tijeloteksta"/>
         <w:rPr>
           <w:sz w:val="28"/>
         </w:rPr>
@@ -180,7 +180,7 @@
     </w:p>
     <w:p>
       <w:pPr>
-        <w:pStyle w:val="BodyText"/>
+        <w:pStyle w:val="Tijeloteksta"/>
         <w:rPr>
           <w:sz w:val="28"/>
         </w:rPr>
@@ -188,7 +188,7 @@
     </w:p>
     <w:p>
       <w:pPr>
-        <w:pStyle w:val="BodyText"/>
+        <w:pStyle w:val="Tijeloteksta"/>
         <w:rPr>
           <w:sz w:val="28"/>
         </w:rPr>
@@ -196,7 +196,7 @@
     </w:p>
     <w:p>
       <w:pPr>
-        <w:pStyle w:val="BodyText"/>
+        <w:pStyle w:val="Tijeloteksta"/>
         <w:rPr>
           <w:sz w:val="28"/>
         </w:rPr>
@@ -204,7 +204,7 @@
     </w:p>
     <w:p>
       <w:pPr>
-        <w:pStyle w:val="BodyText"/>
+        <w:pStyle w:val="Tijeloteksta"/>
         <w:spacing w:before="178"/>
         <w:rPr>
           <w:sz w:val="28"/>
@@ -228,7 +228,7 @@
     </w:p>
     <w:p>
       <w:pPr>
-        <w:pStyle w:val="Title"/>
+        <w:pStyle w:val="Naslov"/>
         <w:spacing w:before="321"/>
       </w:pPr>
       <w:r>
@@ -237,7 +237,7 @@
     </w:p>
     <w:p>
       <w:pPr>
-        <w:pStyle w:val="BodyText"/>
+        <w:pStyle w:val="Tijeloteksta"/>
         <w:rPr>
           <w:sz w:val="36"/>
         </w:rPr>
@@ -245,7 +245,7 @@
     </w:p>
     <w:p>
       <w:pPr>
-        <w:pStyle w:val="BodyText"/>
+        <w:pStyle w:val="Tijeloteksta"/>
         <w:spacing w:before="158"/>
         <w:rPr>
           <w:sz w:val="36"/>
@@ -398,7 +398,7 @@
     </w:p>
     <w:p>
       <w:pPr>
-        <w:pStyle w:val="BodyText"/>
+        <w:pStyle w:val="Tijeloteksta"/>
         <w:rPr>
           <w:sz w:val="28"/>
         </w:rPr>
@@ -406,7 +406,7 @@
     </w:p>
     <w:p>
       <w:pPr>
-        <w:pStyle w:val="BodyText"/>
+        <w:pStyle w:val="Tijeloteksta"/>
         <w:rPr>
           <w:sz w:val="28"/>
         </w:rPr>
@@ -414,7 +414,7 @@
     </w:p>
     <w:p>
       <w:pPr>
-        <w:pStyle w:val="BodyText"/>
+        <w:pStyle w:val="Tijeloteksta"/>
         <w:rPr>
           <w:sz w:val="28"/>
         </w:rPr>
@@ -422,7 +422,7 @@
     </w:p>
     <w:p>
       <w:pPr>
-        <w:pStyle w:val="BodyText"/>
+        <w:pStyle w:val="Tijeloteksta"/>
         <w:rPr>
           <w:sz w:val="28"/>
         </w:rPr>
@@ -430,7 +430,7 @@
     </w:p>
     <w:p>
       <w:pPr>
-        <w:pStyle w:val="BodyText"/>
+        <w:pStyle w:val="Tijeloteksta"/>
         <w:rPr>
           <w:sz w:val="28"/>
         </w:rPr>
@@ -438,7 +438,7 @@
     </w:p>
     <w:p>
       <w:pPr>
-        <w:pStyle w:val="BodyText"/>
+        <w:pStyle w:val="Tijeloteksta"/>
         <w:rPr>
           <w:sz w:val="28"/>
         </w:rPr>
@@ -446,7 +446,7 @@
     </w:p>
     <w:p>
       <w:pPr>
-        <w:pStyle w:val="BodyText"/>
+        <w:pStyle w:val="Tijeloteksta"/>
         <w:rPr>
           <w:sz w:val="28"/>
         </w:rPr>
@@ -454,7 +454,7 @@
     </w:p>
     <w:p>
       <w:pPr>
-        <w:pStyle w:val="BodyText"/>
+        <w:pStyle w:val="Tijeloteksta"/>
         <w:rPr>
           <w:sz w:val="28"/>
         </w:rPr>
@@ -462,7 +462,7 @@
     </w:p>
     <w:p>
       <w:pPr>
-        <w:pStyle w:val="BodyText"/>
+        <w:pStyle w:val="Tijeloteksta"/>
         <w:rPr>
           <w:sz w:val="28"/>
         </w:rPr>
@@ -470,7 +470,7 @@
     </w:p>
     <w:p>
       <w:pPr>
-        <w:pStyle w:val="BodyText"/>
+        <w:pStyle w:val="Tijeloteksta"/>
         <w:rPr>
           <w:sz w:val="28"/>
         </w:rPr>
@@ -478,7 +478,7 @@
     </w:p>
     <w:p>
       <w:pPr>
-        <w:pStyle w:val="BodyText"/>
+        <w:pStyle w:val="Tijeloteksta"/>
         <w:rPr>
           <w:sz w:val="28"/>
         </w:rPr>
@@ -486,7 +486,7 @@
     </w:p>
     <w:p>
       <w:pPr>
-        <w:pStyle w:val="BodyText"/>
+        <w:pStyle w:val="Tijeloteksta"/>
         <w:rPr>
           <w:sz w:val="28"/>
         </w:rPr>
@@ -494,7 +494,7 @@
     </w:p>
     <w:p>
       <w:pPr>
-        <w:pStyle w:val="BodyText"/>
+        <w:pStyle w:val="Tijeloteksta"/>
         <w:spacing w:before="321"/>
         <w:rPr>
           <w:sz w:val="28"/>
@@ -503,7 +503,7 @@
     </w:p>
     <w:p>
       <w:pPr>
-        <w:pStyle w:val="Title"/>
+        <w:pStyle w:val="Naslov"/>
       </w:pPr>
       <w:r>
         <w:t>RAZVOJ I EVALUACIJA MODELA DUBOKOG UČENJA ZA PREPOZNAVANJE EUROPSKIH GLAVNIH GRADOVA NA TEMELJU FOTOGRAFIJA URBANIH SREDIPŠTA</w:t>
@@ -511,7 +511,7 @@
     </w:p>
     <w:p>
       <w:pPr>
-        <w:pStyle w:val="BodyText"/>
+        <w:pStyle w:val="Tijeloteksta"/>
         <w:rPr>
           <w:sz w:val="36"/>
         </w:rPr>
@@ -519,7 +519,7 @@
     </w:p>
     <w:p>
       <w:pPr>
-        <w:pStyle w:val="BodyText"/>
+        <w:pStyle w:val="Tijeloteksta"/>
         <w:spacing w:before="157"/>
         <w:rPr>
           <w:sz w:val="36"/>
@@ -544,7 +544,7 @@
     </w:p>
     <w:p>
       <w:pPr>
-        <w:pStyle w:val="BodyText"/>
+        <w:pStyle w:val="Tijeloteksta"/>
         <w:rPr>
           <w:sz w:val="28"/>
         </w:rPr>
@@ -552,7 +552,7 @@
     </w:p>
     <w:p>
       <w:pPr>
-        <w:pStyle w:val="BodyText"/>
+        <w:pStyle w:val="Tijeloteksta"/>
         <w:rPr>
           <w:sz w:val="28"/>
         </w:rPr>
@@ -560,7 +560,7 @@
     </w:p>
     <w:p>
       <w:pPr>
-        <w:pStyle w:val="BodyText"/>
+        <w:pStyle w:val="Tijeloteksta"/>
         <w:rPr>
           <w:sz w:val="28"/>
         </w:rPr>
@@ -568,7 +568,7 @@
     </w:p>
     <w:p>
       <w:pPr>
-        <w:pStyle w:val="BodyText"/>
+        <w:pStyle w:val="Tijeloteksta"/>
         <w:rPr>
           <w:sz w:val="28"/>
         </w:rPr>
@@ -576,7 +576,7 @@
     </w:p>
     <w:p>
       <w:pPr>
-        <w:pStyle w:val="BodyText"/>
+        <w:pStyle w:val="Tijeloteksta"/>
         <w:rPr>
           <w:sz w:val="28"/>
         </w:rPr>
@@ -584,7 +584,7 @@
     </w:p>
     <w:p>
       <w:pPr>
-        <w:pStyle w:val="BodyText"/>
+        <w:pStyle w:val="Tijeloteksta"/>
         <w:spacing w:before="184"/>
         <w:rPr>
           <w:sz w:val="28"/>
@@ -705,7 +705,7 @@
     </w:p>
     <w:p>
       <w:pPr>
-        <w:pStyle w:val="Heading1"/>
+        <w:pStyle w:val="Naslov1"/>
         <w:spacing w:before="78"/>
         <w:ind w:left="141" w:firstLine="0"/>
       </w:pPr>
@@ -719,7 +719,7 @@
     </w:p>
     <w:p>
       <w:pPr>
-        <w:pStyle w:val="BodyText"/>
+        <w:pStyle w:val="Tijeloteksta"/>
         <w:spacing w:before="87"/>
         <w:rPr>
           <w:b/>
@@ -729,7 +729,7 @@
     </w:p>
     <w:p>
       <w:pPr>
-        <w:pStyle w:val="BodyText"/>
+        <w:pStyle w:val="Tijeloteksta"/>
         <w:spacing w:line="295" w:lineRule="auto"/>
         <w:ind w:left="141" w:right="280"/>
         <w:jc w:val="both"/>
@@ -1300,23 +1300,23 @@
     </w:p>
     <w:p>
       <w:pPr>
-        <w:pStyle w:val="BodyText"/>
-        <w:rPr>
-          <w:i/>
-        </w:rPr>
-      </w:pPr>
-    </w:p>
-    <w:p>
-      <w:pPr>
-        <w:pStyle w:val="BodyText"/>
-        <w:rPr>
-          <w:i/>
-        </w:rPr>
-      </w:pPr>
-    </w:p>
-    <w:p>
-      <w:pPr>
-        <w:pStyle w:val="BodyText"/>
+        <w:pStyle w:val="Tijeloteksta"/>
+        <w:rPr>
+          <w:i/>
+        </w:rPr>
+      </w:pPr>
+    </w:p>
+    <w:p>
+      <w:pPr>
+        <w:pStyle w:val="Tijeloteksta"/>
+        <w:rPr>
+          <w:i/>
+        </w:rPr>
+      </w:pPr>
+    </w:p>
+    <w:p>
+      <w:pPr>
+        <w:pStyle w:val="Tijeloteksta"/>
         <w:spacing w:before="142"/>
         <w:rPr>
           <w:i/>
@@ -1325,7 +1325,7 @@
     </w:p>
     <w:p>
       <w:pPr>
-        <w:pStyle w:val="Heading1"/>
+        <w:pStyle w:val="Naslov1"/>
         <w:spacing w:before="1"/>
         <w:ind w:left="141" w:firstLine="0"/>
       </w:pPr>
@@ -1338,7 +1338,7 @@
     </w:p>
     <w:p>
       <w:pPr>
-        <w:pStyle w:val="BodyText"/>
+        <w:pStyle w:val="Tijeloteksta"/>
         <w:spacing w:before="84"/>
         <w:rPr>
           <w:b/>
@@ -1348,7 +1348,7 @@
     </w:p>
     <w:p>
       <w:pPr>
-        <w:pStyle w:val="BodyText"/>
+        <w:pStyle w:val="Tijeloteksta"/>
         <w:spacing w:line="295" w:lineRule="auto"/>
         <w:ind w:left="141" w:right="285"/>
         <w:jc w:val="both"/>
@@ -1359,7 +1359,7 @@
     </w:p>
     <w:p>
       <w:pPr>
-        <w:pStyle w:val="BodyText"/>
+        <w:pStyle w:val="Tijeloteksta"/>
         <w:spacing w:before="6"/>
       </w:pPr>
     </w:p>
@@ -1520,7 +1520,7 @@
     </w:p>
     <w:p>
       <w:pPr>
-        <w:pStyle w:val="Heading1"/>
+        <w:pStyle w:val="Naslov1"/>
         <w:spacing w:before="78"/>
         <w:ind w:left="141" w:firstLine="0"/>
       </w:pPr>
@@ -1543,7 +1543,7 @@
       <w:sdtContent>
         <w:p>
           <w:pPr>
-            <w:pStyle w:val="TOC1"/>
+            <w:pStyle w:val="Sadraj1"/>
             <w:numPr>
               <w:ilvl w:val="0"/>
               <w:numId w:val="5"/>
@@ -1574,7 +1574,7 @@
         </w:p>
         <w:p>
           <w:pPr>
-            <w:pStyle w:val="TOC2"/>
+            <w:pStyle w:val="Sadraj2"/>
             <w:numPr>
               <w:ilvl w:val="1"/>
               <w:numId w:val="5"/>
@@ -1608,7 +1608,7 @@
         </w:p>
         <w:p>
           <w:pPr>
-            <w:pStyle w:val="TOC2"/>
+            <w:pStyle w:val="Sadraj2"/>
             <w:numPr>
               <w:ilvl w:val="1"/>
               <w:numId w:val="5"/>
@@ -1651,7 +1651,7 @@
         </w:p>
         <w:p>
           <w:pPr>
-            <w:pStyle w:val="TOC2"/>
+            <w:pStyle w:val="Sadraj2"/>
             <w:numPr>
               <w:ilvl w:val="1"/>
               <w:numId w:val="5"/>
@@ -1684,7 +1684,7 @@
         </w:p>
         <w:p>
           <w:pPr>
-            <w:pStyle w:val="TOC2"/>
+            <w:pStyle w:val="Sadraj2"/>
             <w:numPr>
               <w:ilvl w:val="1"/>
               <w:numId w:val="5"/>
@@ -1724,7 +1724,7 @@
         </w:p>
         <w:p>
           <w:pPr>
-            <w:pStyle w:val="TOC1"/>
+            <w:pStyle w:val="Sadraj1"/>
             <w:numPr>
               <w:ilvl w:val="0"/>
               <w:numId w:val="5"/>
@@ -1772,7 +1772,7 @@
         </w:p>
         <w:p>
           <w:pPr>
-            <w:pStyle w:val="TOC2"/>
+            <w:pStyle w:val="Sadraj2"/>
             <w:numPr>
               <w:ilvl w:val="1"/>
               <w:numId w:val="5"/>
@@ -1812,7 +1812,7 @@
         </w:p>
         <w:p>
           <w:pPr>
-            <w:pStyle w:val="TOC3"/>
+            <w:pStyle w:val="Sadraj3"/>
             <w:numPr>
               <w:ilvl w:val="2"/>
               <w:numId w:val="5"/>
@@ -1860,7 +1860,7 @@
         </w:p>
         <w:p>
           <w:pPr>
-            <w:pStyle w:val="TOC3"/>
+            <w:pStyle w:val="Sadraj3"/>
             <w:numPr>
               <w:ilvl w:val="2"/>
               <w:numId w:val="5"/>
@@ -1911,7 +1911,7 @@
         </w:p>
         <w:p>
           <w:pPr>
-            <w:pStyle w:val="TOC2"/>
+            <w:pStyle w:val="Sadraj2"/>
             <w:numPr>
               <w:ilvl w:val="1"/>
               <w:numId w:val="5"/>
@@ -1972,7 +1972,7 @@
         </w:p>
         <w:p>
           <w:pPr>
-            <w:pStyle w:val="TOC1"/>
+            <w:pStyle w:val="Sadraj1"/>
             <w:numPr>
               <w:ilvl w:val="0"/>
               <w:numId w:val="5"/>
@@ -2020,7 +2020,7 @@
         </w:p>
         <w:p>
           <w:pPr>
-            <w:pStyle w:val="TOC2"/>
+            <w:pStyle w:val="Sadraj2"/>
             <w:numPr>
               <w:ilvl w:val="1"/>
               <w:numId w:val="5"/>
@@ -2087,7 +2087,7 @@
         </w:p>
         <w:p>
           <w:pPr>
-            <w:pStyle w:val="TOC2"/>
+            <w:pStyle w:val="Sadraj2"/>
             <w:numPr>
               <w:ilvl w:val="1"/>
               <w:numId w:val="5"/>
@@ -2147,7 +2147,7 @@
         </w:p>
         <w:p>
           <w:pPr>
-            <w:pStyle w:val="TOC2"/>
+            <w:pStyle w:val="Sadraj2"/>
             <w:numPr>
               <w:ilvl w:val="1"/>
               <w:numId w:val="5"/>
@@ -2186,7 +2186,7 @@
         </w:p>
         <w:p>
           <w:pPr>
-            <w:pStyle w:val="TOC3"/>
+            <w:pStyle w:val="Sadraj3"/>
             <w:numPr>
               <w:ilvl w:val="2"/>
               <w:numId w:val="5"/>
@@ -2226,7 +2226,7 @@
         </w:p>
         <w:p>
           <w:pPr>
-            <w:pStyle w:val="TOC3"/>
+            <w:pStyle w:val="Sadraj3"/>
             <w:numPr>
               <w:ilvl w:val="2"/>
               <w:numId w:val="5"/>
@@ -2265,7 +2265,7 @@
         </w:p>
         <w:p>
           <w:pPr>
-            <w:pStyle w:val="TOC3"/>
+            <w:pStyle w:val="Sadraj3"/>
             <w:numPr>
               <w:ilvl w:val="2"/>
               <w:numId w:val="5"/>
@@ -2317,7 +2317,7 @@
         </w:p>
         <w:p>
           <w:pPr>
-            <w:pStyle w:val="TOC3"/>
+            <w:pStyle w:val="Sadraj3"/>
             <w:numPr>
               <w:ilvl w:val="2"/>
               <w:numId w:val="5"/>
@@ -2374,7 +2374,7 @@
         </w:p>
         <w:p>
           <w:pPr>
-            <w:pStyle w:val="TOC3"/>
+            <w:pStyle w:val="Sadraj3"/>
             <w:numPr>
               <w:ilvl w:val="2"/>
               <w:numId w:val="5"/>
@@ -2413,7 +2413,7 @@
         </w:p>
         <w:p>
           <w:pPr>
-            <w:pStyle w:val="TOC2"/>
+            <w:pStyle w:val="Sadraj2"/>
             <w:numPr>
               <w:ilvl w:val="1"/>
               <w:numId w:val="5"/>
@@ -2453,7 +2453,7 @@
         </w:p>
         <w:p>
           <w:pPr>
-            <w:pStyle w:val="TOC1"/>
+            <w:pStyle w:val="Sadraj1"/>
             <w:numPr>
               <w:ilvl w:val="0"/>
               <w:numId w:val="5"/>
@@ -2483,7 +2483,7 @@
         </w:p>
         <w:p>
           <w:pPr>
-            <w:pStyle w:val="TOC1"/>
+            <w:pStyle w:val="Sadraj1"/>
             <w:numPr>
               <w:ilvl w:val="0"/>
               <w:numId w:val="5"/>
@@ -2514,7 +2514,7 @@
         </w:p>
         <w:p>
           <w:pPr>
-            <w:pStyle w:val="TOC1"/>
+            <w:pStyle w:val="Sadraj1"/>
             <w:numPr>
               <w:ilvl w:val="0"/>
               <w:numId w:val="5"/>
@@ -2544,7 +2544,7 @@
         </w:p>
         <w:p>
           <w:pPr>
-            <w:pStyle w:val="TOC2"/>
+            <w:pStyle w:val="Sadraj2"/>
             <w:numPr>
               <w:ilvl w:val="1"/>
               <w:numId w:val="5"/>
@@ -2583,7 +2583,7 @@
         </w:p>
         <w:p>
           <w:pPr>
-            <w:pStyle w:val="TOC2"/>
+            <w:pStyle w:val="Sadraj2"/>
             <w:numPr>
               <w:ilvl w:val="1"/>
               <w:numId w:val="5"/>
@@ -2623,7 +2623,7 @@
         </w:p>
         <w:p>
           <w:pPr>
-            <w:pStyle w:val="TOC2"/>
+            <w:pStyle w:val="Sadraj2"/>
             <w:numPr>
               <w:ilvl w:val="1"/>
               <w:numId w:val="5"/>
@@ -2671,7 +2671,7 @@
         </w:p>
         <w:p>
           <w:pPr>
-            <w:pStyle w:val="TOC2"/>
+            <w:pStyle w:val="Sadraj2"/>
             <w:numPr>
               <w:ilvl w:val="1"/>
               <w:numId w:val="5"/>
@@ -2720,7 +2720,7 @@
         </w:p>
         <w:p>
           <w:pPr>
-            <w:pStyle w:val="TOC3"/>
+            <w:pStyle w:val="Sadraj3"/>
             <w:numPr>
               <w:ilvl w:val="2"/>
               <w:numId w:val="5"/>
@@ -2812,7 +2812,7 @@
         </w:p>
         <w:p>
           <w:pPr>
-            <w:pStyle w:val="TOC3"/>
+            <w:pStyle w:val="Sadraj3"/>
             <w:numPr>
               <w:ilvl w:val="2"/>
               <w:numId w:val="5"/>
@@ -2915,7 +2915,7 @@
     </w:sdt>
     <w:p>
       <w:pPr>
-        <w:pStyle w:val="TOC3"/>
+        <w:pStyle w:val="Sadraj3"/>
         <w:sectPr>
           <w:footerReference w:type="default" r:id="rId9"/>
           <w:pgSz w:w="11910" w:h="16840"/>
@@ -2926,7 +2926,7 @@
     </w:p>
     <w:p>
       <w:pPr>
-        <w:pStyle w:val="BodyText"/>
+        <w:pStyle w:val="Tijeloteksta"/>
         <w:spacing w:before="4"/>
         <w:rPr>
           <w:sz w:val="17"/>
@@ -2935,7 +2935,7 @@
     </w:p>
     <w:p>
       <w:pPr>
-        <w:pStyle w:val="BodyText"/>
+        <w:pStyle w:val="Tijeloteksta"/>
         <w:rPr>
           <w:sz w:val="17"/>
         </w:rPr>
@@ -3189,7 +3189,7 @@
           </mc:Choice>
           <mc:Fallback>
             <w:pict>
-              <v:group w14:anchorId="45ECD8B1" id="Group 2" o:spid="_x0000_s1026" style="position:absolute;margin-left:252.9pt;margin-top:271.25pt;width:296.2pt;height:100.45pt;z-index:15729152;mso-wrap-distance-left:0;mso-wrap-distance-right:0;mso-position-horizontal-relative:page;mso-position-vertical-relative:page" coordsize="37617,12757" o:gfxdata="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">
+              <v:group w14:anchorId="711D4660" id="Group 2" o:spid="_x0000_s1026" style="position:absolute;margin-left:252.9pt;margin-top:271.25pt;width:296.2pt;height:100.45pt;z-index:15729152;mso-wrap-distance-left:0;mso-wrap-distance-right:0;mso-position-horizontal-relative:page;mso-position-vertical-relative:page" coordsize="37617,12757" o:gfxdata="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">
                 <v:shapetype id="_x0000_t75" coordsize="21600,21600" o:spt="75" o:preferrelative="t" path="m@4@5l@4@11@9@11@9@5xe" filled="f" stroked="f">
                   <v:stroke joinstyle="miter"/>
                   <v:formulas>
@@ -3473,7 +3473,7 @@
           </mc:Choice>
           <mc:Fallback>
             <w:pict>
-              <v:group w14:anchorId="022EA490" id="Group 5" o:spid="_x0000_s1026" style="position:absolute;margin-left:451.35pt;margin-top:44.6pt;width:91.7pt;height:104.45pt;z-index:15728640;mso-wrap-distance-left:0;mso-wrap-distance-right:0;mso-position-horizontal-relative:page" coordsize="11645,13265" o:gfxdata="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">
+              <v:group w14:anchorId="5DFE3545" id="Group 5" o:spid="_x0000_s1026" style="position:absolute;margin-left:451.35pt;margin-top:44.6pt;width:91.7pt;height:104.45pt;z-index:15728640;mso-wrap-distance-left:0;mso-wrap-distance-right:0;mso-position-horizontal-relative:page" coordsize="11645,13265" o:gfxdata="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">
                 <v:shape id="Image 6" o:spid="_x0000_s1027" type="#_x0000_t75" style="position:absolute;top:127;width:11518;height:13138;visibility:visible;mso-wrap-style:square" o:gfxdata="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">
                   <v:imagedata r:id="rId14" o:title=""/>
                 </v:shape>
@@ -3752,16 +3752,16 @@
     </w:p>
     <w:p>
       <w:pPr>
-        <w:pStyle w:val="BodyText"/>
-        <w:rPr>
-          <w:b/>
-          <w:i/>
-        </w:rPr>
-      </w:pPr>
-    </w:p>
-    <w:p>
-      <w:pPr>
-        <w:pStyle w:val="BodyText"/>
+        <w:pStyle w:val="Tijeloteksta"/>
+        <w:rPr>
+          <w:b/>
+          <w:i/>
+        </w:rPr>
+      </w:pPr>
+    </w:p>
+    <w:p>
+      <w:pPr>
+        <w:pStyle w:val="Tijeloteksta"/>
         <w:spacing w:before="165"/>
         <w:rPr>
           <w:b/>
@@ -4199,16 +4199,16 @@
     </w:p>
     <w:p>
       <w:pPr>
-        <w:pStyle w:val="BodyText"/>
-        <w:rPr>
-          <w:b/>
-          <w:i/>
-        </w:rPr>
-      </w:pPr>
-    </w:p>
-    <w:p>
-      <w:pPr>
-        <w:pStyle w:val="BodyText"/>
+        <w:pStyle w:val="Tijeloteksta"/>
+        <w:rPr>
+          <w:b/>
+          <w:i/>
+        </w:rPr>
+      </w:pPr>
+    </w:p>
+    <w:p>
+      <w:pPr>
+        <w:pStyle w:val="Tijeloteksta"/>
         <w:spacing w:before="207"/>
         <w:rPr>
           <w:b/>
@@ -4887,7 +4887,7 @@
           </mc:Choice>
           <mc:Fallback>
             <w:pict>
-              <v:group w14:anchorId="48D70E2D" id="Group 8" o:spid="_x0000_s1026" style="position:absolute;margin-left:376.5pt;margin-top:35.4pt;width:165.6pt;height:121.1pt;z-index:-16143872;mso-wrap-distance-left:0;mso-wrap-distance-right:0;mso-position-horizontal-relative:page" coordsize="21031,15379" o:gfxdata="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">
+              <v:group w14:anchorId="5358845E" id="Group 8" o:spid="_x0000_s1026" style="position:absolute;margin-left:376.5pt;margin-top:35.4pt;width:165.6pt;height:121.1pt;z-index:-16143872;mso-wrap-distance-left:0;mso-wrap-distance-right:0;mso-position-horizontal-relative:page" coordsize="21031,15379" o:gfxdata="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">
                 <v:shape id="Image 9" o:spid="_x0000_s1027" type="#_x0000_t75" style="position:absolute;left:2534;top:4086;width:18497;height:11293;visibility:visible;mso-wrap-style:square" o:gfxdata="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">
                   <v:imagedata r:id="rId17" o:title=""/>
                 </v:shape>
@@ -5059,16 +5059,16 @@
     </w:p>
     <w:p>
       <w:pPr>
-        <w:pStyle w:val="BodyText"/>
-        <w:rPr>
-          <w:b/>
-          <w:i/>
-        </w:rPr>
-      </w:pPr>
-    </w:p>
-    <w:p>
-      <w:pPr>
-        <w:pStyle w:val="BodyText"/>
+        <w:pStyle w:val="Tijeloteksta"/>
+        <w:rPr>
+          <w:b/>
+          <w:i/>
+        </w:rPr>
+      </w:pPr>
+    </w:p>
+    <w:p>
+      <w:pPr>
+        <w:pStyle w:val="Tijeloteksta"/>
         <w:spacing w:before="207"/>
         <w:rPr>
           <w:b/>
@@ -5317,7 +5317,7 @@
           </mc:Choice>
           <mc:Fallback>
             <w:pict>
-              <v:group w14:anchorId="21E54162" id="Group 12" o:spid="_x0000_s1026" style="position:absolute;margin-left:76.85pt;margin-top:101.25pt;width:200.65pt;height:206.8pt;z-index:15730176;mso-wrap-distance-left:0;mso-wrap-distance-right:0;mso-position-horizontal-relative:page" coordsize="25482,26263" o:gfxdata="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">
+              <v:group w14:anchorId="0313C1AC" id="Group 12" o:spid="_x0000_s1026" style="position:absolute;margin-left:76.85pt;margin-top:101.25pt;width:200.65pt;height:206.8pt;z-index:15730176;mso-wrap-distance-left:0;mso-wrap-distance-right:0;mso-position-horizontal-relative:page" coordsize="25482,26263" o:gfxdata="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">
                 <v:shape id="Image 13" o:spid="_x0000_s1027" type="#_x0000_t75" style="position:absolute;top:127;width:24270;height:26136;visibility:visible;mso-wrap-style:square" o:gfxdata="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">
                   <v:imagedata r:id="rId20" o:title=""/>
                 </v:shape>
@@ -5749,34 +5749,34 @@
     </w:p>
     <w:p>
       <w:pPr>
-        <w:pStyle w:val="BodyText"/>
-        <w:rPr>
-          <w:b/>
-          <w:i/>
-        </w:rPr>
-      </w:pPr>
-    </w:p>
-    <w:p>
-      <w:pPr>
-        <w:pStyle w:val="BodyText"/>
-        <w:rPr>
-          <w:b/>
-          <w:i/>
-        </w:rPr>
-      </w:pPr>
-    </w:p>
-    <w:p>
-      <w:pPr>
-        <w:pStyle w:val="BodyText"/>
-        <w:rPr>
-          <w:b/>
-          <w:i/>
-        </w:rPr>
-      </w:pPr>
-    </w:p>
-    <w:p>
-      <w:pPr>
-        <w:pStyle w:val="BodyText"/>
+        <w:pStyle w:val="Tijeloteksta"/>
+        <w:rPr>
+          <w:b/>
+          <w:i/>
+        </w:rPr>
+      </w:pPr>
+    </w:p>
+    <w:p>
+      <w:pPr>
+        <w:pStyle w:val="Tijeloteksta"/>
+        <w:rPr>
+          <w:b/>
+          <w:i/>
+        </w:rPr>
+      </w:pPr>
+    </w:p>
+    <w:p>
+      <w:pPr>
+        <w:pStyle w:val="Tijeloteksta"/>
+        <w:rPr>
+          <w:b/>
+          <w:i/>
+        </w:rPr>
+      </w:pPr>
+    </w:p>
+    <w:p>
+      <w:pPr>
+        <w:pStyle w:val="Tijeloteksta"/>
         <w:spacing w:before="132"/>
         <w:rPr>
           <w:b/>
@@ -6018,7 +6018,7 @@
     </w:p>
     <w:p>
       <w:pPr>
-        <w:pStyle w:val="Heading1"/>
+        <w:pStyle w:val="Naslov1"/>
         <w:numPr>
           <w:ilvl w:val="0"/>
           <w:numId w:val="4"/>
@@ -6040,7 +6040,7 @@
     </w:p>
     <w:p>
       <w:pPr>
-        <w:pStyle w:val="BodyText"/>
+        <w:pStyle w:val="Tijeloteksta"/>
         <w:spacing w:before="320"/>
         <w:ind w:left="141"/>
         <w:jc w:val="both"/>
@@ -6049,12 +6049,21 @@
         <w:t>Nagli razvoj umjetne inteligencije i dubokog učenja, posljednjih je godina značajno unaprijedio mogućnost analize slika. Posebno važnu ulogu u tom području ima računalni vid, čiji je cilj</w:t>
       </w:r>
       <w:r>
-        <w:t xml:space="preserve"> omogućiti računalnim sustavima izdvajanje i interpretaciju korisnih informacija iz slika i videozapisa. Primjena računalnog vida obuhvaća razne zadatke, među kojima se ističu klasifikacija slika, detekcija objekata, segmentacija i prepoznavanje scena</w:t>
-      </w:r>
-    </w:p>
-    <w:p>
-      <w:pPr>
-        <w:pStyle w:val="BodyText"/>
+        <w:t xml:space="preserve"> omogućiti računalnim sustavima izdvajanje i interpretaciju korisnih informacija iz slika i videozapisa. Primjena računalnog vida obuhvaća razne zadatke, među kojima se ističu klasifikacija slika, detekcija objekata</w:t>
+      </w:r>
+      <w:r>
+        <w:t xml:space="preserve"> i</w:t>
+      </w:r>
+      <w:r>
+        <w:t xml:space="preserve"> segmentacija </w:t>
+      </w:r>
+      <w:r>
+        <w:t>scena</w:t>
+      </w:r>
+    </w:p>
+    <w:p>
+      <w:pPr>
+        <w:pStyle w:val="Tijeloteksta"/>
         <w:spacing w:before="320"/>
         <w:ind w:left="141"/>
         <w:jc w:val="both"/>
@@ -6065,18 +6074,18 @@
     </w:p>
     <w:p>
       <w:pPr>
-        <w:pStyle w:val="BodyText"/>
+        <w:pStyle w:val="Tijeloteksta"/>
         <w:spacing w:before="320"/>
         <w:ind w:left="141"/>
         <w:jc w:val="both"/>
       </w:pPr>
       <w:r>
-        <w:t xml:space="preserve">Jedno od zanimljivijih područja primjene računalnog vida je </w:t>
-      </w:r>
-    </w:p>
-    <w:p>
-      <w:pPr>
-        <w:pStyle w:val="BodyText"/>
+        <w:t>Prepoznavanje lokacije na temelju fotografije predstavlja jedan od izazovnijih problema računalnog vida, budući da urbane sredine dijele mnoge vizualne karakteristike</w:t>
+      </w:r>
+    </w:p>
+    <w:p>
+      <w:pPr>
+        <w:pStyle w:val="Tijeloteksta"/>
         <w:spacing w:before="320"/>
         <w:ind w:left="141"/>
         <w:jc w:val="both"/>
@@ -6216,7 +6225,7 @@
     </w:p>
     <w:p>
       <w:pPr>
-        <w:pStyle w:val="BodyText"/>
+        <w:pStyle w:val="Tijeloteksta"/>
         <w:spacing w:before="69" w:line="300" w:lineRule="auto"/>
         <w:ind w:left="141" w:right="281"/>
         <w:jc w:val="both"/>
@@ -6581,7 +6590,7 @@
     </w:p>
     <w:p>
       <w:pPr>
-        <w:pStyle w:val="BodyText"/>
+        <w:pStyle w:val="Tijeloteksta"/>
         <w:spacing w:before="118" w:line="300" w:lineRule="auto"/>
         <w:ind w:left="141" w:right="281"/>
         <w:jc w:val="both"/>
@@ -6592,7 +6601,7 @@
     </w:p>
     <w:p>
       <w:pPr>
-        <w:pStyle w:val="BodyText"/>
+        <w:pStyle w:val="Tijeloteksta"/>
         <w:spacing w:before="122" w:line="300" w:lineRule="auto"/>
         <w:ind w:left="141" w:right="280"/>
         <w:jc w:val="both"/>
@@ -6705,13 +6714,13 @@
     </w:p>
     <w:p>
       <w:pPr>
-        <w:pStyle w:val="BodyText"/>
+        <w:pStyle w:val="Tijeloteksta"/>
         <w:spacing w:before="83"/>
       </w:pPr>
     </w:p>
     <w:p>
       <w:pPr>
-        <w:pStyle w:val="Heading2"/>
+        <w:pStyle w:val="Naslov2"/>
         <w:numPr>
           <w:ilvl w:val="1"/>
           <w:numId w:val="4"/>
@@ -6741,7 +6750,7 @@
     </w:p>
     <w:p>
       <w:pPr>
-        <w:pStyle w:val="BodyText"/>
+        <w:pStyle w:val="Tijeloteksta"/>
         <w:spacing w:before="190"/>
         <w:ind w:left="141"/>
         <w:jc w:val="both"/>
@@ -6752,7 +6761,7 @@
     </w:p>
     <w:p>
       <w:pPr>
-        <w:pStyle w:val="BodyText"/>
+        <w:pStyle w:val="Tijeloteksta"/>
         <w:spacing w:before="190"/>
         <w:ind w:left="141"/>
         <w:jc w:val="both"/>
@@ -6868,7 +6877,7 @@
     </w:p>
     <w:p>
       <w:pPr>
-        <w:pStyle w:val="BodyText"/>
+        <w:pStyle w:val="Tijeloteksta"/>
         <w:spacing w:before="69"/>
         <w:ind w:left="141"/>
         <w:jc w:val="both"/>
@@ -6966,13 +6975,13 @@
     </w:p>
     <w:p>
       <w:pPr>
-        <w:pStyle w:val="BodyText"/>
+        <w:pStyle w:val="Tijeloteksta"/>
         <w:spacing w:before="154"/>
       </w:pPr>
     </w:p>
     <w:p>
       <w:pPr>
-        <w:pStyle w:val="Heading2"/>
+        <w:pStyle w:val="Naslov2"/>
         <w:numPr>
           <w:ilvl w:val="1"/>
           <w:numId w:val="4"/>
@@ -7020,7 +7029,7 @@
     </w:p>
     <w:p>
       <w:pPr>
-        <w:pStyle w:val="BodyText"/>
+        <w:pStyle w:val="Tijeloteksta"/>
         <w:spacing w:before="187" w:line="300" w:lineRule="auto"/>
         <w:ind w:left="141" w:right="280"/>
         <w:jc w:val="both"/>
@@ -7031,13 +7040,13 @@
     </w:p>
     <w:p>
       <w:pPr>
-        <w:pStyle w:val="BodyText"/>
+        <w:pStyle w:val="Tijeloteksta"/>
         <w:spacing w:before="86"/>
       </w:pPr>
     </w:p>
     <w:p>
       <w:pPr>
-        <w:pStyle w:val="Heading2"/>
+        <w:pStyle w:val="Naslov2"/>
         <w:numPr>
           <w:ilvl w:val="1"/>
           <w:numId w:val="4"/>
@@ -7061,7 +7070,7 @@
     </w:p>
     <w:p>
       <w:pPr>
-        <w:pStyle w:val="BodyText"/>
+        <w:pStyle w:val="Tijeloteksta"/>
         <w:spacing w:before="188"/>
         <w:ind w:left="141"/>
         <w:jc w:val="both"/>
@@ -7132,13 +7141,13 @@
     </w:p>
     <w:p>
       <w:pPr>
-        <w:pStyle w:val="BodyText"/>
+        <w:pStyle w:val="Tijeloteksta"/>
         <w:spacing w:before="153"/>
       </w:pPr>
     </w:p>
     <w:p>
       <w:pPr>
-        <w:pStyle w:val="Heading2"/>
+        <w:pStyle w:val="Naslov2"/>
         <w:numPr>
           <w:ilvl w:val="1"/>
           <w:numId w:val="4"/>
@@ -7168,7 +7177,7 @@
     </w:p>
     <w:p>
       <w:pPr>
-        <w:pStyle w:val="BodyText"/>
+        <w:pStyle w:val="Tijeloteksta"/>
         <w:spacing w:before="190" w:line="300" w:lineRule="auto"/>
         <w:ind w:left="141" w:right="281"/>
         <w:jc w:val="both"/>
@@ -7300,12 +7309,16 @@
         <w:t xml:space="preserve"> </w:t>
       </w:r>
       <w:r>
-        <w:t>čitatelj može pronaći u određenom poglavlju).</w:t>
-      </w:r>
-    </w:p>
-    <w:p>
-      <w:pPr>
-        <w:pStyle w:val="BodyText"/>
+        <w:t xml:space="preserve">čitatelj </w:t>
+      </w:r>
+      <w:r>
+        <w:lastRenderedPageBreak/>
+        <w:t>može pronaći u određenom poglavlju).</w:t>
+      </w:r>
+    </w:p>
+    <w:p>
+      <w:pPr>
+        <w:pStyle w:val="Tijeloteksta"/>
         <w:spacing w:line="300" w:lineRule="auto"/>
         <w:jc w:val="both"/>
         <w:sectPr>
@@ -8631,7 +8644,7 @@
     </w:p>
     <w:p>
       <w:pPr>
-        <w:pStyle w:val="Heading1"/>
+        <w:pStyle w:val="Naslov1"/>
         <w:numPr>
           <w:ilvl w:val="0"/>
           <w:numId w:val="4"/>
@@ -8652,7 +8665,7 @@
     </w:p>
     <w:p>
       <w:pPr>
-        <w:pStyle w:val="BodyText"/>
+        <w:pStyle w:val="Tijeloteksta"/>
         <w:spacing w:before="318" w:line="300" w:lineRule="auto"/>
         <w:ind w:left="141" w:right="278"/>
         <w:jc w:val="both"/>
@@ -8888,13 +8901,13 @@
     </w:p>
     <w:p>
       <w:pPr>
-        <w:pStyle w:val="BodyText"/>
+        <w:pStyle w:val="Tijeloteksta"/>
         <w:spacing w:before="85"/>
       </w:pPr>
     </w:p>
     <w:p>
       <w:pPr>
-        <w:pStyle w:val="Heading2"/>
+        <w:pStyle w:val="Naslov2"/>
         <w:numPr>
           <w:ilvl w:val="1"/>
           <w:numId w:val="4"/>
@@ -8916,7 +8929,7 @@
     </w:p>
     <w:p>
       <w:pPr>
-        <w:pStyle w:val="BodyText"/>
+        <w:pStyle w:val="Tijeloteksta"/>
         <w:spacing w:before="187" w:line="300" w:lineRule="auto"/>
         <w:ind w:left="141" w:right="278"/>
         <w:jc w:val="both"/>
@@ -8927,7 +8940,7 @@
     </w:p>
     <w:p>
       <w:pPr>
-        <w:pStyle w:val="BodyText"/>
+        <w:pStyle w:val="Tijeloteksta"/>
         <w:spacing w:before="187" w:line="300" w:lineRule="auto"/>
         <w:ind w:left="141" w:right="278"/>
         <w:jc w:val="both"/>
@@ -9172,7 +9185,7 @@
     </w:p>
     <w:p>
       <w:pPr>
-        <w:pStyle w:val="BodyText"/>
+        <w:pStyle w:val="Tijeloteksta"/>
         <w:spacing w:before="187" w:line="300" w:lineRule="auto"/>
         <w:ind w:left="141" w:right="278"/>
         <w:jc w:val="both"/>
@@ -9180,7 +9193,7 @@
     </w:p>
     <w:p>
       <w:pPr>
-        <w:pStyle w:val="Heading2"/>
+        <w:pStyle w:val="Naslov2"/>
         <w:numPr>
           <w:ilvl w:val="1"/>
           <w:numId w:val="4"/>
@@ -9196,7 +9209,7 @@
     </w:p>
     <w:p>
       <w:pPr>
-        <w:pStyle w:val="BodyText"/>
+        <w:pStyle w:val="Tijeloteksta"/>
         <w:spacing w:before="187" w:line="300" w:lineRule="auto"/>
         <w:ind w:left="141" w:right="278"/>
         <w:jc w:val="both"/>
@@ -9207,7 +9220,7 @@
     </w:p>
     <w:p>
       <w:pPr>
-        <w:pStyle w:val="BodyText"/>
+        <w:pStyle w:val="Tijeloteksta"/>
         <w:spacing w:before="120" w:line="300" w:lineRule="auto"/>
         <w:ind w:left="141" w:right="282"/>
         <w:jc w:val="both"/>
@@ -9353,7 +9366,7 @@
     </w:p>
     <w:p>
       <w:pPr>
-        <w:pStyle w:val="ListParagraph"/>
+        <w:pStyle w:val="Odlomakpopisa"/>
         <w:numPr>
           <w:ilvl w:val="2"/>
           <w:numId w:val="4"/>
@@ -9404,7 +9417,7 @@
     </w:p>
     <w:p>
       <w:pPr>
-        <w:pStyle w:val="BodyText"/>
+        <w:pStyle w:val="Tijeloteksta"/>
         <w:spacing w:before="189" w:line="300" w:lineRule="auto"/>
         <w:ind w:left="141" w:right="281"/>
         <w:jc w:val="both"/>
@@ -9505,7 +9518,7 @@
     </w:p>
     <w:p>
       <w:pPr>
-        <w:pStyle w:val="BodyText"/>
+        <w:pStyle w:val="Tijeloteksta"/>
         <w:spacing w:before="189" w:line="300" w:lineRule="auto"/>
         <w:ind w:left="141" w:right="281"/>
         <w:jc w:val="both"/>
@@ -9513,7 +9526,7 @@
     </w:p>
     <w:p>
       <w:pPr>
-        <w:pStyle w:val="Heading2"/>
+        <w:pStyle w:val="Naslov2"/>
         <w:numPr>
           <w:ilvl w:val="1"/>
           <w:numId w:val="4"/>
@@ -9530,7 +9543,7 @@
     </w:p>
     <w:p>
       <w:pPr>
-        <w:pStyle w:val="BodyText"/>
+        <w:pStyle w:val="Tijeloteksta"/>
         <w:numPr>
           <w:ilvl w:val="0"/>
           <w:numId w:val="15"/>
@@ -9545,7 +9558,7 @@
     </w:p>
     <w:p>
       <w:pPr>
-        <w:pStyle w:val="BodyText"/>
+        <w:pStyle w:val="Tijeloteksta"/>
         <w:numPr>
           <w:ilvl w:val="0"/>
           <w:numId w:val="15"/>
@@ -9560,7 +9573,7 @@
     </w:p>
     <w:p>
       <w:pPr>
-        <w:pStyle w:val="BodyText"/>
+        <w:pStyle w:val="Tijeloteksta"/>
         <w:numPr>
           <w:ilvl w:val="0"/>
           <w:numId w:val="15"/>
@@ -9575,7 +9588,7 @@
     </w:p>
     <w:p>
       <w:pPr>
-        <w:pStyle w:val="BodyText"/>
+        <w:pStyle w:val="Tijeloteksta"/>
         <w:numPr>
           <w:ilvl w:val="0"/>
           <w:numId w:val="15"/>
@@ -9590,7 +9603,7 @@
     </w:p>
     <w:p>
       <w:pPr>
-        <w:pStyle w:val="BodyText"/>
+        <w:pStyle w:val="Tijeloteksta"/>
         <w:numPr>
           <w:ilvl w:val="0"/>
           <w:numId w:val="15"/>
@@ -9605,7 +9618,7 @@
     </w:p>
     <w:p>
       <w:pPr>
-        <w:pStyle w:val="BodyText"/>
+        <w:pStyle w:val="Tijeloteksta"/>
         <w:spacing w:before="122" w:line="300" w:lineRule="auto"/>
         <w:ind w:left="141" w:right="283"/>
         <w:jc w:val="both"/>
@@ -9616,7 +9629,7 @@
     </w:p>
     <w:p>
       <w:pPr>
-        <w:pStyle w:val="BodyText"/>
+        <w:pStyle w:val="Tijeloteksta"/>
         <w:spacing w:before="122" w:line="300" w:lineRule="auto"/>
         <w:ind w:left="141" w:right="283"/>
         <w:jc w:val="both"/>
@@ -9627,7 +9640,7 @@
     </w:p>
     <w:p>
       <w:pPr>
-        <w:pStyle w:val="BodyText"/>
+        <w:pStyle w:val="Tijeloteksta"/>
         <w:spacing w:before="122" w:line="300" w:lineRule="auto"/>
         <w:ind w:left="141" w:right="283"/>
         <w:jc w:val="both"/>
@@ -9635,7 +9648,7 @@
     </w:p>
     <w:p>
       <w:pPr>
-        <w:pStyle w:val="Heading2"/>
+        <w:pStyle w:val="Naslov2"/>
         <w:numPr>
           <w:ilvl w:val="1"/>
           <w:numId w:val="4"/>
@@ -9651,7 +9664,7 @@
     </w:p>
     <w:p>
       <w:pPr>
-        <w:pStyle w:val="BodyText"/>
+        <w:pStyle w:val="Tijeloteksta"/>
         <w:spacing w:before="122" w:line="300" w:lineRule="auto"/>
         <w:ind w:left="141" w:right="283"/>
         <w:jc w:val="both"/>
@@ -9662,7 +9675,7 @@
     </w:p>
     <w:p>
       <w:pPr>
-        <w:pStyle w:val="BodyText"/>
+        <w:pStyle w:val="Tijeloteksta"/>
         <w:spacing w:before="122" w:line="300" w:lineRule="auto"/>
         <w:ind w:left="141" w:right="283"/>
         <w:jc w:val="both"/>
@@ -9670,7 +9683,7 @@
     </w:p>
     <w:p>
       <w:pPr>
-        <w:pStyle w:val="Heading2"/>
+        <w:pStyle w:val="Naslov2"/>
         <w:numPr>
           <w:ilvl w:val="1"/>
           <w:numId w:val="4"/>
@@ -9686,7 +9699,7 @@
     </w:p>
     <w:p>
       <w:pPr>
-        <w:pStyle w:val="BodyText"/>
+        <w:pStyle w:val="Tijeloteksta"/>
         <w:spacing w:before="121" w:line="300" w:lineRule="auto"/>
         <w:ind w:left="141" w:right="286"/>
         <w:jc w:val="both"/>
@@ -9694,7 +9707,7 @@
     </w:p>
     <w:p>
       <w:pPr>
-        <w:pStyle w:val="Heading2"/>
+        <w:pStyle w:val="Naslov2"/>
         <w:numPr>
           <w:ilvl w:val="1"/>
           <w:numId w:val="4"/>
@@ -9710,7 +9723,7 @@
     </w:p>
     <w:p>
       <w:pPr>
-        <w:pStyle w:val="BodyText"/>
+        <w:pStyle w:val="Tijeloteksta"/>
         <w:spacing w:before="121" w:line="300" w:lineRule="auto"/>
         <w:ind w:left="141" w:right="286"/>
         <w:jc w:val="both"/>
@@ -9718,7 +9731,7 @@
     </w:p>
     <w:p>
       <w:pPr>
-        <w:pStyle w:val="BodyText"/>
+        <w:pStyle w:val="Tijeloteksta"/>
         <w:spacing w:before="121" w:line="300" w:lineRule="auto"/>
         <w:ind w:left="141" w:right="286"/>
         <w:jc w:val="both"/>
@@ -9729,7 +9742,7 @@
     </w:p>
     <w:p>
       <w:pPr>
-        <w:pStyle w:val="BodyText"/>
+        <w:pStyle w:val="Tijeloteksta"/>
         <w:spacing w:line="300" w:lineRule="auto"/>
         <w:jc w:val="both"/>
         <w:sectPr>
@@ -9741,7 +9754,7 @@
     </w:p>
     <w:p>
       <w:pPr>
-        <w:pStyle w:val="ListParagraph"/>
+        <w:pStyle w:val="Odlomakpopisa"/>
         <w:numPr>
           <w:ilvl w:val="2"/>
           <w:numId w:val="4"/>
@@ -9766,7 +9779,7 @@
     </w:p>
     <w:p>
       <w:pPr>
-        <w:pStyle w:val="BodyText"/>
+        <w:pStyle w:val="Tijeloteksta"/>
         <w:spacing w:before="189" w:line="300" w:lineRule="auto"/>
         <w:ind w:left="141" w:right="284"/>
         <w:jc w:val="both"/>
@@ -9777,7 +9790,7 @@
     </w:p>
     <w:p>
       <w:pPr>
-        <w:pStyle w:val="BodyText"/>
+        <w:pStyle w:val="Tijeloteksta"/>
         <w:spacing w:before="189" w:line="300" w:lineRule="auto"/>
         <w:ind w:left="141" w:right="284"/>
         <w:jc w:val="both"/>
@@ -9914,7 +9927,7 @@
     </w:p>
     <w:p>
       <w:pPr>
-        <w:pStyle w:val="Heading2"/>
+        <w:pStyle w:val="Naslov2"/>
         <w:numPr>
           <w:ilvl w:val="1"/>
           <w:numId w:val="4"/>
@@ -9930,7 +9943,7 @@
     </w:p>
     <w:p>
       <w:pPr>
-        <w:pStyle w:val="Heading2"/>
+        <w:pStyle w:val="Naslov2"/>
         <w:tabs>
           <w:tab w:val="left" w:pos="719"/>
         </w:tabs>
@@ -9940,7 +9953,7 @@
     </w:p>
     <w:p>
       <w:pPr>
-        <w:pStyle w:val="BodyText"/>
+        <w:pStyle w:val="Tijeloteksta"/>
         <w:numPr>
           <w:ilvl w:val="0"/>
           <w:numId w:val="16"/>
@@ -9955,7 +9968,7 @@
     </w:p>
     <w:p>
       <w:pPr>
-        <w:pStyle w:val="BodyText"/>
+        <w:pStyle w:val="Tijeloteksta"/>
         <w:numPr>
           <w:ilvl w:val="0"/>
           <w:numId w:val="16"/>
@@ -9970,7 +9983,7 @@
     </w:p>
     <w:p>
       <w:pPr>
-        <w:pStyle w:val="BodyText"/>
+        <w:pStyle w:val="Tijeloteksta"/>
         <w:numPr>
           <w:ilvl w:val="0"/>
           <w:numId w:val="16"/>
@@ -9985,7 +9998,7 @@
     </w:p>
     <w:p>
       <w:pPr>
-        <w:pStyle w:val="BodyText"/>
+        <w:pStyle w:val="Tijeloteksta"/>
         <w:numPr>
           <w:ilvl w:val="0"/>
           <w:numId w:val="16"/>
@@ -10000,7 +10013,7 @@
     </w:p>
     <w:p>
       <w:pPr>
-        <w:pStyle w:val="BodyText"/>
+        <w:pStyle w:val="Tijeloteksta"/>
         <w:numPr>
           <w:ilvl w:val="0"/>
           <w:numId w:val="16"/>
@@ -10015,7 +10028,7 @@
     </w:p>
     <w:p>
       <w:pPr>
-        <w:pStyle w:val="BodyText"/>
+        <w:pStyle w:val="Tijeloteksta"/>
         <w:spacing w:before="120"/>
         <w:ind w:left="141"/>
         <w:jc w:val="both"/>
@@ -10164,7 +10177,7 @@
     </w:p>
     <w:p>
       <w:pPr>
-        <w:pStyle w:val="BodyText"/>
+        <w:pStyle w:val="Tijeloteksta"/>
         <w:spacing w:before="70"/>
         <w:ind w:left="141"/>
         <w:jc w:val="both"/>
@@ -10217,13 +10230,13 @@
     </w:p>
     <w:p>
       <w:pPr>
-        <w:pStyle w:val="BodyText"/>
+        <w:pStyle w:val="Tijeloteksta"/>
         <w:spacing w:before="153"/>
       </w:pPr>
     </w:p>
     <w:p>
       <w:pPr>
-        <w:pStyle w:val="Heading2"/>
+        <w:pStyle w:val="Naslov2"/>
         <w:numPr>
           <w:ilvl w:val="1"/>
           <w:numId w:val="4"/>
@@ -10241,7 +10254,7 @@
     </w:p>
     <w:p>
       <w:pPr>
-        <w:pStyle w:val="BodyText"/>
+        <w:pStyle w:val="Tijeloteksta"/>
         <w:spacing w:before="190" w:line="300" w:lineRule="auto"/>
         <w:ind w:left="141" w:right="287"/>
         <w:jc w:val="both"/>
@@ -10252,7 +10265,7 @@
     </w:p>
     <w:p>
       <w:pPr>
-        <w:pStyle w:val="BodyText"/>
+        <w:pStyle w:val="Tijeloteksta"/>
         <w:spacing w:line="300" w:lineRule="auto"/>
         <w:jc w:val="both"/>
         <w:sectPr>
@@ -10264,7 +10277,7 @@
     </w:p>
     <w:p>
       <w:pPr>
-        <w:pStyle w:val="Heading1"/>
+        <w:pStyle w:val="Naslov1"/>
         <w:numPr>
           <w:ilvl w:val="0"/>
           <w:numId w:val="4"/>
@@ -10282,7 +10295,7 @@
     </w:p>
     <w:p>
       <w:pPr>
-        <w:pStyle w:val="BodyText"/>
+        <w:pStyle w:val="Tijeloteksta"/>
         <w:spacing w:before="318" w:line="300" w:lineRule="auto"/>
         <w:ind w:left="141" w:right="279"/>
         <w:jc w:val="both"/>
@@ -10290,12 +10303,23 @@
     </w:p>
     <w:p>
       <w:pPr>
-        <w:pStyle w:val="BodyText"/>
+        <w:pStyle w:val="Tijeloteksta"/>
         <w:spacing w:before="318" w:line="300" w:lineRule="auto"/>
         <w:ind w:left="141" w:right="279"/>
         <w:jc w:val="both"/>
       </w:pPr>
       <w:r>
+        <w:t>Za provedbu ovog rada i treniranje modela strojnog učenja potrebna nam je što veća količina kvalitetnih fotografija sa točno određenog prostora gradskih središta.</w:t>
+      </w:r>
+    </w:p>
+    <w:p>
+      <w:pPr>
+        <w:pStyle w:val="Tijeloteksta"/>
+        <w:spacing w:before="318" w:line="300" w:lineRule="auto"/>
+        <w:ind w:left="141" w:right="279"/>
+        <w:jc w:val="both"/>
+      </w:pPr>
+      <w:r>
         <w:t>Empirijski odnosno praktični dio rada se izrađuje po potrebi, ovisno o vrsti</w:t>
       </w:r>
       <w:r>
@@ -10535,7 +10559,7 @@
     </w:p>
     <w:p>
       <w:pPr>
-        <w:pStyle w:val="BodyText"/>
+        <w:pStyle w:val="Tijeloteksta"/>
         <w:spacing w:before="120" w:line="300" w:lineRule="auto"/>
         <w:ind w:left="141" w:right="281"/>
         <w:jc w:val="both"/>
@@ -10744,13 +10768,13 @@
     </w:p>
     <w:p>
       <w:pPr>
-        <w:pStyle w:val="BodyText"/>
+        <w:pStyle w:val="Tijeloteksta"/>
         <w:spacing w:before="85"/>
       </w:pPr>
     </w:p>
     <w:p>
       <w:pPr>
-        <w:pStyle w:val="Heading2"/>
+        <w:pStyle w:val="Naslov2"/>
         <w:numPr>
           <w:ilvl w:val="1"/>
           <w:numId w:val="4"/>
@@ -10768,7 +10792,26 @@
     </w:p>
     <w:p>
       <w:pPr>
-        <w:pStyle w:val="BodyText"/>
+        <w:pStyle w:val="Tijeloteksta"/>
+        <w:spacing w:before="190" w:line="297" w:lineRule="auto"/>
+        <w:ind w:left="141" w:right="280"/>
+        <w:jc w:val="both"/>
+      </w:pPr>
+      <w:r>
+        <w:t xml:space="preserve">Kod prikupljanja slika sam koristio </w:t>
+      </w:r>
+      <w:proofErr w:type="spellStart"/>
+      <w:r>
+        <w:t>Mapillary</w:t>
+      </w:r>
+      <w:proofErr w:type="spellEnd"/>
+      <w:r>
+        <w:t xml:space="preserve"> API </w:t>
+      </w:r>
+    </w:p>
+    <w:p>
+      <w:pPr>
+        <w:pStyle w:val="Tijeloteksta"/>
         <w:numPr>
           <w:ilvl w:val="0"/>
           <w:numId w:val="17"/>
@@ -10777,13 +10820,15 @@
         <w:ind w:right="280"/>
         <w:jc w:val="both"/>
       </w:pPr>
+      <w:proofErr w:type="spellStart"/>
       <w:r>
         <w:t>Mapillary</w:t>
       </w:r>
-    </w:p>
-    <w:p>
-      <w:pPr>
-        <w:pStyle w:val="BodyText"/>
+      <w:proofErr w:type="spellEnd"/>
+    </w:p>
+    <w:p>
+      <w:pPr>
+        <w:pStyle w:val="Tijeloteksta"/>
         <w:numPr>
           <w:ilvl w:val="0"/>
           <w:numId w:val="17"/>
@@ -10798,7 +10843,7 @@
     </w:p>
     <w:p>
       <w:pPr>
-        <w:pStyle w:val="BodyText"/>
+        <w:pStyle w:val="Tijeloteksta"/>
         <w:numPr>
           <w:ilvl w:val="0"/>
           <w:numId w:val="17"/>
@@ -10813,7 +10858,7 @@
     </w:p>
     <w:p>
       <w:pPr>
-        <w:pStyle w:val="BodyText"/>
+        <w:pStyle w:val="Tijeloteksta"/>
         <w:numPr>
           <w:ilvl w:val="0"/>
           <w:numId w:val="17"/>
@@ -10828,7 +10873,7 @@
     </w:p>
     <w:p>
       <w:pPr>
-        <w:pStyle w:val="BodyText"/>
+        <w:pStyle w:val="Tijeloteksta"/>
         <w:spacing w:before="190" w:line="297" w:lineRule="auto"/>
         <w:ind w:left="141" w:right="280"/>
         <w:jc w:val="both"/>
@@ -10839,13 +10884,13 @@
     </w:p>
     <w:p>
       <w:pPr>
-        <w:pStyle w:val="BodyText"/>
+        <w:pStyle w:val="Tijeloteksta"/>
         <w:spacing w:before="88"/>
       </w:pPr>
     </w:p>
     <w:p>
       <w:pPr>
-        <w:pStyle w:val="Heading2"/>
+        <w:pStyle w:val="Naslov2"/>
         <w:numPr>
           <w:ilvl w:val="1"/>
           <w:numId w:val="4"/>
@@ -10863,7 +10908,32 @@
     </w:p>
     <w:p>
       <w:pPr>
-        <w:pStyle w:val="BodyText"/>
+        <w:pStyle w:val="Tijeloteksta"/>
+        <w:spacing w:before="190"/>
+        <w:ind w:left="141"/>
+        <w:jc w:val="both"/>
+      </w:pPr>
+      <w:r>
+        <w:t>Kod razvoja modela strojnog učenja, odlučio sam izradu i početna testiranja započeti sa četiri europske prijestolnice, što mi je značajno olakšalo prve eksperimente i provjere</w:t>
+      </w:r>
+      <w:r>
+        <w:t xml:space="preserve"> prije skaliranja na puni broj klasa.</w:t>
+      </w:r>
+    </w:p>
+    <w:p>
+      <w:pPr>
+        <w:pStyle w:val="Tijeloteksta"/>
+        <w:spacing w:before="190"/>
+        <w:ind w:left="141"/>
+        <w:jc w:val="both"/>
+      </w:pPr>
+      <w:r>
+        <w:t>Za prva četiri grada sam odabrao:</w:t>
+      </w:r>
+    </w:p>
+    <w:p>
+      <w:pPr>
+        <w:pStyle w:val="Tijeloteksta"/>
         <w:numPr>
           <w:ilvl w:val="0"/>
           <w:numId w:val="18"/>
@@ -10872,12 +10942,15 @@
         <w:jc w:val="both"/>
       </w:pPr>
       <w:r>
-        <w:t>Kriterij odabira</w:t>
-      </w:r>
-    </w:p>
-    <w:p>
-      <w:pPr>
-        <w:pStyle w:val="BodyText"/>
+        <w:t>Madrid</w:t>
+      </w:r>
+      <w:r>
+        <w:t xml:space="preserve"> – liberijska/mediteranska arhitektura</w:t>
+      </w:r>
+    </w:p>
+    <w:p>
+      <w:pPr>
+        <w:pStyle w:val="Tijeloteksta"/>
         <w:numPr>
           <w:ilvl w:val="0"/>
           <w:numId w:val="18"/>
@@ -10886,12 +10959,15 @@
         <w:jc w:val="both"/>
       </w:pPr>
       <w:r>
-        <w:t>Početni gradovi</w:t>
-      </w:r>
-    </w:p>
-    <w:p>
-      <w:pPr>
-        <w:pStyle w:val="BodyText"/>
+        <w:t>Rim</w:t>
+      </w:r>
+      <w:r>
+        <w:t xml:space="preserve"> – antička/renesansna jezgra</w:t>
+      </w:r>
+    </w:p>
+    <w:p>
+      <w:pPr>
+        <w:pStyle w:val="Tijeloteksta"/>
         <w:numPr>
           <w:ilvl w:val="0"/>
           <w:numId w:val="18"/>
@@ -10900,12 +10976,93 @@
         <w:jc w:val="both"/>
       </w:pPr>
       <w:r>
+        <w:t>Beč</w:t>
+      </w:r>
+      <w:r>
+        <w:t xml:space="preserve"> – srednjoeuropska secesijska/carska arhitektura</w:t>
+      </w:r>
+    </w:p>
+    <w:p>
+      <w:pPr>
+        <w:pStyle w:val="Tijeloteksta"/>
+        <w:numPr>
+          <w:ilvl w:val="0"/>
+          <w:numId w:val="18"/>
+        </w:numPr>
+        <w:spacing w:before="190"/>
+        <w:jc w:val="both"/>
+      </w:pPr>
+      <w:r>
+        <w:t>Zagreb</w:t>
+      </w:r>
+      <w:r>
+        <w:t xml:space="preserve"> – srednjoeuropska/austrougarska arhitektura</w:t>
+      </w:r>
+    </w:p>
+    <w:p>
+      <w:pPr>
+        <w:pStyle w:val="Tijeloteksta"/>
+        <w:spacing w:before="190"/>
+        <w:jc w:val="both"/>
+      </w:pPr>
+      <w:r>
+        <w:lastRenderedPageBreak/>
+        <w:t>Ovi gradovi pokrivaju različite dijelove Europe i različite arhitektonske tradicije, no idalje nisu previše različiti čime zadržavaju vjerodostojnost rezultata.</w:t>
+      </w:r>
+    </w:p>
+    <w:p>
+      <w:pPr>
+        <w:pStyle w:val="Tijeloteksta"/>
+        <w:spacing w:before="190"/>
+        <w:ind w:left="501"/>
+        <w:jc w:val="both"/>
+      </w:pPr>
+    </w:p>
+    <w:p>
+      <w:pPr>
+        <w:pStyle w:val="Tijeloteksta"/>
+        <w:numPr>
+          <w:ilvl w:val="0"/>
+          <w:numId w:val="18"/>
+        </w:numPr>
+        <w:spacing w:before="190"/>
+        <w:jc w:val="both"/>
+      </w:pPr>
+      <w:r>
+        <w:t>Kriterij odabira</w:t>
+      </w:r>
+    </w:p>
+    <w:p>
+      <w:pPr>
+        <w:pStyle w:val="Tijeloteksta"/>
+        <w:numPr>
+          <w:ilvl w:val="0"/>
+          <w:numId w:val="18"/>
+        </w:numPr>
+        <w:spacing w:before="190"/>
+        <w:jc w:val="both"/>
+      </w:pPr>
+      <w:r>
+        <w:t>Početni gradovi</w:t>
+      </w:r>
+    </w:p>
+    <w:p>
+      <w:pPr>
+        <w:pStyle w:val="Tijeloteksta"/>
+        <w:numPr>
+          <w:ilvl w:val="0"/>
+          <w:numId w:val="18"/>
+        </w:numPr>
+        <w:spacing w:before="190"/>
+        <w:jc w:val="both"/>
+      </w:pPr>
+      <w:r>
         <w:t>Kasnije proširenje</w:t>
       </w:r>
     </w:p>
     <w:p>
       <w:pPr>
-        <w:pStyle w:val="BodyText"/>
+        <w:pStyle w:val="Tijeloteksta"/>
         <w:spacing w:before="190"/>
         <w:ind w:left="141"/>
         <w:jc w:val="both"/>
@@ -10916,7 +11073,7 @@
     </w:p>
     <w:p>
       <w:pPr>
-        <w:pStyle w:val="BodyText"/>
+        <w:pStyle w:val="Tijeloteksta"/>
         <w:spacing w:before="190"/>
         <w:ind w:left="141"/>
         <w:jc w:val="both"/>
@@ -11029,13 +11186,13 @@
     </w:p>
     <w:p>
       <w:pPr>
-        <w:pStyle w:val="BodyText"/>
+        <w:pStyle w:val="Tijeloteksta"/>
         <w:spacing w:before="153"/>
       </w:pPr>
     </w:p>
     <w:p>
       <w:pPr>
-        <w:pStyle w:val="Heading2"/>
+        <w:pStyle w:val="Naslov2"/>
         <w:numPr>
           <w:ilvl w:val="1"/>
           <w:numId w:val="4"/>
@@ -11054,7 +11211,7 @@
     </w:p>
     <w:p>
       <w:pPr>
-        <w:pStyle w:val="BodyText"/>
+        <w:pStyle w:val="Tijeloteksta"/>
         <w:spacing w:before="187" w:line="300" w:lineRule="auto"/>
         <w:ind w:left="141" w:right="283"/>
         <w:jc w:val="both"/>
@@ -11173,7 +11330,7 @@
     </w:p>
     <w:p>
       <w:pPr>
-        <w:pStyle w:val="BodyText"/>
+        <w:pStyle w:val="Tijeloteksta"/>
         <w:spacing w:before="187" w:line="300" w:lineRule="auto"/>
         <w:ind w:left="141" w:right="283"/>
         <w:jc w:val="both"/>
@@ -11181,7 +11338,7 @@
     </w:p>
     <w:p>
       <w:pPr>
-        <w:pStyle w:val="Heading2"/>
+        <w:pStyle w:val="Naslov2"/>
         <w:numPr>
           <w:ilvl w:val="1"/>
           <w:numId w:val="4"/>
@@ -11197,7 +11354,7 @@
     </w:p>
     <w:p>
       <w:pPr>
-        <w:pStyle w:val="BodyText"/>
+        <w:pStyle w:val="Tijeloteksta"/>
         <w:spacing w:before="187" w:line="300" w:lineRule="auto"/>
         <w:ind w:left="141" w:right="283"/>
         <w:jc w:val="both"/>
@@ -11208,19 +11365,18 @@
     </w:p>
     <w:p>
       <w:pPr>
-        <w:pStyle w:val="BodyText"/>
+        <w:pStyle w:val="Tijeloteksta"/>
         <w:spacing w:before="187" w:line="300" w:lineRule="auto"/>
         <w:ind w:left="141" w:right="283"/>
         <w:jc w:val="both"/>
       </w:pPr>
       <w:r>
-        <w:lastRenderedPageBreak/>
         <w:t>Ako imamo relevantan dio Python koda može se pokazati kreći primjer. Predložak preporučuje da se dulji kod stavi u priloge.</w:t>
       </w:r>
     </w:p>
     <w:p>
       <w:pPr>
-        <w:pStyle w:val="BodyText"/>
+        <w:pStyle w:val="Tijeloteksta"/>
         <w:spacing w:before="187" w:line="300" w:lineRule="auto"/>
         <w:ind w:left="141" w:right="283"/>
         <w:jc w:val="both"/>
@@ -11228,7 +11384,7 @@
     </w:p>
     <w:p>
       <w:pPr>
-        <w:pStyle w:val="Heading2"/>
+        <w:pStyle w:val="Naslov2"/>
         <w:numPr>
           <w:ilvl w:val="1"/>
           <w:numId w:val="4"/>
@@ -11244,7 +11400,7 @@
     </w:p>
     <w:p>
       <w:pPr>
-        <w:pStyle w:val="BodyText"/>
+        <w:pStyle w:val="Tijeloteksta"/>
         <w:spacing w:before="187" w:line="300" w:lineRule="auto"/>
         <w:ind w:left="141" w:right="283"/>
         <w:jc w:val="both"/>
@@ -11255,7 +11411,7 @@
     </w:p>
     <w:p>
       <w:pPr>
-        <w:pStyle w:val="BodyText"/>
+        <w:pStyle w:val="Tijeloteksta"/>
         <w:numPr>
           <w:ilvl w:val="0"/>
           <w:numId w:val="21"/>
@@ -11270,7 +11426,7 @@
     </w:p>
     <w:p>
       <w:pPr>
-        <w:pStyle w:val="BodyText"/>
+        <w:pStyle w:val="Tijeloteksta"/>
         <w:numPr>
           <w:ilvl w:val="0"/>
           <w:numId w:val="21"/>
@@ -11285,7 +11441,7 @@
     </w:p>
     <w:p>
       <w:pPr>
-        <w:pStyle w:val="BodyText"/>
+        <w:pStyle w:val="Tijeloteksta"/>
         <w:numPr>
           <w:ilvl w:val="0"/>
           <w:numId w:val="21"/>
@@ -11300,7 +11456,7 @@
     </w:p>
     <w:p>
       <w:pPr>
-        <w:pStyle w:val="BodyText"/>
+        <w:pStyle w:val="Tijeloteksta"/>
         <w:numPr>
           <w:ilvl w:val="0"/>
           <w:numId w:val="21"/>
@@ -11315,7 +11471,7 @@
     </w:p>
     <w:p>
       <w:pPr>
-        <w:pStyle w:val="BodyText"/>
+        <w:pStyle w:val="Tijeloteksta"/>
         <w:spacing w:before="187" w:line="300" w:lineRule="auto"/>
         <w:ind w:left="861" w:right="283"/>
         <w:jc w:val="both"/>
@@ -11323,7 +11479,7 @@
     </w:p>
     <w:p>
       <w:pPr>
-        <w:pStyle w:val="Heading2"/>
+        <w:pStyle w:val="Naslov2"/>
         <w:numPr>
           <w:ilvl w:val="1"/>
           <w:numId w:val="4"/>
@@ -11339,7 +11495,7 @@
     </w:p>
     <w:p>
       <w:pPr>
-        <w:pStyle w:val="BodyText"/>
+        <w:pStyle w:val="Tijeloteksta"/>
         <w:spacing w:before="187" w:line="300" w:lineRule="auto"/>
         <w:ind w:left="141" w:right="283"/>
         <w:jc w:val="both"/>
@@ -11353,7 +11509,7 @@
     </w:p>
     <w:p>
       <w:pPr>
-        <w:pStyle w:val="BodyText"/>
+        <w:pStyle w:val="Tijeloteksta"/>
         <w:spacing w:before="121" w:line="300" w:lineRule="auto"/>
         <w:ind w:left="141" w:right="281"/>
         <w:jc w:val="both"/>
@@ -11508,7 +11664,7 @@
     </w:p>
     <w:p>
       <w:pPr>
-        <w:pStyle w:val="BodyText"/>
+        <w:pStyle w:val="Tijeloteksta"/>
         <w:spacing w:before="121" w:line="300" w:lineRule="auto"/>
         <w:ind w:left="141" w:right="281"/>
         <w:jc w:val="both"/>
@@ -11516,7 +11672,7 @@
     </w:p>
     <w:p>
       <w:pPr>
-        <w:pStyle w:val="BodyText"/>
+        <w:pStyle w:val="Tijeloteksta"/>
         <w:spacing w:before="120"/>
         <w:ind w:left="141"/>
         <w:jc w:val="both"/>
@@ -11665,7 +11821,7 @@
     </w:p>
     <w:p>
       <w:pPr>
-        <w:pStyle w:val="BodyText"/>
+        <w:pStyle w:val="Tijeloteksta"/>
         <w:spacing w:before="70"/>
         <w:ind w:left="141"/>
         <w:jc w:val="both"/>
@@ -11718,7 +11874,7 @@
     </w:p>
     <w:p>
       <w:pPr>
-        <w:pStyle w:val="ListParagraph"/>
+        <w:pStyle w:val="Odlomakpopisa"/>
         <w:numPr>
           <w:ilvl w:val="2"/>
           <w:numId w:val="4"/>
@@ -11756,7 +11912,7 @@
     </w:p>
     <w:p>
       <w:pPr>
-        <w:pStyle w:val="BodyText"/>
+        <w:pStyle w:val="Tijeloteksta"/>
         <w:spacing w:before="189" w:line="300" w:lineRule="auto"/>
         <w:ind w:left="141" w:right="281"/>
         <w:jc w:val="both"/>
@@ -11848,7 +12004,7 @@
     </w:p>
     <w:p>
       <w:pPr>
-        <w:pStyle w:val="BodyText"/>
+        <w:pStyle w:val="Tijeloteksta"/>
         <w:spacing w:before="122" w:line="300" w:lineRule="auto"/>
         <w:ind w:left="141" w:right="286"/>
         <w:jc w:val="both"/>
@@ -11967,7 +12123,7 @@
     </w:p>
     <w:p>
       <w:pPr>
-        <w:pStyle w:val="BodyText"/>
+        <w:pStyle w:val="Tijeloteksta"/>
         <w:spacing w:before="119"/>
         <w:ind w:left="141"/>
         <w:jc w:val="both"/>
@@ -12071,7 +12227,7 @@
     </w:p>
     <w:p>
       <w:pPr>
-        <w:pStyle w:val="BodyText"/>
+        <w:pStyle w:val="Tijeloteksta"/>
         <w:spacing w:before="190" w:line="300" w:lineRule="auto"/>
         <w:ind w:left="141" w:right="282"/>
         <w:jc w:val="both"/>
@@ -12212,7 +12368,7 @@
     </w:p>
     <w:p>
       <w:pPr>
-        <w:pStyle w:val="BodyText"/>
+        <w:pStyle w:val="Tijeloteksta"/>
         <w:spacing w:line="300" w:lineRule="auto"/>
         <w:jc w:val="both"/>
         <w:sectPr>
@@ -12224,7 +12380,7 @@
     </w:p>
     <w:p>
       <w:pPr>
-        <w:pStyle w:val="BodyText"/>
+        <w:pStyle w:val="Tijeloteksta"/>
         <w:spacing w:before="77" w:line="300" w:lineRule="auto"/>
         <w:ind w:left="141" w:right="286"/>
         <w:jc w:val="both"/>
@@ -12491,7 +12647,7 @@
     </w:p>
     <w:p>
       <w:pPr>
-        <w:pStyle w:val="BodyText"/>
+        <w:pStyle w:val="Tijeloteksta"/>
         <w:spacing w:before="6"/>
         <w:rPr>
           <w:sz w:val="17"/>
@@ -13028,7 +13184,7 @@
     </w:tbl>
     <w:p>
       <w:pPr>
-        <w:pStyle w:val="ListParagraph"/>
+        <w:pStyle w:val="Odlomakpopisa"/>
         <w:numPr>
           <w:ilvl w:val="2"/>
           <w:numId w:val="4"/>
@@ -13066,7 +13222,7 @@
     </w:p>
     <w:p>
       <w:pPr>
-        <w:pStyle w:val="BodyText"/>
+        <w:pStyle w:val="Tijeloteksta"/>
         <w:spacing w:before="189" w:line="297" w:lineRule="auto"/>
         <w:ind w:left="141" w:right="282"/>
         <w:jc w:val="both"/>
@@ -13077,7 +13233,7 @@
     </w:p>
     <w:p>
       <w:pPr>
-        <w:pStyle w:val="BodyText"/>
+        <w:pStyle w:val="Tijeloteksta"/>
         <w:spacing w:before="125" w:line="300" w:lineRule="auto"/>
         <w:ind w:left="141" w:right="281"/>
         <w:jc w:val="both"/>
@@ -14392,7 +14548,7 @@
     </w:p>
     <w:p>
       <w:pPr>
-        <w:pStyle w:val="BodyText"/>
+        <w:pStyle w:val="Tijeloteksta"/>
         <w:rPr>
           <w:sz w:val="20"/>
         </w:rPr>
@@ -14400,7 +14556,7 @@
     </w:p>
     <w:p>
       <w:pPr>
-        <w:pStyle w:val="BodyText"/>
+        <w:pStyle w:val="Tijeloteksta"/>
         <w:rPr>
           <w:sz w:val="20"/>
         </w:rPr>
@@ -14408,7 +14564,7 @@
     </w:p>
     <w:p>
       <w:pPr>
-        <w:pStyle w:val="BodyText"/>
+        <w:pStyle w:val="Tijeloteksta"/>
         <w:rPr>
           <w:sz w:val="20"/>
         </w:rPr>
@@ -14416,7 +14572,7 @@
     </w:p>
     <w:p>
       <w:pPr>
-        <w:pStyle w:val="BodyText"/>
+        <w:pStyle w:val="Tijeloteksta"/>
         <w:rPr>
           <w:sz w:val="20"/>
         </w:rPr>
@@ -14424,7 +14580,7 @@
     </w:p>
     <w:p>
       <w:pPr>
-        <w:pStyle w:val="BodyText"/>
+        <w:pStyle w:val="Tijeloteksta"/>
         <w:spacing w:before="147"/>
         <w:rPr>
           <w:sz w:val="20"/>
@@ -14884,22 +15040,22 @@
     </w:tbl>
     <w:p>
       <w:pPr>
-        <w:pStyle w:val="BodyText"/>
-      </w:pPr>
-    </w:p>
-    <w:p>
-      <w:pPr>
-        <w:pStyle w:val="BodyText"/>
-      </w:pPr>
-    </w:p>
-    <w:p>
-      <w:pPr>
-        <w:pStyle w:val="BodyText"/>
-      </w:pPr>
-    </w:p>
-    <w:p>
-      <w:pPr>
-        <w:pStyle w:val="BodyText"/>
+        <w:pStyle w:val="Tijeloteksta"/>
+      </w:pPr>
+    </w:p>
+    <w:p>
+      <w:pPr>
+        <w:pStyle w:val="Tijeloteksta"/>
+      </w:pPr>
+    </w:p>
+    <w:p>
+      <w:pPr>
+        <w:pStyle w:val="Tijeloteksta"/>
+      </w:pPr>
+    </w:p>
+    <w:p>
+      <w:pPr>
+        <w:pStyle w:val="Tijeloteksta"/>
         <w:spacing w:before="5"/>
       </w:pPr>
     </w:p>
@@ -15051,7 +15207,7 @@
     </w:p>
     <w:p>
       <w:pPr>
-        <w:pStyle w:val="ListParagraph"/>
+        <w:pStyle w:val="Odlomakpopisa"/>
         <w:numPr>
           <w:ilvl w:val="2"/>
           <w:numId w:val="4"/>
@@ -15108,7 +15264,7 @@
     </w:p>
     <w:p>
       <w:pPr>
-        <w:pStyle w:val="BodyText"/>
+        <w:pStyle w:val="Tijeloteksta"/>
         <w:spacing w:before="189" w:line="300" w:lineRule="auto"/>
         <w:ind w:left="141" w:right="280"/>
         <w:jc w:val="both"/>
@@ -15200,7 +15356,7 @@
     </w:p>
     <w:p>
       <w:pPr>
-        <w:pStyle w:val="BodyText"/>
+        <w:pStyle w:val="Tijeloteksta"/>
         <w:spacing w:before="120"/>
         <w:ind w:left="141"/>
         <w:jc w:val="both"/>
@@ -15313,7 +15469,7 @@
     </w:p>
     <w:p>
       <w:pPr>
-        <w:pStyle w:val="BodyText"/>
+        <w:pStyle w:val="Tijeloteksta"/>
         <w:spacing w:before="70"/>
         <w:ind w:left="141"/>
         <w:jc w:val="both"/>
@@ -15363,7 +15519,7 @@
     </w:p>
     <w:p>
       <w:pPr>
-        <w:pStyle w:val="BodyText"/>
+        <w:pStyle w:val="Tijeloteksta"/>
         <w:jc w:val="both"/>
         <w:sectPr>
           <w:pgSz w:w="11910" w:h="16840"/>
@@ -15374,7 +15530,7 @@
     </w:p>
     <w:p>
       <w:pPr>
-        <w:pStyle w:val="BodyText"/>
+        <w:pStyle w:val="Tijeloteksta"/>
         <w:spacing w:before="77" w:line="300" w:lineRule="auto"/>
         <w:ind w:left="141" w:right="285"/>
         <w:jc w:val="both"/>
@@ -15386,7 +15542,7 @@
     </w:p>
     <w:p>
       <w:pPr>
-        <w:pStyle w:val="BodyText"/>
+        <w:pStyle w:val="Tijeloteksta"/>
         <w:spacing w:before="122"/>
         <w:ind w:left="141"/>
         <w:jc w:val="both"/>
@@ -15471,7 +15627,7 @@
     </w:p>
     <w:p>
       <w:pPr>
-        <w:pStyle w:val="BodyText"/>
+        <w:pStyle w:val="Tijeloteksta"/>
         <w:spacing w:before="3"/>
         <w:rPr>
           <w:sz w:val="14"/>
@@ -16272,7 +16428,7 @@
                           </w:p>
                           <w:p>
                             <w:pPr>
-                              <w:pStyle w:val="BodyText"/>
+                              <w:pStyle w:val="Tijeloteksta"/>
                               <w:spacing w:before="2"/>
                               <w:rPr>
                                 <w:rFonts w:ascii="Consolas"/>
@@ -17398,7 +17554,7 @@
                     </w:p>
                     <w:p>
                       <w:pPr>
-                        <w:pStyle w:val="BodyText"/>
+                        <w:pStyle w:val="Tijeloteksta"/>
                         <w:spacing w:before="2"/>
                         <w:rPr>
                           <w:rFonts w:ascii="Consolas"/>
@@ -17851,7 +18007,7 @@
     </w:p>
     <w:p>
       <w:pPr>
-        <w:pStyle w:val="BodyText"/>
+        <w:pStyle w:val="Tijeloteksta"/>
         <w:spacing w:before="8"/>
         <w:rPr>
           <w:sz w:val="22"/>
@@ -17860,7 +18016,7 @@
     </w:p>
     <w:p>
       <w:pPr>
-        <w:pStyle w:val="BodyText"/>
+        <w:pStyle w:val="Tijeloteksta"/>
         <w:spacing w:line="300" w:lineRule="auto"/>
         <w:ind w:left="141" w:right="279"/>
         <w:jc w:val="both"/>
@@ -17979,7 +18135,7 @@
     </w:p>
     <w:p>
       <w:pPr>
-        <w:pStyle w:val="ListParagraph"/>
+        <w:pStyle w:val="Odlomakpopisa"/>
         <w:numPr>
           <w:ilvl w:val="2"/>
           <w:numId w:val="4"/>
@@ -18043,7 +18199,7 @@
     </w:p>
     <w:p>
       <w:pPr>
-        <w:pStyle w:val="BodyText"/>
+        <w:pStyle w:val="Tijeloteksta"/>
         <w:spacing w:before="192" w:line="300" w:lineRule="auto"/>
         <w:ind w:left="141" w:right="287"/>
         <w:jc w:val="both"/>
@@ -18054,7 +18210,7 @@
     </w:p>
     <w:p>
       <w:pPr>
-        <w:pStyle w:val="ListParagraph"/>
+        <w:pStyle w:val="Odlomakpopisa"/>
         <w:numPr>
           <w:ilvl w:val="2"/>
           <w:numId w:val="4"/>
@@ -18085,7 +18241,7 @@
     </w:p>
     <w:p>
       <w:pPr>
-        <w:pStyle w:val="BodyText"/>
+        <w:pStyle w:val="Tijeloteksta"/>
         <w:spacing w:before="190" w:line="300" w:lineRule="auto"/>
         <w:ind w:left="141" w:right="285"/>
         <w:jc w:val="both"/>
@@ -18096,7 +18252,7 @@
     </w:p>
     <w:p>
       <w:pPr>
-        <w:pStyle w:val="BodyText"/>
+        <w:pStyle w:val="Tijeloteksta"/>
         <w:spacing w:before="118"/>
         <w:ind w:left="141"/>
         <w:jc w:val="both"/>
@@ -18167,7 +18323,7 @@
     </w:p>
     <w:p>
       <w:pPr>
-        <w:pStyle w:val="BodyText"/>
+        <w:pStyle w:val="Tijeloteksta"/>
         <w:tabs>
           <w:tab w:val="left" w:pos="8816"/>
         </w:tabs>
@@ -18384,7 +18540,7 @@
     </w:p>
     <w:p>
       <w:pPr>
-        <w:pStyle w:val="BodyText"/>
+        <w:pStyle w:val="Tijeloteksta"/>
         <w:jc w:val="both"/>
         <w:rPr>
           <w:position w:val="1"/>
@@ -18398,7 +18554,7 @@
     </w:p>
     <w:p>
       <w:pPr>
-        <w:pStyle w:val="Heading2"/>
+        <w:pStyle w:val="Naslov2"/>
         <w:numPr>
           <w:ilvl w:val="1"/>
           <w:numId w:val="4"/>
@@ -18418,7 +18574,7 @@
     </w:p>
     <w:p>
       <w:pPr>
-        <w:pStyle w:val="BodyText"/>
+        <w:pStyle w:val="Tijeloteksta"/>
         <w:spacing w:before="189" w:line="300" w:lineRule="auto"/>
         <w:ind w:left="141" w:right="283"/>
         <w:jc w:val="both"/>
@@ -18429,7 +18585,7 @@
     </w:p>
     <w:p>
       <w:pPr>
-        <w:pStyle w:val="BodyText"/>
+        <w:pStyle w:val="Tijeloteksta"/>
         <w:spacing w:before="189" w:line="300" w:lineRule="auto"/>
         <w:ind w:left="141" w:right="283"/>
         <w:jc w:val="both"/>
@@ -18440,7 +18596,7 @@
     </w:p>
     <w:p>
       <w:pPr>
-        <w:pStyle w:val="BodyText"/>
+        <w:pStyle w:val="Tijeloteksta"/>
         <w:spacing w:before="189" w:line="300" w:lineRule="auto"/>
         <w:ind w:left="141" w:right="283"/>
         <w:jc w:val="both"/>
@@ -18454,7 +18610,7 @@
     </w:p>
     <w:p>
       <w:pPr>
-        <w:pStyle w:val="BodyText"/>
+        <w:pStyle w:val="Tijeloteksta"/>
         <w:spacing w:before="189" w:line="300" w:lineRule="auto"/>
         <w:ind w:left="141" w:right="283"/>
         <w:jc w:val="both"/>
@@ -18462,7 +18618,7 @@
     </w:p>
     <w:p>
       <w:pPr>
-        <w:pStyle w:val="Heading2"/>
+        <w:pStyle w:val="Naslov2"/>
         <w:tabs>
           <w:tab w:val="left" w:pos="719"/>
         </w:tabs>
@@ -18472,7 +18628,7 @@
     </w:p>
     <w:p>
       <w:pPr>
-        <w:pStyle w:val="BodyText"/>
+        <w:pStyle w:val="Tijeloteksta"/>
         <w:spacing w:before="189" w:line="300" w:lineRule="auto"/>
         <w:ind w:left="283" w:right="283"/>
         <w:jc w:val="both"/>
@@ -18480,7 +18636,7 @@
     </w:p>
     <w:p>
       <w:pPr>
-        <w:pStyle w:val="Heading2"/>
+        <w:pStyle w:val="Naslov2"/>
         <w:numPr>
           <w:ilvl w:val="1"/>
           <w:numId w:val="4"/>
@@ -18497,7 +18653,7 @@
     </w:p>
     <w:p>
       <w:pPr>
-        <w:pStyle w:val="BodyText"/>
+        <w:pStyle w:val="Tijeloteksta"/>
         <w:spacing w:before="189" w:line="300" w:lineRule="auto"/>
         <w:ind w:left="141" w:right="283"/>
         <w:jc w:val="both"/>
@@ -18505,7 +18661,7 @@
     </w:p>
     <w:p>
       <w:pPr>
-        <w:pStyle w:val="Heading1"/>
+        <w:pStyle w:val="Naslov1"/>
         <w:numPr>
           <w:ilvl w:val="0"/>
           <w:numId w:val="4"/>
@@ -18524,7 +18680,7 @@
     </w:p>
     <w:p>
       <w:pPr>
-        <w:pStyle w:val="BodyText"/>
+        <w:pStyle w:val="Tijeloteksta"/>
         <w:spacing w:before="189" w:line="300" w:lineRule="auto"/>
         <w:ind w:left="142" w:right="283" w:hanging="1"/>
         <w:jc w:val="both"/>
@@ -18535,7 +18691,7 @@
     </w:p>
     <w:p>
       <w:pPr>
-        <w:pStyle w:val="Heading2"/>
+        <w:pStyle w:val="Naslov2"/>
         <w:numPr>
           <w:ilvl w:val="1"/>
           <w:numId w:val="4"/>
@@ -18552,7 +18708,7 @@
     </w:p>
     <w:p>
       <w:pPr>
-        <w:pStyle w:val="BodyText"/>
+        <w:pStyle w:val="Tijeloteksta"/>
         <w:spacing w:before="189" w:line="300" w:lineRule="auto"/>
         <w:ind w:left="567" w:right="283" w:hanging="426"/>
         <w:jc w:val="both"/>
@@ -18563,7 +18719,7 @@
     </w:p>
     <w:p>
       <w:pPr>
-        <w:pStyle w:val="BodyText"/>
+        <w:pStyle w:val="Tijeloteksta"/>
         <w:spacing w:before="189" w:line="300" w:lineRule="auto"/>
         <w:ind w:left="567" w:right="283" w:hanging="426"/>
         <w:jc w:val="both"/>
@@ -18571,7 +18727,7 @@
     </w:p>
     <w:p>
       <w:pPr>
-        <w:pStyle w:val="Heading2"/>
+        <w:pStyle w:val="Naslov2"/>
         <w:numPr>
           <w:ilvl w:val="1"/>
           <w:numId w:val="4"/>
@@ -18587,7 +18743,7 @@
     </w:p>
     <w:p>
       <w:pPr>
-        <w:pStyle w:val="Heading2"/>
+        <w:pStyle w:val="Naslov2"/>
         <w:tabs>
           <w:tab w:val="left" w:pos="709"/>
         </w:tabs>
@@ -18597,7 +18753,7 @@
     </w:p>
     <w:p>
       <w:pPr>
-        <w:pStyle w:val="Heading2"/>
+        <w:pStyle w:val="Naslov2"/>
         <w:numPr>
           <w:ilvl w:val="0"/>
           <w:numId w:val="24"/>
@@ -18621,7 +18777,7 @@
     </w:p>
     <w:p>
       <w:pPr>
-        <w:pStyle w:val="Heading2"/>
+        <w:pStyle w:val="Naslov2"/>
         <w:numPr>
           <w:ilvl w:val="0"/>
           <w:numId w:val="24"/>
@@ -18645,7 +18801,7 @@
     </w:p>
     <w:p>
       <w:pPr>
-        <w:pStyle w:val="Heading2"/>
+        <w:pStyle w:val="Naslov2"/>
         <w:numPr>
           <w:ilvl w:val="0"/>
           <w:numId w:val="24"/>
@@ -18669,7 +18825,7 @@
     </w:p>
     <w:p>
       <w:pPr>
-        <w:pStyle w:val="Heading2"/>
+        <w:pStyle w:val="Naslov2"/>
         <w:numPr>
           <w:ilvl w:val="0"/>
           <w:numId w:val="24"/>
@@ -18693,7 +18849,7 @@
     </w:p>
     <w:p>
       <w:pPr>
-        <w:pStyle w:val="BodyText"/>
+        <w:pStyle w:val="Tijeloteksta"/>
         <w:spacing w:before="189" w:line="300" w:lineRule="auto"/>
         <w:ind w:left="567" w:right="283" w:hanging="426"/>
         <w:jc w:val="both"/>
@@ -18701,7 +18857,7 @@
     </w:p>
     <w:p>
       <w:pPr>
-        <w:pStyle w:val="Heading2"/>
+        <w:pStyle w:val="Naslov2"/>
         <w:numPr>
           <w:ilvl w:val="1"/>
           <w:numId w:val="4"/>
@@ -18718,7 +18874,7 @@
     </w:p>
     <w:p>
       <w:pPr>
-        <w:pStyle w:val="BodyText"/>
+        <w:pStyle w:val="Tijeloteksta"/>
         <w:spacing w:before="189" w:line="300" w:lineRule="auto"/>
         <w:ind w:left="567" w:right="283" w:hanging="426"/>
         <w:jc w:val="both"/>
@@ -18729,7 +18885,7 @@
     </w:p>
     <w:p>
       <w:pPr>
-        <w:pStyle w:val="BodyText"/>
+        <w:pStyle w:val="Tijeloteksta"/>
         <w:spacing w:before="189" w:line="300" w:lineRule="auto"/>
         <w:ind w:left="567" w:right="283" w:hanging="426"/>
         <w:jc w:val="both"/>
@@ -18740,7 +18896,7 @@
     </w:p>
     <w:p>
       <w:pPr>
-        <w:pStyle w:val="BodyText"/>
+        <w:pStyle w:val="Tijeloteksta"/>
         <w:spacing w:before="189" w:line="300" w:lineRule="auto"/>
         <w:ind w:left="567" w:right="283" w:hanging="426"/>
         <w:jc w:val="both"/>
@@ -18748,7 +18904,7 @@
     </w:p>
     <w:p>
       <w:pPr>
-        <w:pStyle w:val="Heading2"/>
+        <w:pStyle w:val="Naslov2"/>
         <w:numPr>
           <w:ilvl w:val="1"/>
           <w:numId w:val="4"/>
@@ -18764,7 +18920,7 @@
     </w:p>
     <w:p>
       <w:pPr>
-        <w:pStyle w:val="BodyText"/>
+        <w:pStyle w:val="Tijeloteksta"/>
         <w:spacing w:before="189" w:line="300" w:lineRule="auto"/>
         <w:ind w:left="567" w:right="283" w:hanging="426"/>
         <w:jc w:val="both"/>
@@ -18775,7 +18931,7 @@
     </w:p>
     <w:p>
       <w:pPr>
-        <w:pStyle w:val="Heading2"/>
+        <w:pStyle w:val="Naslov2"/>
         <w:numPr>
           <w:ilvl w:val="1"/>
           <w:numId w:val="4"/>
@@ -18791,7 +18947,7 @@
     </w:p>
     <w:p>
       <w:pPr>
-        <w:pStyle w:val="BodyText"/>
+        <w:pStyle w:val="Tijeloteksta"/>
         <w:spacing w:before="189" w:line="300" w:lineRule="auto"/>
         <w:ind w:left="567" w:right="283" w:hanging="426"/>
         <w:jc w:val="both"/>
@@ -18802,7 +18958,7 @@
     </w:p>
     <w:p>
       <w:pPr>
-        <w:pStyle w:val="BodyText"/>
+        <w:pStyle w:val="Tijeloteksta"/>
         <w:spacing w:before="189" w:line="300" w:lineRule="auto"/>
         <w:ind w:left="567" w:right="283" w:hanging="426"/>
         <w:jc w:val="both"/>
@@ -18810,7 +18966,7 @@
     </w:p>
     <w:p>
       <w:pPr>
-        <w:pStyle w:val="Heading1"/>
+        <w:pStyle w:val="Naslov1"/>
         <w:numPr>
           <w:ilvl w:val="0"/>
           <w:numId w:val="4"/>
@@ -18830,7 +18986,7 @@
     </w:p>
     <w:p>
       <w:pPr>
-        <w:pStyle w:val="BodyText"/>
+        <w:pStyle w:val="Tijeloteksta"/>
         <w:spacing w:before="189" w:line="300" w:lineRule="auto"/>
         <w:ind w:left="567" w:right="283" w:hanging="426"/>
         <w:jc w:val="both"/>
@@ -18841,7 +18997,7 @@
     </w:p>
     <w:p>
       <w:pPr>
-        <w:pStyle w:val="Heading2"/>
+        <w:pStyle w:val="Naslov2"/>
         <w:numPr>
           <w:ilvl w:val="1"/>
           <w:numId w:val="4"/>
@@ -18857,7 +19013,7 @@
     </w:p>
     <w:p>
       <w:pPr>
-        <w:pStyle w:val="BodyText"/>
+        <w:pStyle w:val="Tijeloteksta"/>
         <w:spacing w:before="189" w:line="300" w:lineRule="auto"/>
         <w:ind w:left="567" w:right="283" w:hanging="426"/>
         <w:jc w:val="both"/>
@@ -18868,7 +19024,7 @@
     </w:p>
     <w:p>
       <w:pPr>
-        <w:pStyle w:val="Heading2"/>
+        <w:pStyle w:val="Naslov2"/>
         <w:numPr>
           <w:ilvl w:val="1"/>
           <w:numId w:val="4"/>
@@ -18884,7 +19040,7 @@
     </w:p>
     <w:p>
       <w:pPr>
-        <w:pStyle w:val="BodyText"/>
+        <w:pStyle w:val="Tijeloteksta"/>
         <w:spacing w:before="189" w:line="300" w:lineRule="auto"/>
         <w:ind w:left="567" w:right="283" w:hanging="426"/>
         <w:jc w:val="both"/>
@@ -18895,7 +19051,7 @@
     </w:p>
     <w:p>
       <w:pPr>
-        <w:pStyle w:val="Heading2"/>
+        <w:pStyle w:val="Naslov2"/>
         <w:numPr>
           <w:ilvl w:val="1"/>
           <w:numId w:val="4"/>
@@ -18911,7 +19067,7 @@
     </w:p>
     <w:p>
       <w:pPr>
-        <w:pStyle w:val="BodyText"/>
+        <w:pStyle w:val="Tijeloteksta"/>
         <w:spacing w:before="189" w:line="300" w:lineRule="auto"/>
         <w:ind w:left="567" w:right="283" w:hanging="426"/>
         <w:jc w:val="both"/>
@@ -18922,7 +19078,7 @@
     </w:p>
     <w:p>
       <w:pPr>
-        <w:pStyle w:val="Heading2"/>
+        <w:pStyle w:val="Naslov2"/>
         <w:numPr>
           <w:ilvl w:val="1"/>
           <w:numId w:val="4"/>
@@ -18938,7 +19094,7 @@
     </w:p>
     <w:p>
       <w:pPr>
-        <w:pStyle w:val="BodyText"/>
+        <w:pStyle w:val="Tijeloteksta"/>
         <w:numPr>
           <w:ilvl w:val="0"/>
           <w:numId w:val="26"/>
@@ -18953,7 +19109,7 @@
     </w:p>
     <w:p>
       <w:pPr>
-        <w:pStyle w:val="BodyText"/>
+        <w:pStyle w:val="Tijeloteksta"/>
         <w:numPr>
           <w:ilvl w:val="0"/>
           <w:numId w:val="26"/>
@@ -18968,7 +19124,7 @@
     </w:p>
     <w:p>
       <w:pPr>
-        <w:pStyle w:val="BodyText"/>
+        <w:pStyle w:val="Tijeloteksta"/>
         <w:numPr>
           <w:ilvl w:val="0"/>
           <w:numId w:val="26"/>
@@ -18983,7 +19139,7 @@
     </w:p>
     <w:p>
       <w:pPr>
-        <w:pStyle w:val="Heading2"/>
+        <w:pStyle w:val="Naslov2"/>
         <w:numPr>
           <w:ilvl w:val="1"/>
           <w:numId w:val="4"/>
@@ -19000,7 +19156,7 @@
     </w:p>
     <w:p>
       <w:pPr>
-        <w:pStyle w:val="BodyText"/>
+        <w:pStyle w:val="Tijeloteksta"/>
         <w:spacing w:before="189" w:line="300" w:lineRule="auto"/>
         <w:ind w:left="141" w:right="283"/>
         <w:jc w:val="both"/>
@@ -19011,7 +19167,7 @@
     </w:p>
     <w:p>
       <w:pPr>
-        <w:pStyle w:val="Heading2"/>
+        <w:pStyle w:val="Naslov2"/>
         <w:numPr>
           <w:ilvl w:val="1"/>
           <w:numId w:val="4"/>
@@ -19028,7 +19184,7 @@
     </w:p>
     <w:p>
       <w:pPr>
-        <w:pStyle w:val="BodyText"/>
+        <w:pStyle w:val="Tijeloteksta"/>
         <w:spacing w:before="189" w:line="300" w:lineRule="auto"/>
         <w:ind w:left="141" w:right="283"/>
         <w:jc w:val="both"/>
@@ -19042,7 +19198,7 @@
     </w:p>
     <w:p>
       <w:pPr>
-        <w:pStyle w:val="Heading2"/>
+        <w:pStyle w:val="Naslov2"/>
         <w:numPr>
           <w:ilvl w:val="1"/>
           <w:numId w:val="4"/>
@@ -19059,7 +19215,7 @@
     </w:p>
     <w:p>
       <w:pPr>
-        <w:pStyle w:val="BodyText"/>
+        <w:pStyle w:val="Tijeloteksta"/>
         <w:spacing w:before="189" w:line="300" w:lineRule="auto"/>
         <w:ind w:left="141" w:right="283"/>
         <w:jc w:val="both"/>
@@ -19070,7 +19226,7 @@
     </w:p>
     <w:p>
       <w:pPr>
-        <w:pStyle w:val="BodyText"/>
+        <w:pStyle w:val="Tijeloteksta"/>
         <w:spacing w:before="189" w:line="300" w:lineRule="auto"/>
         <w:ind w:left="141" w:right="283"/>
         <w:jc w:val="both"/>
@@ -19078,7 +19234,7 @@
     </w:p>
     <w:p>
       <w:pPr>
-        <w:pStyle w:val="Heading1"/>
+        <w:pStyle w:val="Naslov1"/>
         <w:numPr>
           <w:ilvl w:val="0"/>
           <w:numId w:val="4"/>
@@ -19097,7 +19253,7 @@
     </w:p>
     <w:p>
       <w:pPr>
-        <w:pStyle w:val="BodyText"/>
+        <w:pStyle w:val="Tijeloteksta"/>
         <w:spacing w:before="189" w:line="300" w:lineRule="auto"/>
         <w:ind w:left="141" w:right="283"/>
         <w:jc w:val="both"/>
@@ -19108,7 +19264,7 @@
     </w:p>
     <w:p>
       <w:pPr>
-        <w:pStyle w:val="Heading2"/>
+        <w:pStyle w:val="Naslov2"/>
         <w:numPr>
           <w:ilvl w:val="1"/>
           <w:numId w:val="4"/>
@@ -19125,7 +19281,7 @@
     </w:p>
     <w:p>
       <w:pPr>
-        <w:pStyle w:val="BodyText"/>
+        <w:pStyle w:val="Tijeloteksta"/>
         <w:spacing w:before="189" w:line="300" w:lineRule="auto"/>
         <w:ind w:left="141" w:right="283"/>
         <w:jc w:val="both"/>
@@ -19136,7 +19292,7 @@
     </w:p>
     <w:p>
       <w:pPr>
-        <w:pStyle w:val="BodyText"/>
+        <w:pStyle w:val="Tijeloteksta"/>
         <w:numPr>
           <w:ilvl w:val="0"/>
           <w:numId w:val="27"/>
@@ -19151,7 +19307,7 @@
     </w:p>
     <w:p>
       <w:pPr>
-        <w:pStyle w:val="BodyText"/>
+        <w:pStyle w:val="Tijeloteksta"/>
         <w:numPr>
           <w:ilvl w:val="0"/>
           <w:numId w:val="27"/>
@@ -19166,7 +19322,7 @@
     </w:p>
     <w:p>
       <w:pPr>
-        <w:pStyle w:val="BodyText"/>
+        <w:pStyle w:val="Tijeloteksta"/>
         <w:numPr>
           <w:ilvl w:val="0"/>
           <w:numId w:val="27"/>
@@ -19181,7 +19337,7 @@
     </w:p>
     <w:p>
       <w:pPr>
-        <w:pStyle w:val="BodyText"/>
+        <w:pStyle w:val="Tijeloteksta"/>
         <w:numPr>
           <w:ilvl w:val="0"/>
           <w:numId w:val="27"/>
@@ -19196,7 +19352,7 @@
     </w:p>
     <w:p>
       <w:pPr>
-        <w:pStyle w:val="BodyText"/>
+        <w:pStyle w:val="Tijeloteksta"/>
         <w:spacing w:before="189" w:line="300" w:lineRule="auto"/>
         <w:ind w:left="861" w:right="283"/>
         <w:jc w:val="both"/>
@@ -19204,7 +19360,7 @@
     </w:p>
     <w:p>
       <w:pPr>
-        <w:pStyle w:val="Heading2"/>
+        <w:pStyle w:val="Naslov2"/>
         <w:numPr>
           <w:ilvl w:val="1"/>
           <w:numId w:val="4"/>
@@ -19221,7 +19377,7 @@
     </w:p>
     <w:p>
       <w:pPr>
-        <w:pStyle w:val="BodyText"/>
+        <w:pStyle w:val="Tijeloteksta"/>
         <w:numPr>
           <w:ilvl w:val="0"/>
           <w:numId w:val="28"/>
@@ -19237,7 +19393,7 @@
     </w:p>
     <w:p>
       <w:pPr>
-        <w:pStyle w:val="BodyText"/>
+        <w:pStyle w:val="Tijeloteksta"/>
         <w:numPr>
           <w:ilvl w:val="0"/>
           <w:numId w:val="28"/>
@@ -19252,7 +19408,7 @@
     </w:p>
     <w:p>
       <w:pPr>
-        <w:pStyle w:val="BodyText"/>
+        <w:pStyle w:val="Tijeloteksta"/>
         <w:numPr>
           <w:ilvl w:val="0"/>
           <w:numId w:val="28"/>
@@ -19267,7 +19423,7 @@
     </w:p>
     <w:p>
       <w:pPr>
-        <w:pStyle w:val="BodyText"/>
+        <w:pStyle w:val="Tijeloteksta"/>
         <w:numPr>
           <w:ilvl w:val="0"/>
           <w:numId w:val="28"/>
@@ -19282,7 +19438,7 @@
     </w:p>
     <w:p>
       <w:pPr>
-        <w:pStyle w:val="BodyText"/>
+        <w:pStyle w:val="Tijeloteksta"/>
         <w:numPr>
           <w:ilvl w:val="0"/>
           <w:numId w:val="28"/>
@@ -19297,7 +19453,7 @@
     </w:p>
     <w:p>
       <w:pPr>
-        <w:pStyle w:val="BodyText"/>
+        <w:pStyle w:val="Tijeloteksta"/>
         <w:spacing w:before="189" w:line="300" w:lineRule="auto"/>
         <w:ind w:left="501" w:right="283"/>
         <w:jc w:val="both"/>
@@ -19305,7 +19461,7 @@
     </w:p>
     <w:p>
       <w:pPr>
-        <w:pStyle w:val="Heading2"/>
+        <w:pStyle w:val="Naslov2"/>
         <w:numPr>
           <w:ilvl w:val="1"/>
           <w:numId w:val="4"/>
@@ -19322,7 +19478,7 @@
     </w:p>
     <w:p>
       <w:pPr>
-        <w:pStyle w:val="BodyText"/>
+        <w:pStyle w:val="Tijeloteksta"/>
         <w:spacing w:before="189" w:line="300" w:lineRule="auto"/>
         <w:ind w:right="283" w:firstLine="141"/>
         <w:jc w:val="both"/>
@@ -19333,7 +19489,7 @@
     </w:p>
     <w:p>
       <w:pPr>
-        <w:pStyle w:val="Heading2"/>
+        <w:pStyle w:val="Naslov2"/>
         <w:numPr>
           <w:ilvl w:val="1"/>
           <w:numId w:val="4"/>
@@ -19350,7 +19506,7 @@
     </w:p>
     <w:p>
       <w:pPr>
-        <w:pStyle w:val="BodyText"/>
+        <w:pStyle w:val="Tijeloteksta"/>
         <w:spacing w:before="189" w:line="300" w:lineRule="auto"/>
         <w:ind w:left="141" w:right="283"/>
         <w:jc w:val="both"/>
@@ -19361,7 +19517,7 @@
     </w:p>
     <w:p>
       <w:pPr>
-        <w:pStyle w:val="Heading2"/>
+        <w:pStyle w:val="Naslov2"/>
         <w:numPr>
           <w:ilvl w:val="1"/>
           <w:numId w:val="4"/>
@@ -19378,7 +19534,7 @@
     </w:p>
     <w:p>
       <w:pPr>
-        <w:pStyle w:val="BodyText"/>
+        <w:pStyle w:val="Tijeloteksta"/>
         <w:numPr>
           <w:ilvl w:val="0"/>
           <w:numId w:val="29"/>
@@ -19393,7 +19549,7 @@
     </w:p>
     <w:p>
       <w:pPr>
-        <w:pStyle w:val="BodyText"/>
+        <w:pStyle w:val="Tijeloteksta"/>
         <w:numPr>
           <w:ilvl w:val="0"/>
           <w:numId w:val="29"/>
@@ -19408,7 +19564,7 @@
     </w:p>
     <w:p>
       <w:pPr>
-        <w:pStyle w:val="BodyText"/>
+        <w:pStyle w:val="Tijeloteksta"/>
         <w:numPr>
           <w:ilvl w:val="0"/>
           <w:numId w:val="29"/>
@@ -19423,7 +19579,7 @@
     </w:p>
     <w:p>
       <w:pPr>
-        <w:pStyle w:val="BodyText"/>
+        <w:pStyle w:val="Tijeloteksta"/>
         <w:numPr>
           <w:ilvl w:val="0"/>
           <w:numId w:val="29"/>
@@ -19438,7 +19594,7 @@
     </w:p>
     <w:p>
       <w:pPr>
-        <w:pStyle w:val="BodyText"/>
+        <w:pStyle w:val="Tijeloteksta"/>
         <w:numPr>
           <w:ilvl w:val="0"/>
           <w:numId w:val="29"/>
@@ -19453,7 +19609,7 @@
     </w:p>
     <w:p>
       <w:pPr>
-        <w:pStyle w:val="BodyText"/>
+        <w:pStyle w:val="Tijeloteksta"/>
         <w:numPr>
           <w:ilvl w:val="0"/>
           <w:numId w:val="29"/>
@@ -19468,7 +19624,7 @@
     </w:p>
     <w:p>
       <w:pPr>
-        <w:pStyle w:val="BodyText"/>
+        <w:pStyle w:val="Tijeloteksta"/>
         <w:spacing w:before="189" w:line="300" w:lineRule="auto"/>
         <w:ind w:right="283"/>
         <w:jc w:val="both"/>
@@ -19476,7 +19632,7 @@
     </w:p>
     <w:p>
       <w:pPr>
-        <w:pStyle w:val="BodyText"/>
+        <w:pStyle w:val="Tijeloteksta"/>
         <w:spacing w:before="189" w:line="300" w:lineRule="auto"/>
         <w:ind w:left="141" w:right="283"/>
         <w:jc w:val="both"/>
@@ -19523,7 +19679,7 @@
     </w:p>
     <w:p>
       <w:pPr>
-        <w:pStyle w:val="BodyText"/>
+        <w:pStyle w:val="Tijeloteksta"/>
         <w:spacing w:line="300" w:lineRule="auto"/>
         <w:jc w:val="both"/>
         <w:sectPr>
@@ -19660,7 +19816,7 @@
     </w:p>
     <w:p>
       <w:pPr>
-        <w:pStyle w:val="ListParagraph"/>
+        <w:pStyle w:val="Odlomakpopisa"/>
         <w:numPr>
           <w:ilvl w:val="0"/>
           <w:numId w:val="3"/>
@@ -19731,7 +19887,7 @@
     </w:p>
     <w:p>
       <w:pPr>
-        <w:pStyle w:val="ListParagraph"/>
+        <w:pStyle w:val="Odlomakpopisa"/>
         <w:numPr>
           <w:ilvl w:val="0"/>
           <w:numId w:val="3"/>
@@ -19759,7 +19915,7 @@
     </w:p>
     <w:p>
       <w:pPr>
-        <w:pStyle w:val="ListParagraph"/>
+        <w:pStyle w:val="Odlomakpopisa"/>
         <w:numPr>
           <w:ilvl w:val="0"/>
           <w:numId w:val="3"/>
@@ -20137,7 +20293,7 @@
     </w:p>
     <w:p>
       <w:pPr>
-        <w:pStyle w:val="ListParagraph"/>
+        <w:pStyle w:val="Odlomakpopisa"/>
         <w:numPr>
           <w:ilvl w:val="0"/>
           <w:numId w:val="3"/>
@@ -20385,7 +20541,7 @@
           </mc:Choice>
           <mc:Fallback>
             <w:pict>
-              <v:group w14:anchorId="2DDE5E7D" id="Group 30" o:spid="_x0000_s1026" style="position:absolute;margin-left:326.15pt;margin-top:9.2pt;width:211.95pt;height:78.7pt;z-index:251642880;mso-wrap-distance-left:0;mso-wrap-distance-right:0;mso-position-horizontal-relative:page" coordsize="26917,9994" o:gfxdata="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">
+              <v:group w14:anchorId="4B5550A4" id="Group 30" o:spid="_x0000_s1026" style="position:absolute;margin-left:326.15pt;margin-top:9.2pt;width:211.95pt;height:78.7pt;z-index:251642880;mso-wrap-distance-left:0;mso-wrap-distance-right:0;mso-position-horizontal-relative:page" coordsize="26917,9994" o:gfxdata="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">
                 <v:shape id="Image 31" o:spid="_x0000_s1027" type="#_x0000_t75" style="position:absolute;width:25985;height:9994;visibility:visible;mso-wrap-style:square" o:gfxdata="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">
                   <v:imagedata r:id="rId25" o:title=""/>
                 </v:shape>
@@ -20528,7 +20684,7 @@
     </w:p>
     <w:p>
       <w:pPr>
-        <w:pStyle w:val="ListParagraph"/>
+        <w:pStyle w:val="Odlomakpopisa"/>
         <w:numPr>
           <w:ilvl w:val="0"/>
           <w:numId w:val="3"/>
@@ -20556,7 +20712,7 @@
     </w:p>
     <w:p>
       <w:pPr>
-        <w:pStyle w:val="BodyText"/>
+        <w:pStyle w:val="Tijeloteksta"/>
         <w:spacing w:before="12"/>
         <w:rPr>
           <w:b/>
@@ -20669,7 +20825,7 @@
     </w:p>
     <w:p>
       <w:pPr>
-        <w:pStyle w:val="ListParagraph"/>
+        <w:pStyle w:val="Odlomakpopisa"/>
         <w:numPr>
           <w:ilvl w:val="0"/>
           <w:numId w:val="3"/>
@@ -21160,7 +21316,7 @@
     </w:p>
     <w:p>
       <w:pPr>
-        <w:pStyle w:val="Heading1"/>
+        <w:pStyle w:val="Naslov1"/>
         <w:numPr>
           <w:ilvl w:val="0"/>
           <w:numId w:val="4"/>
@@ -21181,7 +21337,7 @@
     </w:p>
     <w:p>
       <w:pPr>
-        <w:pStyle w:val="BodyText"/>
+        <w:pStyle w:val="Tijeloteksta"/>
         <w:spacing w:before="318" w:line="300" w:lineRule="auto"/>
         <w:ind w:left="141" w:right="281"/>
         <w:jc w:val="both"/>
@@ -21426,7 +21582,7 @@
     </w:p>
     <w:p>
       <w:pPr>
-        <w:pStyle w:val="BodyText"/>
+        <w:pStyle w:val="Tijeloteksta"/>
         <w:spacing w:line="300" w:lineRule="auto"/>
         <w:jc w:val="both"/>
         <w:sectPr>
@@ -21438,7 +21594,7 @@
     </w:p>
     <w:p>
       <w:pPr>
-        <w:pStyle w:val="Heading1"/>
+        <w:pStyle w:val="Naslov1"/>
         <w:numPr>
           <w:ilvl w:val="0"/>
           <w:numId w:val="4"/>
@@ -21890,7 +22046,7 @@
     </w:p>
     <w:p>
       <w:pPr>
-        <w:pStyle w:val="BodyText"/>
+        <w:pStyle w:val="Tijeloteksta"/>
         <w:spacing w:before="5"/>
         <w:rPr>
           <w:b/>
@@ -21900,7 +22056,7 @@
     </w:p>
     <w:p>
       <w:pPr>
-        <w:pStyle w:val="ListParagraph"/>
+        <w:pStyle w:val="Odlomakpopisa"/>
         <w:numPr>
           <w:ilvl w:val="0"/>
           <w:numId w:val="2"/>
@@ -22071,7 +22227,7 @@
     </w:p>
     <w:p>
       <w:pPr>
-        <w:pStyle w:val="ListParagraph"/>
+        <w:pStyle w:val="Odlomakpopisa"/>
         <w:numPr>
           <w:ilvl w:val="0"/>
           <w:numId w:val="2"/>
@@ -22241,7 +22397,7 @@
     </w:p>
     <w:p>
       <w:pPr>
-        <w:pStyle w:val="ListParagraph"/>
+        <w:pStyle w:val="Odlomakpopisa"/>
         <w:numPr>
           <w:ilvl w:val="0"/>
           <w:numId w:val="2"/>
@@ -22405,7 +22561,7 @@
     </w:p>
     <w:p>
       <w:pPr>
-        <w:pStyle w:val="ListParagraph"/>
+        <w:pStyle w:val="Odlomakpopisa"/>
         <w:numPr>
           <w:ilvl w:val="0"/>
           <w:numId w:val="2"/>
@@ -22606,7 +22762,7 @@
     </w:p>
     <w:p>
       <w:pPr>
-        <w:pStyle w:val="ListParagraph"/>
+        <w:pStyle w:val="Odlomakpopisa"/>
         <w:numPr>
           <w:ilvl w:val="0"/>
           <w:numId w:val="2"/>
@@ -22759,7 +22915,7 @@
     </w:p>
     <w:p>
       <w:pPr>
-        <w:pStyle w:val="ListParagraph"/>
+        <w:pStyle w:val="Odlomakpopisa"/>
         <w:numPr>
           <w:ilvl w:val="0"/>
           <w:numId w:val="2"/>
@@ -22874,7 +23030,7 @@
     </w:p>
     <w:p>
       <w:pPr>
-        <w:pStyle w:val="BodyText"/>
+        <w:pStyle w:val="Tijeloteksta"/>
         <w:spacing w:before="69"/>
         <w:ind w:left="499"/>
       </w:pPr>
@@ -22891,13 +23047,13 @@
     </w:p>
     <w:p>
       <w:pPr>
-        <w:pStyle w:val="BodyText"/>
+        <w:pStyle w:val="Tijeloteksta"/>
         <w:spacing w:before="34"/>
       </w:pPr>
     </w:p>
     <w:p>
       <w:pPr>
-        <w:pStyle w:val="ListParagraph"/>
+        <w:pStyle w:val="Odlomakpopisa"/>
         <w:numPr>
           <w:ilvl w:val="0"/>
           <w:numId w:val="2"/>
@@ -23036,7 +23192,7 @@
     </w:p>
     <w:p>
       <w:pPr>
-        <w:pStyle w:val="ListParagraph"/>
+        <w:pStyle w:val="Odlomakpopisa"/>
         <w:spacing w:line="300" w:lineRule="auto"/>
         <w:rPr>
           <w:sz w:val="24"/>
@@ -23050,7 +23206,7 @@
     </w:p>
     <w:p>
       <w:pPr>
-        <w:pStyle w:val="Heading1"/>
+        <w:pStyle w:val="Naslov1"/>
         <w:numPr>
           <w:ilvl w:val="0"/>
           <w:numId w:val="4"/>
@@ -23072,7 +23228,7 @@
     </w:p>
     <w:p>
       <w:pPr>
-        <w:pStyle w:val="BodyText"/>
+        <w:pStyle w:val="Tijeloteksta"/>
         <w:spacing w:before="118"/>
         <w:rPr>
           <w:b/>
@@ -23082,7 +23238,7 @@
     </w:p>
     <w:p>
       <w:pPr>
-        <w:pStyle w:val="Heading2"/>
+        <w:pStyle w:val="Naslov2"/>
         <w:numPr>
           <w:ilvl w:val="1"/>
           <w:numId w:val="4"/>
@@ -23112,7 +23268,7 @@
     </w:p>
     <w:p>
       <w:pPr>
-        <w:pStyle w:val="BodyText"/>
+        <w:pStyle w:val="Tijeloteksta"/>
         <w:spacing w:before="190"/>
         <w:ind w:left="141"/>
       </w:pPr>
@@ -23235,7 +23391,7 @@
     </w:p>
     <w:p>
       <w:pPr>
-        <w:pStyle w:val="BodyText"/>
+        <w:pStyle w:val="Tijeloteksta"/>
         <w:tabs>
           <w:tab w:val="left" w:leader="dot" w:pos="9085"/>
         </w:tabs>
@@ -23265,7 +23421,7 @@
     </w:p>
     <w:p>
       <w:pPr>
-        <w:pStyle w:val="Heading2"/>
+        <w:pStyle w:val="Naslov2"/>
         <w:numPr>
           <w:ilvl w:val="1"/>
           <w:numId w:val="4"/>
@@ -23290,7 +23446,7 @@
     </w:p>
     <w:p>
       <w:pPr>
-        <w:pStyle w:val="BodyText"/>
+        <w:pStyle w:val="Tijeloteksta"/>
         <w:tabs>
           <w:tab w:val="left" w:leader="dot" w:pos="9085"/>
         </w:tabs>
@@ -23352,7 +23508,7 @@
     </w:p>
     <w:p>
       <w:pPr>
-        <w:pStyle w:val="Heading2"/>
+        <w:pStyle w:val="Naslov2"/>
         <w:numPr>
           <w:ilvl w:val="1"/>
           <w:numId w:val="4"/>
@@ -23392,7 +23548,7 @@
     </w:p>
     <w:p>
       <w:pPr>
-        <w:pStyle w:val="BodyText"/>
+        <w:pStyle w:val="Tijeloteksta"/>
         <w:tabs>
           <w:tab w:val="left" w:leader="dot" w:pos="9085"/>
         </w:tabs>
@@ -23478,7 +23634,7 @@
     </w:p>
     <w:p>
       <w:pPr>
-        <w:pStyle w:val="Heading2"/>
+        <w:pStyle w:val="Naslov2"/>
         <w:numPr>
           <w:ilvl w:val="1"/>
           <w:numId w:val="4"/>
@@ -23512,7 +23668,7 @@
     </w:p>
     <w:p>
       <w:pPr>
-        <w:pStyle w:val="ListParagraph"/>
+        <w:pStyle w:val="Odlomakpopisa"/>
         <w:numPr>
           <w:ilvl w:val="2"/>
           <w:numId w:val="4"/>
@@ -23619,7 +23775,7 @@
     </w:p>
     <w:p>
       <w:pPr>
-        <w:pStyle w:val="BodyText"/>
+        <w:pStyle w:val="Tijeloteksta"/>
         <w:spacing w:before="8"/>
         <w:rPr>
           <w:sz w:val="14"/>
@@ -24693,7 +24849,7 @@
                           </w:p>
                           <w:p>
                             <w:pPr>
-                              <w:pStyle w:val="BodyText"/>
+                              <w:pStyle w:val="Tijeloteksta"/>
                               <w:rPr>
                                 <w:rFonts w:ascii="Consolas"/>
                                 <w:color w:val="000000"/>
@@ -26809,7 +26965,7 @@
                     </w:p>
                     <w:p>
                       <w:pPr>
-                        <w:pStyle w:val="BodyText"/>
+                        <w:pStyle w:val="Tijeloteksta"/>
                         <w:rPr>
                           <w:rFonts w:ascii="Consolas"/>
                           <w:color w:val="000000"/>
@@ -27895,7 +28051,7 @@
     </w:p>
     <w:p>
       <w:pPr>
-        <w:pStyle w:val="BodyText"/>
+        <w:pStyle w:val="Tijeloteksta"/>
         <w:rPr>
           <w:sz w:val="14"/>
         </w:rPr>
@@ -28333,7 +28489,7 @@
                           </w:p>
                           <w:p>
                             <w:pPr>
-                              <w:pStyle w:val="BodyText"/>
+                              <w:pStyle w:val="Tijeloteksta"/>
                               <w:spacing w:before="1"/>
                               <w:rPr>
                                 <w:rFonts w:ascii="Consolas"/>
@@ -28487,7 +28643,7 @@
                           </w:p>
                           <w:p>
                             <w:pPr>
-                              <w:pStyle w:val="BodyText"/>
+                              <w:pStyle w:val="Tijeloteksta"/>
                               <w:spacing w:before="3"/>
                               <w:rPr>
                                 <w:rFonts w:ascii="Consolas"/>
@@ -28865,7 +29021,7 @@
                           </w:p>
                           <w:p>
                             <w:pPr>
-                              <w:pStyle w:val="BodyText"/>
+                              <w:pStyle w:val="Tijeloteksta"/>
                               <w:rPr>
                                 <w:rFonts w:ascii="Consolas"/>
                                 <w:color w:val="000000"/>
@@ -29696,7 +29852,7 @@
                     </w:p>
                     <w:p>
                       <w:pPr>
-                        <w:pStyle w:val="BodyText"/>
+                        <w:pStyle w:val="Tijeloteksta"/>
                         <w:spacing w:before="1"/>
                         <w:rPr>
                           <w:rFonts w:ascii="Consolas"/>
@@ -29850,7 +30006,7 @@
                     </w:p>
                     <w:p>
                       <w:pPr>
-                        <w:pStyle w:val="BodyText"/>
+                        <w:pStyle w:val="Tijeloteksta"/>
                         <w:spacing w:before="3"/>
                         <w:rPr>
                           <w:rFonts w:ascii="Consolas"/>
@@ -30228,7 +30384,7 @@
                     </w:p>
                     <w:p>
                       <w:pPr>
-                        <w:pStyle w:val="BodyText"/>
+                        <w:pStyle w:val="Tijeloteksta"/>
                         <w:rPr>
                           <w:rFonts w:ascii="Consolas"/>
                           <w:color w:val="000000"/>
@@ -30670,7 +30826,7 @@
     </w:p>
     <w:p>
       <w:pPr>
-        <w:pStyle w:val="ListParagraph"/>
+        <w:pStyle w:val="Odlomakpopisa"/>
         <w:numPr>
           <w:ilvl w:val="2"/>
           <w:numId w:val="1"/>
@@ -30783,7 +30939,7 @@
     </w:p>
     <w:p>
       <w:pPr>
-        <w:pStyle w:val="BodyText"/>
+        <w:pStyle w:val="Tijeloteksta"/>
         <w:spacing w:before="5"/>
         <w:rPr>
           <w:sz w:val="14"/>
@@ -31434,7 +31590,7 @@
                           </w:p>
                           <w:p>
                             <w:pPr>
-                              <w:pStyle w:val="BodyText"/>
+                              <w:pStyle w:val="Tijeloteksta"/>
                               <w:spacing w:before="1"/>
                               <w:rPr>
                                 <w:rFonts w:ascii="Consolas"/>
@@ -31753,7 +31909,7 @@
                           </w:p>
                           <w:p>
                             <w:pPr>
-                              <w:pStyle w:val="BodyText"/>
+                              <w:pStyle w:val="Tijeloteksta"/>
                               <w:rPr>
                                 <w:rFonts w:ascii="Consolas"/>
                                 <w:color w:val="000000"/>
@@ -32967,7 +33123,7 @@
                     </w:p>
                     <w:p>
                       <w:pPr>
-                        <w:pStyle w:val="BodyText"/>
+                        <w:pStyle w:val="Tijeloteksta"/>
                         <w:spacing w:before="1"/>
                         <w:rPr>
                           <w:rFonts w:ascii="Consolas"/>
@@ -33286,7 +33442,7 @@
                     </w:p>
                     <w:p>
                       <w:pPr>
-                        <w:pStyle w:val="BodyText"/>
+                        <w:pStyle w:val="Tijeloteksta"/>
                         <w:rPr>
                           <w:rFonts w:ascii="Consolas"/>
                           <w:color w:val="000000"/>
@@ -33893,7 +34049,7 @@
     </w:p>
     <w:p>
       <w:pPr>
-        <w:pStyle w:val="BodyText"/>
+        <w:pStyle w:val="Tijeloteksta"/>
         <w:rPr>
           <w:sz w:val="14"/>
         </w:rPr>
@@ -34186,7 +34342,7 @@
                           </w:p>
                           <w:p>
                             <w:pPr>
-                              <w:pStyle w:val="BodyText"/>
+                              <w:pStyle w:val="Tijeloteksta"/>
                               <w:rPr>
                                 <w:rFonts w:ascii="Consolas"/>
                                 <w:color w:val="000000"/>
@@ -34196,7 +34352,7 @@
                           </w:p>
                           <w:p>
                             <w:pPr>
-                              <w:pStyle w:val="BodyText"/>
+                              <w:pStyle w:val="Tijeloteksta"/>
                               <w:rPr>
                                 <w:rFonts w:ascii="Consolas"/>
                                 <w:color w:val="000000"/>
@@ -34290,7 +34446,7 @@
                           </w:p>
                           <w:p>
                             <w:pPr>
-                              <w:pStyle w:val="BodyText"/>
+                              <w:pStyle w:val="Tijeloteksta"/>
                               <w:spacing w:before="2"/>
                               <w:rPr>
                                 <w:rFonts w:ascii="Consolas"/>
@@ -34733,7 +34889,7 @@
                           </w:p>
                           <w:p>
                             <w:pPr>
-                              <w:pStyle w:val="BodyText"/>
+                              <w:pStyle w:val="Tijeloteksta"/>
                               <w:spacing w:before="233"/>
                               <w:rPr>
                                 <w:rFonts w:ascii="Consolas"/>
@@ -35323,7 +35479,7 @@
                     </w:p>
                     <w:p>
                       <w:pPr>
-                        <w:pStyle w:val="BodyText"/>
+                        <w:pStyle w:val="Tijeloteksta"/>
                         <w:rPr>
                           <w:rFonts w:ascii="Consolas"/>
                           <w:color w:val="000000"/>
@@ -35333,7 +35489,7 @@
                     </w:p>
                     <w:p>
                       <w:pPr>
-                        <w:pStyle w:val="BodyText"/>
+                        <w:pStyle w:val="Tijeloteksta"/>
                         <w:rPr>
                           <w:rFonts w:ascii="Consolas"/>
                           <w:color w:val="000000"/>
@@ -35427,7 +35583,7 @@
                     </w:p>
                     <w:p>
                       <w:pPr>
-                        <w:pStyle w:val="BodyText"/>
+                        <w:pStyle w:val="Tijeloteksta"/>
                         <w:spacing w:before="2"/>
                         <w:rPr>
                           <w:rFonts w:ascii="Consolas"/>
@@ -35870,7 +36026,7 @@
                     </w:p>
                     <w:p>
                       <w:pPr>
-                        <w:pStyle w:val="BodyText"/>
+                        <w:pStyle w:val="Tijeloteksta"/>
                         <w:spacing w:before="233"/>
                         <w:rPr>
                           <w:rFonts w:ascii="Consolas"/>
@@ -36534,7 +36690,7 @@
           </mc:Choice>
           <mc:Fallback>
             <w:pict>
-              <v:group w14:anchorId="6D5B82EC" id="Group 39" o:spid="_x0000_s1026" style="position:absolute;margin-left:252.9pt;margin-top:217.5pt;width:301.9pt;height:273.35pt;z-index:15736320;mso-wrap-distance-left:0;mso-wrap-distance-right:0;mso-position-horizontal-relative:page;mso-position-vertical-relative:page" coordsize="38341,34715" o:gfxdata="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">
+              <v:group w14:anchorId="407C146D" id="Group 39" o:spid="_x0000_s1026" style="position:absolute;margin-left:252.9pt;margin-top:217.5pt;width:301.9pt;height:273.35pt;z-index:15736320;mso-wrap-distance-left:0;mso-wrap-distance-right:0;mso-position-horizontal-relative:page;mso-position-vertical-relative:page" coordsize="38341,34715" o:gfxdata="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">
                 <v:shape id="Image 40" o:spid="_x0000_s1027" type="#_x0000_t75" style="position:absolute;top:127;width:38341;height:34588;visibility:visible;mso-wrap-style:square" o:gfxdata="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">
                   <v:imagedata r:id="rId39" o:title=""/>
                 </v:shape>
@@ -37183,16 +37339,16 @@
     </w:p>
     <w:p>
       <w:pPr>
-        <w:pStyle w:val="BodyText"/>
-        <w:rPr>
-          <w:b/>
-          <w:i/>
-        </w:rPr>
-      </w:pPr>
-    </w:p>
-    <w:p>
-      <w:pPr>
-        <w:pStyle w:val="BodyText"/>
+        <w:pStyle w:val="Tijeloteksta"/>
+        <w:rPr>
+          <w:b/>
+          <w:i/>
+        </w:rPr>
+      </w:pPr>
+    </w:p>
+    <w:p>
+      <w:pPr>
+        <w:pStyle w:val="Tijeloteksta"/>
         <w:spacing w:before="101"/>
         <w:rPr>
           <w:b/>
@@ -37399,160 +37555,160 @@
     </w:p>
     <w:p>
       <w:pPr>
-        <w:pStyle w:val="BodyText"/>
-        <w:rPr>
-          <w:b/>
-          <w:i/>
-        </w:rPr>
-      </w:pPr>
-    </w:p>
-    <w:p>
-      <w:pPr>
-        <w:pStyle w:val="BodyText"/>
-        <w:rPr>
-          <w:b/>
-          <w:i/>
-        </w:rPr>
-      </w:pPr>
-    </w:p>
-    <w:p>
-      <w:pPr>
-        <w:pStyle w:val="BodyText"/>
-        <w:rPr>
-          <w:b/>
-          <w:i/>
-        </w:rPr>
-      </w:pPr>
-    </w:p>
-    <w:p>
-      <w:pPr>
-        <w:pStyle w:val="BodyText"/>
-        <w:rPr>
-          <w:b/>
-          <w:i/>
-        </w:rPr>
-      </w:pPr>
-    </w:p>
-    <w:p>
-      <w:pPr>
-        <w:pStyle w:val="BodyText"/>
-        <w:rPr>
-          <w:b/>
-          <w:i/>
-        </w:rPr>
-      </w:pPr>
-    </w:p>
-    <w:p>
-      <w:pPr>
-        <w:pStyle w:val="BodyText"/>
-        <w:rPr>
-          <w:b/>
-          <w:i/>
-        </w:rPr>
-      </w:pPr>
-    </w:p>
-    <w:p>
-      <w:pPr>
-        <w:pStyle w:val="BodyText"/>
-        <w:rPr>
-          <w:b/>
-          <w:i/>
-        </w:rPr>
-      </w:pPr>
-    </w:p>
-    <w:p>
-      <w:pPr>
-        <w:pStyle w:val="BodyText"/>
-        <w:rPr>
-          <w:b/>
-          <w:i/>
-        </w:rPr>
-      </w:pPr>
-    </w:p>
-    <w:p>
-      <w:pPr>
-        <w:pStyle w:val="BodyText"/>
-        <w:rPr>
-          <w:b/>
-          <w:i/>
-        </w:rPr>
-      </w:pPr>
-    </w:p>
-    <w:p>
-      <w:pPr>
-        <w:pStyle w:val="BodyText"/>
-        <w:rPr>
-          <w:b/>
-          <w:i/>
-        </w:rPr>
-      </w:pPr>
-    </w:p>
-    <w:p>
-      <w:pPr>
-        <w:pStyle w:val="BodyText"/>
-        <w:rPr>
-          <w:b/>
-          <w:i/>
-        </w:rPr>
-      </w:pPr>
-    </w:p>
-    <w:p>
-      <w:pPr>
-        <w:pStyle w:val="BodyText"/>
-        <w:rPr>
-          <w:b/>
-          <w:i/>
-        </w:rPr>
-      </w:pPr>
-    </w:p>
-    <w:p>
-      <w:pPr>
-        <w:pStyle w:val="BodyText"/>
-        <w:rPr>
-          <w:b/>
-          <w:i/>
-        </w:rPr>
-      </w:pPr>
-    </w:p>
-    <w:p>
-      <w:pPr>
-        <w:pStyle w:val="BodyText"/>
-        <w:rPr>
-          <w:b/>
-          <w:i/>
-        </w:rPr>
-      </w:pPr>
-    </w:p>
-    <w:p>
-      <w:pPr>
-        <w:pStyle w:val="BodyText"/>
-        <w:rPr>
-          <w:b/>
-          <w:i/>
-        </w:rPr>
-      </w:pPr>
-    </w:p>
-    <w:p>
-      <w:pPr>
-        <w:pStyle w:val="BodyText"/>
-        <w:rPr>
-          <w:b/>
-          <w:i/>
-        </w:rPr>
-      </w:pPr>
-    </w:p>
-    <w:p>
-      <w:pPr>
-        <w:pStyle w:val="BodyText"/>
-        <w:rPr>
-          <w:b/>
-          <w:i/>
-        </w:rPr>
-      </w:pPr>
-    </w:p>
-    <w:p>
-      <w:pPr>
-        <w:pStyle w:val="BodyText"/>
+        <w:pStyle w:val="Tijeloteksta"/>
+        <w:rPr>
+          <w:b/>
+          <w:i/>
+        </w:rPr>
+      </w:pPr>
+    </w:p>
+    <w:p>
+      <w:pPr>
+        <w:pStyle w:val="Tijeloteksta"/>
+        <w:rPr>
+          <w:b/>
+          <w:i/>
+        </w:rPr>
+      </w:pPr>
+    </w:p>
+    <w:p>
+      <w:pPr>
+        <w:pStyle w:val="Tijeloteksta"/>
+        <w:rPr>
+          <w:b/>
+          <w:i/>
+        </w:rPr>
+      </w:pPr>
+    </w:p>
+    <w:p>
+      <w:pPr>
+        <w:pStyle w:val="Tijeloteksta"/>
+        <w:rPr>
+          <w:b/>
+          <w:i/>
+        </w:rPr>
+      </w:pPr>
+    </w:p>
+    <w:p>
+      <w:pPr>
+        <w:pStyle w:val="Tijeloteksta"/>
+        <w:rPr>
+          <w:b/>
+          <w:i/>
+        </w:rPr>
+      </w:pPr>
+    </w:p>
+    <w:p>
+      <w:pPr>
+        <w:pStyle w:val="Tijeloteksta"/>
+        <w:rPr>
+          <w:b/>
+          <w:i/>
+        </w:rPr>
+      </w:pPr>
+    </w:p>
+    <w:p>
+      <w:pPr>
+        <w:pStyle w:val="Tijeloteksta"/>
+        <w:rPr>
+          <w:b/>
+          <w:i/>
+        </w:rPr>
+      </w:pPr>
+    </w:p>
+    <w:p>
+      <w:pPr>
+        <w:pStyle w:val="Tijeloteksta"/>
+        <w:rPr>
+          <w:b/>
+          <w:i/>
+        </w:rPr>
+      </w:pPr>
+    </w:p>
+    <w:p>
+      <w:pPr>
+        <w:pStyle w:val="Tijeloteksta"/>
+        <w:rPr>
+          <w:b/>
+          <w:i/>
+        </w:rPr>
+      </w:pPr>
+    </w:p>
+    <w:p>
+      <w:pPr>
+        <w:pStyle w:val="Tijeloteksta"/>
+        <w:rPr>
+          <w:b/>
+          <w:i/>
+        </w:rPr>
+      </w:pPr>
+    </w:p>
+    <w:p>
+      <w:pPr>
+        <w:pStyle w:val="Tijeloteksta"/>
+        <w:rPr>
+          <w:b/>
+          <w:i/>
+        </w:rPr>
+      </w:pPr>
+    </w:p>
+    <w:p>
+      <w:pPr>
+        <w:pStyle w:val="Tijeloteksta"/>
+        <w:rPr>
+          <w:b/>
+          <w:i/>
+        </w:rPr>
+      </w:pPr>
+    </w:p>
+    <w:p>
+      <w:pPr>
+        <w:pStyle w:val="Tijeloteksta"/>
+        <w:rPr>
+          <w:b/>
+          <w:i/>
+        </w:rPr>
+      </w:pPr>
+    </w:p>
+    <w:p>
+      <w:pPr>
+        <w:pStyle w:val="Tijeloteksta"/>
+        <w:rPr>
+          <w:b/>
+          <w:i/>
+        </w:rPr>
+      </w:pPr>
+    </w:p>
+    <w:p>
+      <w:pPr>
+        <w:pStyle w:val="Tijeloteksta"/>
+        <w:rPr>
+          <w:b/>
+          <w:i/>
+        </w:rPr>
+      </w:pPr>
+    </w:p>
+    <w:p>
+      <w:pPr>
+        <w:pStyle w:val="Tijeloteksta"/>
+        <w:rPr>
+          <w:b/>
+          <w:i/>
+        </w:rPr>
+      </w:pPr>
+    </w:p>
+    <w:p>
+      <w:pPr>
+        <w:pStyle w:val="Tijeloteksta"/>
+        <w:rPr>
+          <w:b/>
+          <w:i/>
+        </w:rPr>
+      </w:pPr>
+    </w:p>
+    <w:p>
+      <w:pPr>
+        <w:pStyle w:val="Tijeloteksta"/>
         <w:spacing w:before="267"/>
         <w:rPr>
           <w:b/>
@@ -37582,7 +37738,7 @@
     </w:p>
     <w:p>
       <w:pPr>
-        <w:pStyle w:val="BodyText"/>
+        <w:pStyle w:val="Tijeloteksta"/>
         <w:spacing w:before="4"/>
         <w:rPr>
           <w:b/>
@@ -37755,7 +37911,7 @@
           </mc:Choice>
           <mc:Fallback>
             <w:pict>
-              <v:group w14:anchorId="03599806" id="Group 42" o:spid="_x0000_s1026" style="position:absolute;margin-left:72.05pt;margin-top:6pt;width:447pt;height:114.9pt;z-index:-15721472;mso-wrap-distance-left:0;mso-wrap-distance-right:0;mso-position-horizontal-relative:page" coordsize="56769,14592" o:gfxdata="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">
+              <v:group w14:anchorId="114C126F" id="Group 42" o:spid="_x0000_s1026" style="position:absolute;margin-left:72.05pt;margin-top:6pt;width:447pt;height:114.9pt;z-index:-15721472;mso-wrap-distance-left:0;mso-wrap-distance-right:0;mso-position-horizontal-relative:page" coordsize="56769,14592" o:gfxdata="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">
                 <v:shape id="Image 43" o:spid="_x0000_s1027" type="#_x0000_t75" style="position:absolute;width:56766;height:14587;visibility:visible;mso-wrap-style:square" o:gfxdata="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">
                   <v:imagedata r:id="rId41" o:title=""/>
                 </v:shape>
@@ -37771,7 +37927,7 @@
     </w:p>
     <w:p>
       <w:pPr>
-        <w:pStyle w:val="BodyText"/>
+        <w:pStyle w:val="Tijeloteksta"/>
         <w:rPr>
           <w:b/>
           <w:i/>
@@ -37996,7 +38152,7 @@
     </w:p>
     <w:p>
       <w:pPr>
-        <w:pStyle w:val="BodyText"/>
+        <w:pStyle w:val="Tijeloteksta"/>
         <w:rPr>
           <w:b/>
           <w:i/>
@@ -38006,7 +38162,7 @@
     </w:p>
     <w:p>
       <w:pPr>
-        <w:pStyle w:val="BodyText"/>
+        <w:pStyle w:val="Tijeloteksta"/>
         <w:rPr>
           <w:b/>
           <w:i/>
@@ -38016,7 +38172,7 @@
     </w:p>
     <w:p>
       <w:pPr>
-        <w:pStyle w:val="BodyText"/>
+        <w:pStyle w:val="Tijeloteksta"/>
         <w:rPr>
           <w:b/>
           <w:i/>
@@ -38026,7 +38182,7 @@
     </w:p>
     <w:p>
       <w:pPr>
-        <w:pStyle w:val="BodyText"/>
+        <w:pStyle w:val="Tijeloteksta"/>
         <w:rPr>
           <w:b/>
           <w:i/>
@@ -38036,7 +38192,7 @@
     </w:p>
     <w:p>
       <w:pPr>
-        <w:pStyle w:val="BodyText"/>
+        <w:pStyle w:val="Tijeloteksta"/>
         <w:rPr>
           <w:b/>
           <w:i/>
@@ -38046,7 +38202,7 @@
     </w:p>
     <w:p>
       <w:pPr>
-        <w:pStyle w:val="BodyText"/>
+        <w:pStyle w:val="Tijeloteksta"/>
         <w:rPr>
           <w:b/>
           <w:i/>
@@ -38056,7 +38212,7 @@
     </w:p>
     <w:p>
       <w:pPr>
-        <w:pStyle w:val="BodyText"/>
+        <w:pStyle w:val="Tijeloteksta"/>
         <w:rPr>
           <w:b/>
           <w:i/>
@@ -38066,7 +38222,7 @@
     </w:p>
     <w:p>
       <w:pPr>
-        <w:pStyle w:val="BodyText"/>
+        <w:pStyle w:val="Tijeloteksta"/>
         <w:spacing w:before="32"/>
         <w:rPr>
           <w:b/>
@@ -38077,7 +38233,7 @@
     </w:p>
     <w:p>
       <w:pPr>
-        <w:pStyle w:val="Heading1"/>
+        <w:pStyle w:val="Naslov1"/>
         <w:spacing w:before="0"/>
         <w:ind w:left="5" w:right="144" w:firstLine="0"/>
         <w:jc w:val="center"/>
@@ -38091,7 +38247,7 @@
     </w:p>
     <w:p>
       <w:pPr>
-        <w:pStyle w:val="BodyText"/>
+        <w:pStyle w:val="Tijeloteksta"/>
         <w:rPr>
           <w:b/>
           <w:sz w:val="28"/>
@@ -38100,7 +38256,7 @@
     </w:p>
     <w:p>
       <w:pPr>
-        <w:pStyle w:val="BodyText"/>
+        <w:pStyle w:val="Tijeloteksta"/>
         <w:rPr>
           <w:b/>
           <w:sz w:val="28"/>
@@ -38109,7 +38265,7 @@
     </w:p>
     <w:p>
       <w:pPr>
-        <w:pStyle w:val="BodyText"/>
+        <w:pStyle w:val="Tijeloteksta"/>
         <w:rPr>
           <w:b/>
           <w:sz w:val="28"/>
@@ -38118,7 +38274,7 @@
     </w:p>
     <w:p>
       <w:pPr>
-        <w:pStyle w:val="BodyText"/>
+        <w:pStyle w:val="Tijeloteksta"/>
         <w:rPr>
           <w:b/>
           <w:sz w:val="28"/>
@@ -38127,7 +38283,7 @@
     </w:p>
     <w:p>
       <w:pPr>
-        <w:pStyle w:val="BodyText"/>
+        <w:pStyle w:val="Tijeloteksta"/>
         <w:rPr>
           <w:b/>
           <w:sz w:val="28"/>
@@ -38136,7 +38292,7 @@
     </w:p>
     <w:p>
       <w:pPr>
-        <w:pStyle w:val="BodyText"/>
+        <w:pStyle w:val="Tijeloteksta"/>
         <w:rPr>
           <w:b/>
           <w:sz w:val="28"/>
@@ -38145,7 +38301,7 @@
     </w:p>
     <w:p>
       <w:pPr>
-        <w:pStyle w:val="BodyText"/>
+        <w:pStyle w:val="Tijeloteksta"/>
         <w:spacing w:before="37"/>
         <w:rPr>
           <w:b/>
@@ -38155,7 +38311,7 @@
     </w:p>
     <w:p>
       <w:pPr>
-        <w:pStyle w:val="BodyText"/>
+        <w:pStyle w:val="Tijeloteksta"/>
         <w:spacing w:line="300" w:lineRule="auto"/>
         <w:ind w:left="141" w:right="279"/>
         <w:jc w:val="both"/>
@@ -38296,43 +38452,43 @@
     </w:p>
     <w:p>
       <w:pPr>
-        <w:pStyle w:val="BodyText"/>
-      </w:pPr>
-    </w:p>
-    <w:p>
-      <w:pPr>
-        <w:pStyle w:val="BodyText"/>
-      </w:pPr>
-    </w:p>
-    <w:p>
-      <w:pPr>
-        <w:pStyle w:val="BodyText"/>
-      </w:pPr>
-    </w:p>
-    <w:p>
-      <w:pPr>
-        <w:pStyle w:val="BodyText"/>
-      </w:pPr>
-    </w:p>
-    <w:p>
-      <w:pPr>
-        <w:pStyle w:val="BodyText"/>
-      </w:pPr>
-    </w:p>
-    <w:p>
-      <w:pPr>
-        <w:pStyle w:val="BodyText"/>
-      </w:pPr>
-    </w:p>
-    <w:p>
-      <w:pPr>
-        <w:pStyle w:val="BodyText"/>
+        <w:pStyle w:val="Tijeloteksta"/>
+      </w:pPr>
+    </w:p>
+    <w:p>
+      <w:pPr>
+        <w:pStyle w:val="Tijeloteksta"/>
+      </w:pPr>
+    </w:p>
+    <w:p>
+      <w:pPr>
+        <w:pStyle w:val="Tijeloteksta"/>
+      </w:pPr>
+    </w:p>
+    <w:p>
+      <w:pPr>
+        <w:pStyle w:val="Tijeloteksta"/>
+      </w:pPr>
+    </w:p>
+    <w:p>
+      <w:pPr>
+        <w:pStyle w:val="Tijeloteksta"/>
+      </w:pPr>
+    </w:p>
+    <w:p>
+      <w:pPr>
+        <w:pStyle w:val="Tijeloteksta"/>
+      </w:pPr>
+    </w:p>
+    <w:p>
+      <w:pPr>
+        <w:pStyle w:val="Tijeloteksta"/>
         <w:spacing w:before="49"/>
       </w:pPr>
     </w:p>
     <w:p>
       <w:pPr>
-        <w:pStyle w:val="BodyText"/>
+        <w:pStyle w:val="Tijeloteksta"/>
         <w:ind w:right="284"/>
         <w:jc w:val="right"/>
       </w:pPr>
@@ -38366,7 +38522,7 @@
     </w:p>
     <w:p>
       <w:pPr>
-        <w:pStyle w:val="BodyText"/>
+        <w:pStyle w:val="Tijeloteksta"/>
         <w:jc w:val="right"/>
         <w:sectPr>
           <w:footerReference w:type="default" r:id="rId43"/>
@@ -38468,7 +38624,7 @@
           </mc:Choice>
           <mc:Fallback>
             <w:pict>
-              <v:shape w14:anchorId="4544EE89" id="Graphic 46" o:spid="_x0000_s1026" style="position:absolute;margin-left:70.8pt;margin-top:16.4pt;width:57.25pt;height:1.2pt;z-index:15737344;visibility:visible;mso-wrap-style:square;mso-wrap-distance-left:0;mso-wrap-distance-top:0;mso-wrap-distance-right:0;mso-wrap-distance-bottom:0;mso-position-horizontal:absolute;mso-position-horizontal-relative:page;mso-position-vertical:absolute;mso-position-vertical-relative:text;v-text-anchor:top" coordsize="727075,15240" o:gfxdata="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" path="m726947,l,,,15240r726947,l726947,xe" fillcolor="black" stroked="f">
+              <v:shape w14:anchorId="36E8A040" id="Graphic 46" o:spid="_x0000_s1026" style="position:absolute;margin-left:70.8pt;margin-top:16.4pt;width:57.25pt;height:1.2pt;z-index:15737344;visibility:visible;mso-wrap-style:square;mso-wrap-distance-left:0;mso-wrap-distance-top:0;mso-wrap-distance-right:0;mso-wrap-distance-bottom:0;mso-position-horizontal:absolute;mso-position-horizontal-relative:page;mso-position-vertical:absolute;mso-position-vertical-relative:text;v-text-anchor:top" coordsize="727075,15240" o:gfxdata="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" path="m726947,l,,,15240r726947,l726947,xe" fillcolor="black" stroked="f">
                 <v:path arrowok="t"/>
                 <w10:wrap anchorx="page"/>
               </v:shape>
@@ -38838,7 +38994,7 @@
           </mc:Choice>
           <mc:Fallback>
             <w:pict>
-              <v:shape w14:anchorId="53D41521" id="Graphic 47" o:spid="_x0000_s1026" style="position:absolute;margin-left:127.1pt;margin-top:24.65pt;width:96.4pt;height:1.2pt;z-index:15737856;visibility:visible;mso-wrap-style:square;mso-wrap-distance-left:0;mso-wrap-distance-top:0;mso-wrap-distance-right:0;mso-wrap-distance-bottom:0;mso-position-horizontal:absolute;mso-position-horizontal-relative:page;mso-position-vertical:absolute;mso-position-vertical-relative:text;v-text-anchor:top" coordsize="1224280,15240" o:gfxdata="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" path="m1224076,l,,,15240r1224076,l1224076,xe" fillcolor="black" stroked="f">
+              <v:shape w14:anchorId="43DFFA2D" id="Graphic 47" o:spid="_x0000_s1026" style="position:absolute;margin-left:127.1pt;margin-top:24.65pt;width:96.4pt;height:1.2pt;z-index:15737856;visibility:visible;mso-wrap-style:square;mso-wrap-distance-left:0;mso-wrap-distance-top:0;mso-wrap-distance-right:0;mso-wrap-distance-bottom:0;mso-position-horizontal:absolute;mso-position-horizontal-relative:page;mso-position-vertical:absolute;mso-position-vertical-relative:text;v-text-anchor:top" coordsize="1224280,15240" o:gfxdata="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" path="m1224076,l,,,15240r1224076,l1224076,xe" fillcolor="black" stroked="f">
                 <v:path arrowok="t"/>
                 <w10:wrap anchorx="page"/>
               </v:shape>
@@ -39462,7 +39618,7 @@
 </file>
 
 <file path=word/endnotes.xml><?xml version="1.0" encoding="utf-8"?>
-<w:endnotes xmlns:wpc="http://schemas.microsoft.com/office/word/2010/wordprocessingCanvas" xmlns:cx="http://schemas.microsoft.com/office/drawing/2014/chartex" xmlns:cx1="http://schemas.microsoft.com/office/drawing/2015/9/8/chartex" xmlns:cx2="http://schemas.microsoft.com/office/drawing/2015/10/21/chartex" xmlns:cx3="http://schemas.microsoft.com/office/drawing/2016/5/9/chartex" xmlns:cx4="http://schemas.microsoft.com/office/drawing/2016/5/10/chartex" xmlns:cx5="http://schemas.microsoft.com/office/drawing/2016/5/11/chartex" xmlns:cx6="http://schemas.microsoft.com/office/drawing/2016/5/12/chartex" xmlns:cx7="http://schemas.microsoft.com/office/drawing/2016/5/13/chartex" xmlns:cx8="http://schemas.microsoft.com/office/drawing/2016/5/14/chartex" xmlns:mc="http://schemas.openxmlformats.org/markup-compatibility/2006" xmlns:aink="http://schemas.microsoft.com/office/drawing/2016/ink" xmlns:am3d="http://schemas.microsoft.com/office/drawing/2017/model3d" xmlns:o="urn:schemas-microsoft-com:office:office" xmlns:oel="http://schemas.microsoft.com/office/2019/extlst" xmlns:r="http://schemas.openxmlformats.org/officeDocument/2006/relationships" xmlns:m="http://schemas.openxmlformats.org/officeDocument/2006/math" xmlns:v="urn:schemas-microsoft-com:vml" xmlns:wp14="http://schemas.microsoft.com/office/word/2010/wordprocessingDrawing" xmlns:wp="http://schemas.openxmlformats.org/drawingml/2006/wordprocessingDrawing" xmlns:w10="urn:schemas-microsoft-com:office:word" xmlns:w="http://schemas.openxmlformats.org/wordprocessingml/2006/main" xmlns:w14="http://schemas.microsoft.com/office/word/2010/wordml" xmlns:w15="http://schemas.microsoft.com/office/word/2012/wordml" xmlns:w16cei="http://schemas.microsoft.com/office/word/2026/wordml/cei" xmlns:w16cex="http://schemas.microsoft.com/office/word/2018/wordml/cex" xmlns:w16cid="http://schemas.microsoft.com/office/word/2016/wordml/cid" xmlns:w16="http://schemas.microsoft.com/office/word/2018/wordml" xmlns:w16du="http://schemas.microsoft.com/office/word/2023/wordml/word16du" xmlns:w16sdtdh="http://schemas.microsoft.com/office/word/2020/wordml/sdtdatahash" xmlns:w16sdtfl="http://schemas.microsoft.com/office/word/2024/wordml/sdtformatlock" xmlns:w16se="http://schemas.microsoft.com/office/word/2015/wordml/symex" xmlns:wpg="http://schemas.microsoft.com/office/word/2010/wordprocessingGroup" xmlns:wpi="http://schemas.microsoft.com/office/word/2010/wordprocessingInk" xmlns:wne="http://schemas.microsoft.com/office/word/2006/wordml" xmlns:wps="http://schemas.microsoft.com/office/word/2010/wordprocessingShape" mc:Ignorable="w14 w15 w16se w16cid w16 w16cex w16sdtdh w16sdtfl w16du wp14">
+<w:endnotes xmlns:wpc="http://schemas.microsoft.com/office/word/2010/wordprocessingCanvas" xmlns:cx="http://schemas.microsoft.com/office/drawing/2014/chartex" xmlns:cx1="http://schemas.microsoft.com/office/drawing/2015/9/8/chartex" xmlns:cx2="http://schemas.microsoft.com/office/drawing/2015/10/21/chartex" xmlns:cx3="http://schemas.microsoft.com/office/drawing/2016/5/9/chartex" xmlns:cx4="http://schemas.microsoft.com/office/drawing/2016/5/10/chartex" xmlns:cx5="http://schemas.microsoft.com/office/drawing/2016/5/11/chartex" xmlns:cx6="http://schemas.microsoft.com/office/drawing/2016/5/12/chartex" xmlns:cx7="http://schemas.microsoft.com/office/drawing/2016/5/13/chartex" xmlns:cx8="http://schemas.microsoft.com/office/drawing/2016/5/14/chartex" xmlns:mc="http://schemas.openxmlformats.org/markup-compatibility/2006" xmlns:aink="http://schemas.microsoft.com/office/drawing/2016/ink" xmlns:am3d="http://schemas.microsoft.com/office/drawing/2017/model3d" xmlns:o="urn:schemas-microsoft-com:office:office" xmlns:oel="http://schemas.microsoft.com/office/2019/extlst" xmlns:r="http://schemas.openxmlformats.org/officeDocument/2006/relationships" xmlns:m="http://schemas.openxmlformats.org/officeDocument/2006/math" xmlns:v="urn:schemas-microsoft-com:vml" xmlns:wp14="http://schemas.microsoft.com/office/word/2010/wordprocessingDrawing" xmlns:wp="http://schemas.openxmlformats.org/drawingml/2006/wordprocessingDrawing" xmlns:w10="urn:schemas-microsoft-com:office:word" xmlns:w="http://schemas.openxmlformats.org/wordprocessingml/2006/main" xmlns:w14="http://schemas.microsoft.com/office/word/2010/wordml" xmlns:w15="http://schemas.microsoft.com/office/word/2012/wordml" xmlns:w16cex="http://schemas.microsoft.com/office/word/2018/wordml/cex" xmlns:w16cid="http://schemas.microsoft.com/office/word/2016/wordml/cid" xmlns:w16="http://schemas.microsoft.com/office/word/2018/wordml" xmlns:w16du="http://schemas.microsoft.com/office/word/2023/wordml/word16du" xmlns:w16sdtdh="http://schemas.microsoft.com/office/word/2020/wordml/sdtdatahash" xmlns:w16sdtfl="http://schemas.microsoft.com/office/word/2024/wordml/sdtformatlock" xmlns:w16se="http://schemas.microsoft.com/office/word/2015/wordml/symex" xmlns:wpg="http://schemas.microsoft.com/office/word/2010/wordprocessingGroup" xmlns:wpi="http://schemas.microsoft.com/office/word/2010/wordprocessingInk" xmlns:wne="http://schemas.microsoft.com/office/word/2006/wordml" xmlns:wps="http://schemas.microsoft.com/office/word/2010/wordprocessingShape" mc:Ignorable="w14 w15 w16se w16cid w16 w16cex w16sdtdh w16sdtfl w16du wp14">
   <w:endnote w:type="separator" w:id="-1">
     <w:p>
       <w:r>
@@ -39481,10 +39637,10 @@
 </file>
 
 <file path=word/footer1.xml><?xml version="1.0" encoding="utf-8"?>
-<w:ftr xmlns:wpc="http://schemas.microsoft.com/office/word/2010/wordprocessingCanvas" xmlns:cx="http://schemas.microsoft.com/office/drawing/2014/chartex" xmlns:cx1="http://schemas.microsoft.com/office/drawing/2015/9/8/chartex" xmlns:cx2="http://schemas.microsoft.com/office/drawing/2015/10/21/chartex" xmlns:cx3="http://schemas.microsoft.com/office/drawing/2016/5/9/chartex" xmlns:cx4="http://schemas.microsoft.com/office/drawing/2016/5/10/chartex" xmlns:cx5="http://schemas.microsoft.com/office/drawing/2016/5/11/chartex" xmlns:cx6="http://schemas.microsoft.com/office/drawing/2016/5/12/chartex" xmlns:cx7="http://schemas.microsoft.com/office/drawing/2016/5/13/chartex" xmlns:cx8="http://schemas.microsoft.com/office/drawing/2016/5/14/chartex" xmlns:mc="http://schemas.openxmlformats.org/markup-compatibility/2006" xmlns:aink="http://schemas.microsoft.com/office/drawing/2016/ink" xmlns:am3d="http://schemas.microsoft.com/office/drawing/2017/model3d" xmlns:o="urn:schemas-microsoft-com:office:office" xmlns:oel="http://schemas.microsoft.com/office/2019/extlst" xmlns:r="http://schemas.openxmlformats.org/officeDocument/2006/relationships" xmlns:m="http://schemas.openxmlformats.org/officeDocument/2006/math" xmlns:v="urn:schemas-microsoft-com:vml" xmlns:wp14="http://schemas.microsoft.com/office/word/2010/wordprocessingDrawing" xmlns:wp="http://schemas.openxmlformats.org/drawingml/2006/wordprocessingDrawing" xmlns:w10="urn:schemas-microsoft-com:office:word" xmlns:w="http://schemas.openxmlformats.org/wordprocessingml/2006/main" xmlns:w14="http://schemas.microsoft.com/office/word/2010/wordml" xmlns:w15="http://schemas.microsoft.com/office/word/2012/wordml" xmlns:w16cei="http://schemas.microsoft.com/office/word/2026/wordml/cei" xmlns:w16cex="http://schemas.microsoft.com/office/word/2018/wordml/cex" xmlns:w16cid="http://schemas.microsoft.com/office/word/2016/wordml/cid" xmlns:w16="http://schemas.microsoft.com/office/word/2018/wordml" xmlns:w16du="http://schemas.microsoft.com/office/word/2023/wordml/word16du" xmlns:w16sdtdh="http://schemas.microsoft.com/office/word/2020/wordml/sdtdatahash" xmlns:w16sdtfl="http://schemas.microsoft.com/office/word/2024/wordml/sdtformatlock" xmlns:w16se="http://schemas.microsoft.com/office/word/2015/wordml/symex" xmlns:wpg="http://schemas.microsoft.com/office/word/2010/wordprocessingGroup" xmlns:wpi="http://schemas.microsoft.com/office/word/2010/wordprocessingInk" xmlns:wne="http://schemas.microsoft.com/office/word/2006/wordml" xmlns:wps="http://schemas.microsoft.com/office/word/2010/wordprocessingShape" mc:Ignorable="w14 w15 w16se w16cid w16 w16cex w16sdtdh w16sdtfl w16du wp14">
+<w:ftr xmlns:wpc="http://schemas.microsoft.com/office/word/2010/wordprocessingCanvas" xmlns:cx="http://schemas.microsoft.com/office/drawing/2014/chartex" xmlns:cx1="http://schemas.microsoft.com/office/drawing/2015/9/8/chartex" xmlns:cx2="http://schemas.microsoft.com/office/drawing/2015/10/21/chartex" xmlns:cx3="http://schemas.microsoft.com/office/drawing/2016/5/9/chartex" xmlns:cx4="http://schemas.microsoft.com/office/drawing/2016/5/10/chartex" xmlns:cx5="http://schemas.microsoft.com/office/drawing/2016/5/11/chartex" xmlns:cx6="http://schemas.microsoft.com/office/drawing/2016/5/12/chartex" xmlns:cx7="http://schemas.microsoft.com/office/drawing/2016/5/13/chartex" xmlns:cx8="http://schemas.microsoft.com/office/drawing/2016/5/14/chartex" xmlns:mc="http://schemas.openxmlformats.org/markup-compatibility/2006" xmlns:aink="http://schemas.microsoft.com/office/drawing/2016/ink" xmlns:am3d="http://schemas.microsoft.com/office/drawing/2017/model3d" xmlns:o="urn:schemas-microsoft-com:office:office" xmlns:oel="http://schemas.microsoft.com/office/2019/extlst" xmlns:r="http://schemas.openxmlformats.org/officeDocument/2006/relationships" xmlns:m="http://schemas.openxmlformats.org/officeDocument/2006/math" xmlns:v="urn:schemas-microsoft-com:vml" xmlns:wp14="http://schemas.microsoft.com/office/word/2010/wordprocessingDrawing" xmlns:wp="http://schemas.openxmlformats.org/drawingml/2006/wordprocessingDrawing" xmlns:w10="urn:schemas-microsoft-com:office:word" xmlns:w="http://schemas.openxmlformats.org/wordprocessingml/2006/main" xmlns:w14="http://schemas.microsoft.com/office/word/2010/wordml" xmlns:w15="http://schemas.microsoft.com/office/word/2012/wordml" xmlns:w16cex="http://schemas.microsoft.com/office/word/2018/wordml/cex" xmlns:w16cid="http://schemas.microsoft.com/office/word/2016/wordml/cid" xmlns:w16="http://schemas.microsoft.com/office/word/2018/wordml" xmlns:w16du="http://schemas.microsoft.com/office/word/2023/wordml/word16du" xmlns:w16sdtdh="http://schemas.microsoft.com/office/word/2020/wordml/sdtdatahash" xmlns:w16sdtfl="http://schemas.microsoft.com/office/word/2024/wordml/sdtformatlock" xmlns:w16se="http://schemas.microsoft.com/office/word/2015/wordml/symex" xmlns:wpg="http://schemas.microsoft.com/office/word/2010/wordprocessingGroup" xmlns:wpi="http://schemas.microsoft.com/office/word/2010/wordprocessingInk" xmlns:wne="http://schemas.microsoft.com/office/word/2006/wordml" xmlns:wps="http://schemas.microsoft.com/office/word/2010/wordprocessingShape" mc:Ignorable="w14 w15 w16se w16cid w16 w16cex w16sdtdh w16sdtfl w16du wp14">
   <w:p>
     <w:pPr>
-      <w:pStyle w:val="BodyText"/>
+      <w:pStyle w:val="Tijeloteksta"/>
       <w:spacing w:line="14" w:lineRule="auto"/>
       <w:rPr>
         <w:sz w:val="20"/>
@@ -39685,10 +39841,10 @@
 </file>
 
 <file path=word/footer2.xml><?xml version="1.0" encoding="utf-8"?>
-<w:ftr xmlns:wpc="http://schemas.microsoft.com/office/word/2010/wordprocessingCanvas" xmlns:cx="http://schemas.microsoft.com/office/drawing/2014/chartex" xmlns:cx1="http://schemas.microsoft.com/office/drawing/2015/9/8/chartex" xmlns:cx2="http://schemas.microsoft.com/office/drawing/2015/10/21/chartex" xmlns:cx3="http://schemas.microsoft.com/office/drawing/2016/5/9/chartex" xmlns:cx4="http://schemas.microsoft.com/office/drawing/2016/5/10/chartex" xmlns:cx5="http://schemas.microsoft.com/office/drawing/2016/5/11/chartex" xmlns:cx6="http://schemas.microsoft.com/office/drawing/2016/5/12/chartex" xmlns:cx7="http://schemas.microsoft.com/office/drawing/2016/5/13/chartex" xmlns:cx8="http://schemas.microsoft.com/office/drawing/2016/5/14/chartex" xmlns:mc="http://schemas.openxmlformats.org/markup-compatibility/2006" xmlns:aink="http://schemas.microsoft.com/office/drawing/2016/ink" xmlns:am3d="http://schemas.microsoft.com/office/drawing/2017/model3d" xmlns:o="urn:schemas-microsoft-com:office:office" xmlns:oel="http://schemas.microsoft.com/office/2019/extlst" xmlns:r="http://schemas.openxmlformats.org/officeDocument/2006/relationships" xmlns:m="http://schemas.openxmlformats.org/officeDocument/2006/math" xmlns:v="urn:schemas-microsoft-com:vml" xmlns:wp14="http://schemas.microsoft.com/office/word/2010/wordprocessingDrawing" xmlns:wp="http://schemas.openxmlformats.org/drawingml/2006/wordprocessingDrawing" xmlns:w10="urn:schemas-microsoft-com:office:word" xmlns:w="http://schemas.openxmlformats.org/wordprocessingml/2006/main" xmlns:w14="http://schemas.microsoft.com/office/word/2010/wordml" xmlns:w15="http://schemas.microsoft.com/office/word/2012/wordml" xmlns:w16cei="http://schemas.microsoft.com/office/word/2026/wordml/cei" xmlns:w16cex="http://schemas.microsoft.com/office/word/2018/wordml/cex" xmlns:w16cid="http://schemas.microsoft.com/office/word/2016/wordml/cid" xmlns:w16="http://schemas.microsoft.com/office/word/2018/wordml" xmlns:w16du="http://schemas.microsoft.com/office/word/2023/wordml/word16du" xmlns:w16sdtdh="http://schemas.microsoft.com/office/word/2020/wordml/sdtdatahash" xmlns:w16sdtfl="http://schemas.microsoft.com/office/word/2024/wordml/sdtformatlock" xmlns:w16se="http://schemas.microsoft.com/office/word/2015/wordml/symex" xmlns:wpg="http://schemas.microsoft.com/office/word/2010/wordprocessingGroup" xmlns:wpi="http://schemas.microsoft.com/office/word/2010/wordprocessingInk" xmlns:wne="http://schemas.microsoft.com/office/word/2006/wordml" xmlns:wps="http://schemas.microsoft.com/office/word/2010/wordprocessingShape" mc:Ignorable="w14 w15 w16se w16cid w16 w16cex w16sdtdh w16sdtfl w16du wp14">
+<w:ftr xmlns:wpc="http://schemas.microsoft.com/office/word/2010/wordprocessingCanvas" xmlns:cx="http://schemas.microsoft.com/office/drawing/2014/chartex" xmlns:cx1="http://schemas.microsoft.com/office/drawing/2015/9/8/chartex" xmlns:cx2="http://schemas.microsoft.com/office/drawing/2015/10/21/chartex" xmlns:cx3="http://schemas.microsoft.com/office/drawing/2016/5/9/chartex" xmlns:cx4="http://schemas.microsoft.com/office/drawing/2016/5/10/chartex" xmlns:cx5="http://schemas.microsoft.com/office/drawing/2016/5/11/chartex" xmlns:cx6="http://schemas.microsoft.com/office/drawing/2016/5/12/chartex" xmlns:cx7="http://schemas.microsoft.com/office/drawing/2016/5/13/chartex" xmlns:cx8="http://schemas.microsoft.com/office/drawing/2016/5/14/chartex" xmlns:mc="http://schemas.openxmlformats.org/markup-compatibility/2006" xmlns:aink="http://schemas.microsoft.com/office/drawing/2016/ink" xmlns:am3d="http://schemas.microsoft.com/office/drawing/2017/model3d" xmlns:o="urn:schemas-microsoft-com:office:office" xmlns:oel="http://schemas.microsoft.com/office/2019/extlst" xmlns:r="http://schemas.openxmlformats.org/officeDocument/2006/relationships" xmlns:m="http://schemas.openxmlformats.org/officeDocument/2006/math" xmlns:v="urn:schemas-microsoft-com:vml" xmlns:wp14="http://schemas.microsoft.com/office/word/2010/wordprocessingDrawing" xmlns:wp="http://schemas.openxmlformats.org/drawingml/2006/wordprocessingDrawing" xmlns:w10="urn:schemas-microsoft-com:office:word" xmlns:w="http://schemas.openxmlformats.org/wordprocessingml/2006/main" xmlns:w14="http://schemas.microsoft.com/office/word/2010/wordml" xmlns:w15="http://schemas.microsoft.com/office/word/2012/wordml" xmlns:w16cex="http://schemas.microsoft.com/office/word/2018/wordml/cex" xmlns:w16cid="http://schemas.microsoft.com/office/word/2016/wordml/cid" xmlns:w16="http://schemas.microsoft.com/office/word/2018/wordml" xmlns:w16du="http://schemas.microsoft.com/office/word/2023/wordml/word16du" xmlns:w16sdtdh="http://schemas.microsoft.com/office/word/2020/wordml/sdtdatahash" xmlns:w16sdtfl="http://schemas.microsoft.com/office/word/2024/wordml/sdtformatlock" xmlns:w16se="http://schemas.microsoft.com/office/word/2015/wordml/symex" xmlns:wpg="http://schemas.microsoft.com/office/word/2010/wordprocessingGroup" xmlns:wpi="http://schemas.microsoft.com/office/word/2010/wordprocessingInk" xmlns:wne="http://schemas.microsoft.com/office/word/2006/wordml" xmlns:wps="http://schemas.microsoft.com/office/word/2010/wordprocessingShape" mc:Ignorable="w14 w15 w16se w16cid w16 w16cex w16sdtdh w16sdtfl w16du wp14">
   <w:p>
     <w:pPr>
-      <w:pStyle w:val="BodyText"/>
+      <w:pStyle w:val="Tijeloteksta"/>
       <w:spacing w:line="14" w:lineRule="auto"/>
       <w:rPr>
         <w:sz w:val="2"/>
@@ -39699,10 +39855,10 @@
 </file>
 
 <file path=word/footer3.xml><?xml version="1.0" encoding="utf-8"?>
-<w:ftr xmlns:wpc="http://schemas.microsoft.com/office/word/2010/wordprocessingCanvas" xmlns:cx="http://schemas.microsoft.com/office/drawing/2014/chartex" xmlns:cx1="http://schemas.microsoft.com/office/drawing/2015/9/8/chartex" xmlns:cx2="http://schemas.microsoft.com/office/drawing/2015/10/21/chartex" xmlns:cx3="http://schemas.microsoft.com/office/drawing/2016/5/9/chartex" xmlns:cx4="http://schemas.microsoft.com/office/drawing/2016/5/10/chartex" xmlns:cx5="http://schemas.microsoft.com/office/drawing/2016/5/11/chartex" xmlns:cx6="http://schemas.microsoft.com/office/drawing/2016/5/12/chartex" xmlns:cx7="http://schemas.microsoft.com/office/drawing/2016/5/13/chartex" xmlns:cx8="http://schemas.microsoft.com/office/drawing/2016/5/14/chartex" xmlns:mc="http://schemas.openxmlformats.org/markup-compatibility/2006" xmlns:aink="http://schemas.microsoft.com/office/drawing/2016/ink" xmlns:am3d="http://schemas.microsoft.com/office/drawing/2017/model3d" xmlns:o="urn:schemas-microsoft-com:office:office" xmlns:oel="http://schemas.microsoft.com/office/2019/extlst" xmlns:r="http://schemas.openxmlformats.org/officeDocument/2006/relationships" xmlns:m="http://schemas.openxmlformats.org/officeDocument/2006/math" xmlns:v="urn:schemas-microsoft-com:vml" xmlns:wp14="http://schemas.microsoft.com/office/word/2010/wordprocessingDrawing" xmlns:wp="http://schemas.openxmlformats.org/drawingml/2006/wordprocessingDrawing" xmlns:w10="urn:schemas-microsoft-com:office:word" xmlns:w="http://schemas.openxmlformats.org/wordprocessingml/2006/main" xmlns:w14="http://schemas.microsoft.com/office/word/2010/wordml" xmlns:w15="http://schemas.microsoft.com/office/word/2012/wordml" xmlns:w16cei="http://schemas.microsoft.com/office/word/2026/wordml/cei" xmlns:w16cex="http://schemas.microsoft.com/office/word/2018/wordml/cex" xmlns:w16cid="http://schemas.microsoft.com/office/word/2016/wordml/cid" xmlns:w16="http://schemas.microsoft.com/office/word/2018/wordml" xmlns:w16du="http://schemas.microsoft.com/office/word/2023/wordml/word16du" xmlns:w16sdtdh="http://schemas.microsoft.com/office/word/2020/wordml/sdtdatahash" xmlns:w16sdtfl="http://schemas.microsoft.com/office/word/2024/wordml/sdtformatlock" xmlns:w16se="http://schemas.microsoft.com/office/word/2015/wordml/symex" xmlns:wpg="http://schemas.microsoft.com/office/word/2010/wordprocessingGroup" xmlns:wpi="http://schemas.microsoft.com/office/word/2010/wordprocessingInk" xmlns:wne="http://schemas.microsoft.com/office/word/2006/wordml" xmlns:wps="http://schemas.microsoft.com/office/word/2010/wordprocessingShape" mc:Ignorable="w14 w15 w16se w16cid w16 w16cex w16sdtdh w16sdtfl w16du wp14">
+<w:ftr xmlns:wpc="http://schemas.microsoft.com/office/word/2010/wordprocessingCanvas" xmlns:cx="http://schemas.microsoft.com/office/drawing/2014/chartex" xmlns:cx1="http://schemas.microsoft.com/office/drawing/2015/9/8/chartex" xmlns:cx2="http://schemas.microsoft.com/office/drawing/2015/10/21/chartex" xmlns:cx3="http://schemas.microsoft.com/office/drawing/2016/5/9/chartex" xmlns:cx4="http://schemas.microsoft.com/office/drawing/2016/5/10/chartex" xmlns:cx5="http://schemas.microsoft.com/office/drawing/2016/5/11/chartex" xmlns:cx6="http://schemas.microsoft.com/office/drawing/2016/5/12/chartex" xmlns:cx7="http://schemas.microsoft.com/office/drawing/2016/5/13/chartex" xmlns:cx8="http://schemas.microsoft.com/office/drawing/2016/5/14/chartex" xmlns:mc="http://schemas.openxmlformats.org/markup-compatibility/2006" xmlns:aink="http://schemas.microsoft.com/office/drawing/2016/ink" xmlns:am3d="http://schemas.microsoft.com/office/drawing/2017/model3d" xmlns:o="urn:schemas-microsoft-com:office:office" xmlns:oel="http://schemas.microsoft.com/office/2019/extlst" xmlns:r="http://schemas.openxmlformats.org/officeDocument/2006/relationships" xmlns:m="http://schemas.openxmlformats.org/officeDocument/2006/math" xmlns:v="urn:schemas-microsoft-com:vml" xmlns:wp14="http://schemas.microsoft.com/office/word/2010/wordprocessingDrawing" xmlns:wp="http://schemas.openxmlformats.org/drawingml/2006/wordprocessingDrawing" xmlns:w10="urn:schemas-microsoft-com:office:word" xmlns:w="http://schemas.openxmlformats.org/wordprocessingml/2006/main" xmlns:w14="http://schemas.microsoft.com/office/word/2010/wordml" xmlns:w15="http://schemas.microsoft.com/office/word/2012/wordml" xmlns:w16cex="http://schemas.microsoft.com/office/word/2018/wordml/cex" xmlns:w16cid="http://schemas.microsoft.com/office/word/2016/wordml/cid" xmlns:w16="http://schemas.microsoft.com/office/word/2018/wordml" xmlns:w16du="http://schemas.microsoft.com/office/word/2023/wordml/word16du" xmlns:w16sdtdh="http://schemas.microsoft.com/office/word/2020/wordml/sdtdatahash" xmlns:w16sdtfl="http://schemas.microsoft.com/office/word/2024/wordml/sdtformatlock" xmlns:w16se="http://schemas.microsoft.com/office/word/2015/wordml/symex" xmlns:wpg="http://schemas.microsoft.com/office/word/2010/wordprocessingGroup" xmlns:wpi="http://schemas.microsoft.com/office/word/2010/wordprocessingInk" xmlns:wne="http://schemas.microsoft.com/office/word/2006/wordml" xmlns:wps="http://schemas.microsoft.com/office/word/2010/wordprocessingShape" mc:Ignorable="w14 w15 w16se w16cid w16 w16cex w16sdtdh w16sdtfl w16du wp14">
   <w:p>
     <w:pPr>
-      <w:pStyle w:val="BodyText"/>
+      <w:pStyle w:val="Tijeloteksta"/>
       <w:spacing w:line="14" w:lineRule="auto"/>
       <w:rPr>
         <w:sz w:val="2"/>
@@ -39713,10 +39869,10 @@
 </file>
 
 <file path=word/footer4.xml><?xml version="1.0" encoding="utf-8"?>
-<w:ftr xmlns:wpc="http://schemas.microsoft.com/office/word/2010/wordprocessingCanvas" xmlns:cx="http://schemas.microsoft.com/office/drawing/2014/chartex" xmlns:cx1="http://schemas.microsoft.com/office/drawing/2015/9/8/chartex" xmlns:cx2="http://schemas.microsoft.com/office/drawing/2015/10/21/chartex" xmlns:cx3="http://schemas.microsoft.com/office/drawing/2016/5/9/chartex" xmlns:cx4="http://schemas.microsoft.com/office/drawing/2016/5/10/chartex" xmlns:cx5="http://schemas.microsoft.com/office/drawing/2016/5/11/chartex" xmlns:cx6="http://schemas.microsoft.com/office/drawing/2016/5/12/chartex" xmlns:cx7="http://schemas.microsoft.com/office/drawing/2016/5/13/chartex" xmlns:cx8="http://schemas.microsoft.com/office/drawing/2016/5/14/chartex" xmlns:mc="http://schemas.openxmlformats.org/markup-compatibility/2006" xmlns:aink="http://schemas.microsoft.com/office/drawing/2016/ink" xmlns:am3d="http://schemas.microsoft.com/office/drawing/2017/model3d" xmlns:o="urn:schemas-microsoft-com:office:office" xmlns:oel="http://schemas.microsoft.com/office/2019/extlst" xmlns:r="http://schemas.openxmlformats.org/officeDocument/2006/relationships" xmlns:m="http://schemas.openxmlformats.org/officeDocument/2006/math" xmlns:v="urn:schemas-microsoft-com:vml" xmlns:wp14="http://schemas.microsoft.com/office/word/2010/wordprocessingDrawing" xmlns:wp="http://schemas.openxmlformats.org/drawingml/2006/wordprocessingDrawing" xmlns:w10="urn:schemas-microsoft-com:office:word" xmlns:w="http://schemas.openxmlformats.org/wordprocessingml/2006/main" xmlns:w14="http://schemas.microsoft.com/office/word/2010/wordml" xmlns:w15="http://schemas.microsoft.com/office/word/2012/wordml" xmlns:w16cei="http://schemas.microsoft.com/office/word/2026/wordml/cei" xmlns:w16cex="http://schemas.microsoft.com/office/word/2018/wordml/cex" xmlns:w16cid="http://schemas.microsoft.com/office/word/2016/wordml/cid" xmlns:w16="http://schemas.microsoft.com/office/word/2018/wordml" xmlns:w16du="http://schemas.microsoft.com/office/word/2023/wordml/word16du" xmlns:w16sdtdh="http://schemas.microsoft.com/office/word/2020/wordml/sdtdatahash" xmlns:w16sdtfl="http://schemas.microsoft.com/office/word/2024/wordml/sdtformatlock" xmlns:w16se="http://schemas.microsoft.com/office/word/2015/wordml/symex" xmlns:wpg="http://schemas.microsoft.com/office/word/2010/wordprocessingGroup" xmlns:wpi="http://schemas.microsoft.com/office/word/2010/wordprocessingInk" xmlns:wne="http://schemas.microsoft.com/office/word/2006/wordml" xmlns:wps="http://schemas.microsoft.com/office/word/2010/wordprocessingShape" mc:Ignorable="w14 w15 w16se w16cid w16 w16cex w16sdtdh w16sdtfl w16du wp14">
+<w:ftr xmlns:wpc="http://schemas.microsoft.com/office/word/2010/wordprocessingCanvas" xmlns:cx="http://schemas.microsoft.com/office/drawing/2014/chartex" xmlns:cx1="http://schemas.microsoft.com/office/drawing/2015/9/8/chartex" xmlns:cx2="http://schemas.microsoft.com/office/drawing/2015/10/21/chartex" xmlns:cx3="http://schemas.microsoft.com/office/drawing/2016/5/9/chartex" xmlns:cx4="http://schemas.microsoft.com/office/drawing/2016/5/10/chartex" xmlns:cx5="http://schemas.microsoft.com/office/drawing/2016/5/11/chartex" xmlns:cx6="http://schemas.microsoft.com/office/drawing/2016/5/12/chartex" xmlns:cx7="http://schemas.microsoft.com/office/drawing/2016/5/13/chartex" xmlns:cx8="http://schemas.microsoft.com/office/drawing/2016/5/14/chartex" xmlns:mc="http://schemas.openxmlformats.org/markup-compatibility/2006" xmlns:aink="http://schemas.microsoft.com/office/drawing/2016/ink" xmlns:am3d="http://schemas.microsoft.com/office/drawing/2017/model3d" xmlns:o="urn:schemas-microsoft-com:office:office" xmlns:oel="http://schemas.microsoft.com/office/2019/extlst" xmlns:r="http://schemas.openxmlformats.org/officeDocument/2006/relationships" xmlns:m="http://schemas.openxmlformats.org/officeDocument/2006/math" xmlns:v="urn:schemas-microsoft-com:vml" xmlns:wp14="http://schemas.microsoft.com/office/word/2010/wordprocessingDrawing" xmlns:wp="http://schemas.openxmlformats.org/drawingml/2006/wordprocessingDrawing" xmlns:w10="urn:schemas-microsoft-com:office:word" xmlns:w="http://schemas.openxmlformats.org/wordprocessingml/2006/main" xmlns:w14="http://schemas.microsoft.com/office/word/2010/wordml" xmlns:w15="http://schemas.microsoft.com/office/word/2012/wordml" xmlns:w16cex="http://schemas.microsoft.com/office/word/2018/wordml/cex" xmlns:w16cid="http://schemas.microsoft.com/office/word/2016/wordml/cid" xmlns:w16="http://schemas.microsoft.com/office/word/2018/wordml" xmlns:w16du="http://schemas.microsoft.com/office/word/2023/wordml/word16du" xmlns:w16sdtdh="http://schemas.microsoft.com/office/word/2020/wordml/sdtdatahash" xmlns:w16sdtfl="http://schemas.microsoft.com/office/word/2024/wordml/sdtformatlock" xmlns:w16se="http://schemas.microsoft.com/office/word/2015/wordml/symex" xmlns:wpg="http://schemas.microsoft.com/office/word/2010/wordprocessingGroup" xmlns:wpi="http://schemas.microsoft.com/office/word/2010/wordprocessingInk" xmlns:wne="http://schemas.microsoft.com/office/word/2006/wordml" xmlns:wps="http://schemas.microsoft.com/office/word/2010/wordprocessingShape" mc:Ignorable="w14 w15 w16se w16cid w16 w16cex w16sdtdh w16sdtfl w16du wp14">
   <w:p>
     <w:pPr>
-      <w:pStyle w:val="BodyText"/>
+      <w:pStyle w:val="Tijeloteksta"/>
       <w:spacing w:line="14" w:lineRule="auto"/>
       <w:rPr>
         <w:sz w:val="2"/>
@@ -39727,10 +39883,10 @@
 </file>
 
 <file path=word/footer5.xml><?xml version="1.0" encoding="utf-8"?>
-<w:ftr xmlns:wpc="http://schemas.microsoft.com/office/word/2010/wordprocessingCanvas" xmlns:cx="http://schemas.microsoft.com/office/drawing/2014/chartex" xmlns:cx1="http://schemas.microsoft.com/office/drawing/2015/9/8/chartex" xmlns:cx2="http://schemas.microsoft.com/office/drawing/2015/10/21/chartex" xmlns:cx3="http://schemas.microsoft.com/office/drawing/2016/5/9/chartex" xmlns:cx4="http://schemas.microsoft.com/office/drawing/2016/5/10/chartex" xmlns:cx5="http://schemas.microsoft.com/office/drawing/2016/5/11/chartex" xmlns:cx6="http://schemas.microsoft.com/office/drawing/2016/5/12/chartex" xmlns:cx7="http://schemas.microsoft.com/office/drawing/2016/5/13/chartex" xmlns:cx8="http://schemas.microsoft.com/office/drawing/2016/5/14/chartex" xmlns:mc="http://schemas.openxmlformats.org/markup-compatibility/2006" xmlns:aink="http://schemas.microsoft.com/office/drawing/2016/ink" xmlns:am3d="http://schemas.microsoft.com/office/drawing/2017/model3d" xmlns:o="urn:schemas-microsoft-com:office:office" xmlns:oel="http://schemas.microsoft.com/office/2019/extlst" xmlns:r="http://schemas.openxmlformats.org/officeDocument/2006/relationships" xmlns:m="http://schemas.openxmlformats.org/officeDocument/2006/math" xmlns:v="urn:schemas-microsoft-com:vml" xmlns:wp14="http://schemas.microsoft.com/office/word/2010/wordprocessingDrawing" xmlns:wp="http://schemas.openxmlformats.org/drawingml/2006/wordprocessingDrawing" xmlns:w10="urn:schemas-microsoft-com:office:word" xmlns:w="http://schemas.openxmlformats.org/wordprocessingml/2006/main" xmlns:w14="http://schemas.microsoft.com/office/word/2010/wordml" xmlns:w15="http://schemas.microsoft.com/office/word/2012/wordml" xmlns:w16cei="http://schemas.microsoft.com/office/word/2026/wordml/cei" xmlns:w16cex="http://schemas.microsoft.com/office/word/2018/wordml/cex" xmlns:w16cid="http://schemas.microsoft.com/office/word/2016/wordml/cid" xmlns:w16="http://schemas.microsoft.com/office/word/2018/wordml" xmlns:w16du="http://schemas.microsoft.com/office/word/2023/wordml/word16du" xmlns:w16sdtdh="http://schemas.microsoft.com/office/word/2020/wordml/sdtdatahash" xmlns:w16sdtfl="http://schemas.microsoft.com/office/word/2024/wordml/sdtformatlock" xmlns:w16se="http://schemas.microsoft.com/office/word/2015/wordml/symex" xmlns:wpg="http://schemas.microsoft.com/office/word/2010/wordprocessingGroup" xmlns:wpi="http://schemas.microsoft.com/office/word/2010/wordprocessingInk" xmlns:wne="http://schemas.microsoft.com/office/word/2006/wordml" xmlns:wps="http://schemas.microsoft.com/office/word/2010/wordprocessingShape" mc:Ignorable="w14 w15 w16se w16cid w16 w16cex w16sdtdh w16sdtfl w16du wp14">
+<w:ftr xmlns:wpc="http://schemas.microsoft.com/office/word/2010/wordprocessingCanvas" xmlns:cx="http://schemas.microsoft.com/office/drawing/2014/chartex" xmlns:cx1="http://schemas.microsoft.com/office/drawing/2015/9/8/chartex" xmlns:cx2="http://schemas.microsoft.com/office/drawing/2015/10/21/chartex" xmlns:cx3="http://schemas.microsoft.com/office/drawing/2016/5/9/chartex" xmlns:cx4="http://schemas.microsoft.com/office/drawing/2016/5/10/chartex" xmlns:cx5="http://schemas.microsoft.com/office/drawing/2016/5/11/chartex" xmlns:cx6="http://schemas.microsoft.com/office/drawing/2016/5/12/chartex" xmlns:cx7="http://schemas.microsoft.com/office/drawing/2016/5/13/chartex" xmlns:cx8="http://schemas.microsoft.com/office/drawing/2016/5/14/chartex" xmlns:mc="http://schemas.openxmlformats.org/markup-compatibility/2006" xmlns:aink="http://schemas.microsoft.com/office/drawing/2016/ink" xmlns:am3d="http://schemas.microsoft.com/office/drawing/2017/model3d" xmlns:o="urn:schemas-microsoft-com:office:office" xmlns:oel="http://schemas.microsoft.com/office/2019/extlst" xmlns:r="http://schemas.openxmlformats.org/officeDocument/2006/relationships" xmlns:m="http://schemas.openxmlformats.org/officeDocument/2006/math" xmlns:v="urn:schemas-microsoft-com:vml" xmlns:wp14="http://schemas.microsoft.com/office/word/2010/wordprocessingDrawing" xmlns:wp="http://schemas.openxmlformats.org/drawingml/2006/wordprocessingDrawing" xmlns:w10="urn:schemas-microsoft-com:office:word" xmlns:w="http://schemas.openxmlformats.org/wordprocessingml/2006/main" xmlns:w14="http://schemas.microsoft.com/office/word/2010/wordml" xmlns:w15="http://schemas.microsoft.com/office/word/2012/wordml" xmlns:w16cex="http://schemas.microsoft.com/office/word/2018/wordml/cex" xmlns:w16cid="http://schemas.microsoft.com/office/word/2016/wordml/cid" xmlns:w16="http://schemas.microsoft.com/office/word/2018/wordml" xmlns:w16du="http://schemas.microsoft.com/office/word/2023/wordml/word16du" xmlns:w16sdtdh="http://schemas.microsoft.com/office/word/2020/wordml/sdtdatahash" xmlns:w16sdtfl="http://schemas.microsoft.com/office/word/2024/wordml/sdtformatlock" xmlns:w16se="http://schemas.microsoft.com/office/word/2015/wordml/symex" xmlns:wpg="http://schemas.microsoft.com/office/word/2010/wordprocessingGroup" xmlns:wpi="http://schemas.microsoft.com/office/word/2010/wordprocessingInk" xmlns:wne="http://schemas.microsoft.com/office/word/2006/wordml" xmlns:wps="http://schemas.microsoft.com/office/word/2010/wordprocessingShape" mc:Ignorable="w14 w15 w16se w16cid w16 w16cex w16sdtdh w16sdtfl w16du wp14">
   <w:p>
     <w:pPr>
-      <w:pStyle w:val="BodyText"/>
+      <w:pStyle w:val="Tijeloteksta"/>
       <w:spacing w:line="14" w:lineRule="auto"/>
       <w:rPr>
         <w:sz w:val="2"/>
@@ -39741,10 +39897,10 @@
 </file>
 
 <file path=word/footer6.xml><?xml version="1.0" encoding="utf-8"?>
-<w:ftr xmlns:wpc="http://schemas.microsoft.com/office/word/2010/wordprocessingCanvas" xmlns:cx="http://schemas.microsoft.com/office/drawing/2014/chartex" xmlns:cx1="http://schemas.microsoft.com/office/drawing/2015/9/8/chartex" xmlns:cx2="http://schemas.microsoft.com/office/drawing/2015/10/21/chartex" xmlns:cx3="http://schemas.microsoft.com/office/drawing/2016/5/9/chartex" xmlns:cx4="http://schemas.microsoft.com/office/drawing/2016/5/10/chartex" xmlns:cx5="http://schemas.microsoft.com/office/drawing/2016/5/11/chartex" xmlns:cx6="http://schemas.microsoft.com/office/drawing/2016/5/12/chartex" xmlns:cx7="http://schemas.microsoft.com/office/drawing/2016/5/13/chartex" xmlns:cx8="http://schemas.microsoft.com/office/drawing/2016/5/14/chartex" xmlns:mc="http://schemas.openxmlformats.org/markup-compatibility/2006" xmlns:aink="http://schemas.microsoft.com/office/drawing/2016/ink" xmlns:am3d="http://schemas.microsoft.com/office/drawing/2017/model3d" xmlns:o="urn:schemas-microsoft-com:office:office" xmlns:oel="http://schemas.microsoft.com/office/2019/extlst" xmlns:r="http://schemas.openxmlformats.org/officeDocument/2006/relationships" xmlns:m="http://schemas.openxmlformats.org/officeDocument/2006/math" xmlns:v="urn:schemas-microsoft-com:vml" xmlns:wp14="http://schemas.microsoft.com/office/word/2010/wordprocessingDrawing" xmlns:wp="http://schemas.openxmlformats.org/drawingml/2006/wordprocessingDrawing" xmlns:w10="urn:schemas-microsoft-com:office:word" xmlns:w="http://schemas.openxmlformats.org/wordprocessingml/2006/main" xmlns:w14="http://schemas.microsoft.com/office/word/2010/wordml" xmlns:w15="http://schemas.microsoft.com/office/word/2012/wordml" xmlns:w16cei="http://schemas.microsoft.com/office/word/2026/wordml/cei" xmlns:w16cex="http://schemas.microsoft.com/office/word/2018/wordml/cex" xmlns:w16cid="http://schemas.microsoft.com/office/word/2016/wordml/cid" xmlns:w16="http://schemas.microsoft.com/office/word/2018/wordml" xmlns:w16du="http://schemas.microsoft.com/office/word/2023/wordml/word16du" xmlns:w16sdtdh="http://schemas.microsoft.com/office/word/2020/wordml/sdtdatahash" xmlns:w16sdtfl="http://schemas.microsoft.com/office/word/2024/wordml/sdtformatlock" xmlns:w16se="http://schemas.microsoft.com/office/word/2015/wordml/symex" xmlns:wpg="http://schemas.microsoft.com/office/word/2010/wordprocessingGroup" xmlns:wpi="http://schemas.microsoft.com/office/word/2010/wordprocessingInk" xmlns:wne="http://schemas.microsoft.com/office/word/2006/wordml" xmlns:wps="http://schemas.microsoft.com/office/word/2010/wordprocessingShape" mc:Ignorable="w14 w15 w16se w16cid w16 w16cex w16sdtdh w16sdtfl w16du wp14">
+<w:ftr xmlns:wpc="http://schemas.microsoft.com/office/word/2010/wordprocessingCanvas" xmlns:cx="http://schemas.microsoft.com/office/drawing/2014/chartex" xmlns:cx1="http://schemas.microsoft.com/office/drawing/2015/9/8/chartex" xmlns:cx2="http://schemas.microsoft.com/office/drawing/2015/10/21/chartex" xmlns:cx3="http://schemas.microsoft.com/office/drawing/2016/5/9/chartex" xmlns:cx4="http://schemas.microsoft.com/office/drawing/2016/5/10/chartex" xmlns:cx5="http://schemas.microsoft.com/office/drawing/2016/5/11/chartex" xmlns:cx6="http://schemas.microsoft.com/office/drawing/2016/5/12/chartex" xmlns:cx7="http://schemas.microsoft.com/office/drawing/2016/5/13/chartex" xmlns:cx8="http://schemas.microsoft.com/office/drawing/2016/5/14/chartex" xmlns:mc="http://schemas.openxmlformats.org/markup-compatibility/2006" xmlns:aink="http://schemas.microsoft.com/office/drawing/2016/ink" xmlns:am3d="http://schemas.microsoft.com/office/drawing/2017/model3d" xmlns:o="urn:schemas-microsoft-com:office:office" xmlns:oel="http://schemas.microsoft.com/office/2019/extlst" xmlns:r="http://schemas.openxmlformats.org/officeDocument/2006/relationships" xmlns:m="http://schemas.openxmlformats.org/officeDocument/2006/math" xmlns:v="urn:schemas-microsoft-com:vml" xmlns:wp14="http://schemas.microsoft.com/office/word/2010/wordprocessingDrawing" xmlns:wp="http://schemas.openxmlformats.org/drawingml/2006/wordprocessingDrawing" xmlns:w10="urn:schemas-microsoft-com:office:word" xmlns:w="http://schemas.openxmlformats.org/wordprocessingml/2006/main" xmlns:w14="http://schemas.microsoft.com/office/word/2010/wordml" xmlns:w15="http://schemas.microsoft.com/office/word/2012/wordml" xmlns:w16cex="http://schemas.microsoft.com/office/word/2018/wordml/cex" xmlns:w16cid="http://schemas.microsoft.com/office/word/2016/wordml/cid" xmlns:w16="http://schemas.microsoft.com/office/word/2018/wordml" xmlns:w16du="http://schemas.microsoft.com/office/word/2023/wordml/word16du" xmlns:w16sdtdh="http://schemas.microsoft.com/office/word/2020/wordml/sdtdatahash" xmlns:w16sdtfl="http://schemas.microsoft.com/office/word/2024/wordml/sdtformatlock" xmlns:w16se="http://schemas.microsoft.com/office/word/2015/wordml/symex" xmlns:wpg="http://schemas.microsoft.com/office/word/2010/wordprocessingGroup" xmlns:wpi="http://schemas.microsoft.com/office/word/2010/wordprocessingInk" xmlns:wne="http://schemas.microsoft.com/office/word/2006/wordml" xmlns:wps="http://schemas.microsoft.com/office/word/2010/wordprocessingShape" mc:Ignorable="w14 w15 w16se w16cid w16 w16cex w16sdtdh w16sdtfl w16du wp14">
   <w:p>
     <w:pPr>
-      <w:pStyle w:val="BodyText"/>
+      <w:pStyle w:val="Tijeloteksta"/>
       <w:spacing w:line="14" w:lineRule="auto"/>
       <w:rPr>
         <w:sz w:val="18"/>
@@ -39817,7 +39973,13 @@
                             <w:rPr>
                               <w:spacing w:val="-5"/>
                             </w:rPr>
-                            <w:t>10</w:t>
+                            <w:t>1</w:t>
+                          </w:r>
+                          <w:r>
+                            <w:rPr>
+                              <w:spacing w:val="-5"/>
+                            </w:rPr>
+                            <w:t>0</w:t>
                           </w:r>
                           <w:r>
                             <w:rPr>
@@ -39873,7 +40035,13 @@
                       <w:rPr>
                         <w:spacing w:val="-5"/>
                       </w:rPr>
-                      <w:t>10</w:t>
+                      <w:t>1</w:t>
+                    </w:r>
+                    <w:r>
+                      <w:rPr>
+                        <w:spacing w:val="-5"/>
+                      </w:rPr>
+                      <w:t>0</w:t>
                     </w:r>
                     <w:r>
                       <w:rPr>
@@ -39895,10 +40063,10 @@
 </file>
 
 <file path=word/footer7.xml><?xml version="1.0" encoding="utf-8"?>
-<w:ftr xmlns:wpc="http://schemas.microsoft.com/office/word/2010/wordprocessingCanvas" xmlns:cx="http://schemas.microsoft.com/office/drawing/2014/chartex" xmlns:cx1="http://schemas.microsoft.com/office/drawing/2015/9/8/chartex" xmlns:cx2="http://schemas.microsoft.com/office/drawing/2015/10/21/chartex" xmlns:cx3="http://schemas.microsoft.com/office/drawing/2016/5/9/chartex" xmlns:cx4="http://schemas.microsoft.com/office/drawing/2016/5/10/chartex" xmlns:cx5="http://schemas.microsoft.com/office/drawing/2016/5/11/chartex" xmlns:cx6="http://schemas.microsoft.com/office/drawing/2016/5/12/chartex" xmlns:cx7="http://schemas.microsoft.com/office/drawing/2016/5/13/chartex" xmlns:cx8="http://schemas.microsoft.com/office/drawing/2016/5/14/chartex" xmlns:mc="http://schemas.openxmlformats.org/markup-compatibility/2006" xmlns:aink="http://schemas.microsoft.com/office/drawing/2016/ink" xmlns:am3d="http://schemas.microsoft.com/office/drawing/2017/model3d" xmlns:o="urn:schemas-microsoft-com:office:office" xmlns:oel="http://schemas.microsoft.com/office/2019/extlst" xmlns:r="http://schemas.openxmlformats.org/officeDocument/2006/relationships" xmlns:m="http://schemas.openxmlformats.org/officeDocument/2006/math" xmlns:v="urn:schemas-microsoft-com:vml" xmlns:wp14="http://schemas.microsoft.com/office/word/2010/wordprocessingDrawing" xmlns:wp="http://schemas.openxmlformats.org/drawingml/2006/wordprocessingDrawing" xmlns:w10="urn:schemas-microsoft-com:office:word" xmlns:w="http://schemas.openxmlformats.org/wordprocessingml/2006/main" xmlns:w14="http://schemas.microsoft.com/office/word/2010/wordml" xmlns:w15="http://schemas.microsoft.com/office/word/2012/wordml" xmlns:w16cei="http://schemas.microsoft.com/office/word/2026/wordml/cei" xmlns:w16cex="http://schemas.microsoft.com/office/word/2018/wordml/cex" xmlns:w16cid="http://schemas.microsoft.com/office/word/2016/wordml/cid" xmlns:w16="http://schemas.microsoft.com/office/word/2018/wordml" xmlns:w16du="http://schemas.microsoft.com/office/word/2023/wordml/word16du" xmlns:w16sdtdh="http://schemas.microsoft.com/office/word/2020/wordml/sdtdatahash" xmlns:w16sdtfl="http://schemas.microsoft.com/office/word/2024/wordml/sdtformatlock" xmlns:w16se="http://schemas.microsoft.com/office/word/2015/wordml/symex" xmlns:wpg="http://schemas.microsoft.com/office/word/2010/wordprocessingGroup" xmlns:wpi="http://schemas.microsoft.com/office/word/2010/wordprocessingInk" xmlns:wne="http://schemas.microsoft.com/office/word/2006/wordml" xmlns:wps="http://schemas.microsoft.com/office/word/2010/wordprocessingShape" mc:Ignorable="w14 w15 w16se w16cid w16 w16cex w16sdtdh w16sdtfl w16du wp14">
+<w:ftr xmlns:wpc="http://schemas.microsoft.com/office/word/2010/wordprocessingCanvas" xmlns:cx="http://schemas.microsoft.com/office/drawing/2014/chartex" xmlns:cx1="http://schemas.microsoft.com/office/drawing/2015/9/8/chartex" xmlns:cx2="http://schemas.microsoft.com/office/drawing/2015/10/21/chartex" xmlns:cx3="http://schemas.microsoft.com/office/drawing/2016/5/9/chartex" xmlns:cx4="http://schemas.microsoft.com/office/drawing/2016/5/10/chartex" xmlns:cx5="http://schemas.microsoft.com/office/drawing/2016/5/11/chartex" xmlns:cx6="http://schemas.microsoft.com/office/drawing/2016/5/12/chartex" xmlns:cx7="http://schemas.microsoft.com/office/drawing/2016/5/13/chartex" xmlns:cx8="http://schemas.microsoft.com/office/drawing/2016/5/14/chartex" xmlns:mc="http://schemas.openxmlformats.org/markup-compatibility/2006" xmlns:aink="http://schemas.microsoft.com/office/drawing/2016/ink" xmlns:am3d="http://schemas.microsoft.com/office/drawing/2017/model3d" xmlns:o="urn:schemas-microsoft-com:office:office" xmlns:oel="http://schemas.microsoft.com/office/2019/extlst" xmlns:r="http://schemas.openxmlformats.org/officeDocument/2006/relationships" xmlns:m="http://schemas.openxmlformats.org/officeDocument/2006/math" xmlns:v="urn:schemas-microsoft-com:vml" xmlns:wp14="http://schemas.microsoft.com/office/word/2010/wordprocessingDrawing" xmlns:wp="http://schemas.openxmlformats.org/drawingml/2006/wordprocessingDrawing" xmlns:w10="urn:schemas-microsoft-com:office:word" xmlns:w="http://schemas.openxmlformats.org/wordprocessingml/2006/main" xmlns:w14="http://schemas.microsoft.com/office/word/2010/wordml" xmlns:w15="http://schemas.microsoft.com/office/word/2012/wordml" xmlns:w16cex="http://schemas.microsoft.com/office/word/2018/wordml/cex" xmlns:w16cid="http://schemas.microsoft.com/office/word/2016/wordml/cid" xmlns:w16="http://schemas.microsoft.com/office/word/2018/wordml" xmlns:w16du="http://schemas.microsoft.com/office/word/2023/wordml/word16du" xmlns:w16sdtdh="http://schemas.microsoft.com/office/word/2020/wordml/sdtdatahash" xmlns:w16sdtfl="http://schemas.microsoft.com/office/word/2024/wordml/sdtformatlock" xmlns:w16se="http://schemas.microsoft.com/office/word/2015/wordml/symex" xmlns:wpg="http://schemas.microsoft.com/office/word/2010/wordprocessingGroup" xmlns:wpi="http://schemas.microsoft.com/office/word/2010/wordprocessingInk" xmlns:wne="http://schemas.microsoft.com/office/word/2006/wordml" xmlns:wps="http://schemas.microsoft.com/office/word/2010/wordprocessingShape" mc:Ignorable="w14 w15 w16se w16cid w16 w16cex w16sdtdh w16sdtfl w16du wp14">
   <w:p>
     <w:pPr>
-      <w:pStyle w:val="BodyText"/>
+      <w:pStyle w:val="Tijeloteksta"/>
       <w:spacing w:line="14" w:lineRule="auto"/>
       <w:rPr>
         <w:sz w:val="2"/>
@@ -39909,10 +40077,10 @@
 </file>
 
 <file path=word/footer8.xml><?xml version="1.0" encoding="utf-8"?>
-<w:ftr xmlns:wpc="http://schemas.microsoft.com/office/word/2010/wordprocessingCanvas" xmlns:cx="http://schemas.microsoft.com/office/drawing/2014/chartex" xmlns:cx1="http://schemas.microsoft.com/office/drawing/2015/9/8/chartex" xmlns:cx2="http://schemas.microsoft.com/office/drawing/2015/10/21/chartex" xmlns:cx3="http://schemas.microsoft.com/office/drawing/2016/5/9/chartex" xmlns:cx4="http://schemas.microsoft.com/office/drawing/2016/5/10/chartex" xmlns:cx5="http://schemas.microsoft.com/office/drawing/2016/5/11/chartex" xmlns:cx6="http://schemas.microsoft.com/office/drawing/2016/5/12/chartex" xmlns:cx7="http://schemas.microsoft.com/office/drawing/2016/5/13/chartex" xmlns:cx8="http://schemas.microsoft.com/office/drawing/2016/5/14/chartex" xmlns:mc="http://schemas.openxmlformats.org/markup-compatibility/2006" xmlns:aink="http://schemas.microsoft.com/office/drawing/2016/ink" xmlns:am3d="http://schemas.microsoft.com/office/drawing/2017/model3d" xmlns:o="urn:schemas-microsoft-com:office:office" xmlns:oel="http://schemas.microsoft.com/office/2019/extlst" xmlns:r="http://schemas.openxmlformats.org/officeDocument/2006/relationships" xmlns:m="http://schemas.openxmlformats.org/officeDocument/2006/math" xmlns:v="urn:schemas-microsoft-com:vml" xmlns:wp14="http://schemas.microsoft.com/office/word/2010/wordprocessingDrawing" xmlns:wp="http://schemas.openxmlformats.org/drawingml/2006/wordprocessingDrawing" xmlns:w10="urn:schemas-microsoft-com:office:word" xmlns:w="http://schemas.openxmlformats.org/wordprocessingml/2006/main" xmlns:w14="http://schemas.microsoft.com/office/word/2010/wordml" xmlns:w15="http://schemas.microsoft.com/office/word/2012/wordml" xmlns:w16cei="http://schemas.microsoft.com/office/word/2026/wordml/cei" xmlns:w16cex="http://schemas.microsoft.com/office/word/2018/wordml/cex" xmlns:w16cid="http://schemas.microsoft.com/office/word/2016/wordml/cid" xmlns:w16="http://schemas.microsoft.com/office/word/2018/wordml" xmlns:w16du="http://schemas.microsoft.com/office/word/2023/wordml/word16du" xmlns:w16sdtdh="http://schemas.microsoft.com/office/word/2020/wordml/sdtdatahash" xmlns:w16sdtfl="http://schemas.microsoft.com/office/word/2024/wordml/sdtformatlock" xmlns:w16se="http://schemas.microsoft.com/office/word/2015/wordml/symex" xmlns:wpg="http://schemas.microsoft.com/office/word/2010/wordprocessingGroup" xmlns:wpi="http://schemas.microsoft.com/office/word/2010/wordprocessingInk" xmlns:wne="http://schemas.microsoft.com/office/word/2006/wordml" xmlns:wps="http://schemas.microsoft.com/office/word/2010/wordprocessingShape" mc:Ignorable="w14 w15 w16se w16cid w16 w16cex w16sdtdh w16sdtfl w16du wp14">
+<w:ftr xmlns:wpc="http://schemas.microsoft.com/office/word/2010/wordprocessingCanvas" xmlns:cx="http://schemas.microsoft.com/office/drawing/2014/chartex" xmlns:cx1="http://schemas.microsoft.com/office/drawing/2015/9/8/chartex" xmlns:cx2="http://schemas.microsoft.com/office/drawing/2015/10/21/chartex" xmlns:cx3="http://schemas.microsoft.com/office/drawing/2016/5/9/chartex" xmlns:cx4="http://schemas.microsoft.com/office/drawing/2016/5/10/chartex" xmlns:cx5="http://schemas.microsoft.com/office/drawing/2016/5/11/chartex" xmlns:cx6="http://schemas.microsoft.com/office/drawing/2016/5/12/chartex" xmlns:cx7="http://schemas.microsoft.com/office/drawing/2016/5/13/chartex" xmlns:cx8="http://schemas.microsoft.com/office/drawing/2016/5/14/chartex" xmlns:mc="http://schemas.openxmlformats.org/markup-compatibility/2006" xmlns:aink="http://schemas.microsoft.com/office/drawing/2016/ink" xmlns:am3d="http://schemas.microsoft.com/office/drawing/2017/model3d" xmlns:o="urn:schemas-microsoft-com:office:office" xmlns:oel="http://schemas.microsoft.com/office/2019/extlst" xmlns:r="http://schemas.openxmlformats.org/officeDocument/2006/relationships" xmlns:m="http://schemas.openxmlformats.org/officeDocument/2006/math" xmlns:v="urn:schemas-microsoft-com:vml" xmlns:wp14="http://schemas.microsoft.com/office/word/2010/wordprocessingDrawing" xmlns:wp="http://schemas.openxmlformats.org/drawingml/2006/wordprocessingDrawing" xmlns:w10="urn:schemas-microsoft-com:office:word" xmlns:w="http://schemas.openxmlformats.org/wordprocessingml/2006/main" xmlns:w14="http://schemas.microsoft.com/office/word/2010/wordml" xmlns:w15="http://schemas.microsoft.com/office/word/2012/wordml" xmlns:w16cex="http://schemas.microsoft.com/office/word/2018/wordml/cex" xmlns:w16cid="http://schemas.microsoft.com/office/word/2016/wordml/cid" xmlns:w16="http://schemas.microsoft.com/office/word/2018/wordml" xmlns:w16du="http://schemas.microsoft.com/office/word/2023/wordml/word16du" xmlns:w16sdtdh="http://schemas.microsoft.com/office/word/2020/wordml/sdtdatahash" xmlns:w16sdtfl="http://schemas.microsoft.com/office/word/2024/wordml/sdtformatlock" xmlns:w16se="http://schemas.microsoft.com/office/word/2015/wordml/symex" xmlns:wpg="http://schemas.microsoft.com/office/word/2010/wordprocessingGroup" xmlns:wpi="http://schemas.microsoft.com/office/word/2010/wordprocessingInk" xmlns:wne="http://schemas.microsoft.com/office/word/2006/wordml" xmlns:wps="http://schemas.microsoft.com/office/word/2010/wordprocessingShape" mc:Ignorable="w14 w15 w16se w16cid w16 w16cex w16sdtdh w16sdtfl w16du wp14">
   <w:p>
     <w:pPr>
-      <w:pStyle w:val="BodyText"/>
+      <w:pStyle w:val="Tijeloteksta"/>
       <w:spacing w:line="14" w:lineRule="auto"/>
       <w:rPr>
         <w:sz w:val="2"/>
@@ -39923,7 +40091,7 @@
 </file>
 
 <file path=word/footnotes.xml><?xml version="1.0" encoding="utf-8"?>
-<w:footnotes xmlns:wpc="http://schemas.microsoft.com/office/word/2010/wordprocessingCanvas" xmlns:cx="http://schemas.microsoft.com/office/drawing/2014/chartex" xmlns:cx1="http://schemas.microsoft.com/office/drawing/2015/9/8/chartex" xmlns:cx2="http://schemas.microsoft.com/office/drawing/2015/10/21/chartex" xmlns:cx3="http://schemas.microsoft.com/office/drawing/2016/5/9/chartex" xmlns:cx4="http://schemas.microsoft.com/office/drawing/2016/5/10/chartex" xmlns:cx5="http://schemas.microsoft.com/office/drawing/2016/5/11/chartex" xmlns:cx6="http://schemas.microsoft.com/office/drawing/2016/5/12/chartex" xmlns:cx7="http://schemas.microsoft.com/office/drawing/2016/5/13/chartex" xmlns:cx8="http://schemas.microsoft.com/office/drawing/2016/5/14/chartex" xmlns:mc="http://schemas.openxmlformats.org/markup-compatibility/2006" xmlns:aink="http://schemas.microsoft.com/office/drawing/2016/ink" xmlns:am3d="http://schemas.microsoft.com/office/drawing/2017/model3d" xmlns:o="urn:schemas-microsoft-com:office:office" xmlns:oel="http://schemas.microsoft.com/office/2019/extlst" xmlns:r="http://schemas.openxmlformats.org/officeDocument/2006/relationships" xmlns:m="http://schemas.openxmlformats.org/officeDocument/2006/math" xmlns:v="urn:schemas-microsoft-com:vml" xmlns:wp14="http://schemas.microsoft.com/office/word/2010/wordprocessingDrawing" xmlns:wp="http://schemas.openxmlformats.org/drawingml/2006/wordprocessingDrawing" xmlns:w10="urn:schemas-microsoft-com:office:word" xmlns:w="http://schemas.openxmlformats.org/wordprocessingml/2006/main" xmlns:w14="http://schemas.microsoft.com/office/word/2010/wordml" xmlns:w15="http://schemas.microsoft.com/office/word/2012/wordml" xmlns:w16cei="http://schemas.microsoft.com/office/word/2026/wordml/cei" xmlns:w16cex="http://schemas.microsoft.com/office/word/2018/wordml/cex" xmlns:w16cid="http://schemas.microsoft.com/office/word/2016/wordml/cid" xmlns:w16="http://schemas.microsoft.com/office/word/2018/wordml" xmlns:w16du="http://schemas.microsoft.com/office/word/2023/wordml/word16du" xmlns:w16sdtdh="http://schemas.microsoft.com/office/word/2020/wordml/sdtdatahash" xmlns:w16sdtfl="http://schemas.microsoft.com/office/word/2024/wordml/sdtformatlock" xmlns:w16se="http://schemas.microsoft.com/office/word/2015/wordml/symex" xmlns:wpg="http://schemas.microsoft.com/office/word/2010/wordprocessingGroup" xmlns:wpi="http://schemas.microsoft.com/office/word/2010/wordprocessingInk" xmlns:wne="http://schemas.microsoft.com/office/word/2006/wordml" xmlns:wps="http://schemas.microsoft.com/office/word/2010/wordprocessingShape" mc:Ignorable="w14 w15 w16se w16cid w16 w16cex w16sdtdh w16sdtfl w16du wp14">
+<w:footnotes xmlns:wpc="http://schemas.microsoft.com/office/word/2010/wordprocessingCanvas" xmlns:cx="http://schemas.microsoft.com/office/drawing/2014/chartex" xmlns:cx1="http://schemas.microsoft.com/office/drawing/2015/9/8/chartex" xmlns:cx2="http://schemas.microsoft.com/office/drawing/2015/10/21/chartex" xmlns:cx3="http://schemas.microsoft.com/office/drawing/2016/5/9/chartex" xmlns:cx4="http://schemas.microsoft.com/office/drawing/2016/5/10/chartex" xmlns:cx5="http://schemas.microsoft.com/office/drawing/2016/5/11/chartex" xmlns:cx6="http://schemas.microsoft.com/office/drawing/2016/5/12/chartex" xmlns:cx7="http://schemas.microsoft.com/office/drawing/2016/5/13/chartex" xmlns:cx8="http://schemas.microsoft.com/office/drawing/2016/5/14/chartex" xmlns:mc="http://schemas.openxmlformats.org/markup-compatibility/2006" xmlns:aink="http://schemas.microsoft.com/office/drawing/2016/ink" xmlns:am3d="http://schemas.microsoft.com/office/drawing/2017/model3d" xmlns:o="urn:schemas-microsoft-com:office:office" xmlns:oel="http://schemas.microsoft.com/office/2019/extlst" xmlns:r="http://schemas.openxmlformats.org/officeDocument/2006/relationships" xmlns:m="http://schemas.openxmlformats.org/officeDocument/2006/math" xmlns:v="urn:schemas-microsoft-com:vml" xmlns:wp14="http://schemas.microsoft.com/office/word/2010/wordprocessingDrawing" xmlns:wp="http://schemas.openxmlformats.org/drawingml/2006/wordprocessingDrawing" xmlns:w10="urn:schemas-microsoft-com:office:word" xmlns:w="http://schemas.openxmlformats.org/wordprocessingml/2006/main" xmlns:w14="http://schemas.microsoft.com/office/word/2010/wordml" xmlns:w15="http://schemas.microsoft.com/office/word/2012/wordml" xmlns:w16cex="http://schemas.microsoft.com/office/word/2018/wordml/cex" xmlns:w16cid="http://schemas.microsoft.com/office/word/2016/wordml/cid" xmlns:w16="http://schemas.microsoft.com/office/word/2018/wordml" xmlns:w16du="http://schemas.microsoft.com/office/word/2023/wordml/word16du" xmlns:w16sdtdh="http://schemas.microsoft.com/office/word/2020/wordml/sdtdatahash" xmlns:w16sdtfl="http://schemas.microsoft.com/office/word/2024/wordml/sdtformatlock" xmlns:w16se="http://schemas.microsoft.com/office/word/2015/wordml/symex" xmlns:wpg="http://schemas.microsoft.com/office/word/2010/wordprocessingGroup" xmlns:wpi="http://schemas.microsoft.com/office/word/2010/wordprocessingInk" xmlns:wne="http://schemas.microsoft.com/office/word/2006/wordml" xmlns:wps="http://schemas.microsoft.com/office/word/2010/wordprocessingShape" mc:Ignorable="w14 w15 w16se w16cid w16 w16cex w16sdtdh w16sdtfl w16du wp14">
   <w:footnote w:type="separator" w:id="-1">
     <w:p>
       <w:r>
@@ -39942,7 +40110,7 @@
 </file>
 
 <file path=word/numbering.xml><?xml version="1.0" encoding="utf-8"?>
-<w:numbering xmlns:wpc="http://schemas.microsoft.com/office/word/2010/wordprocessingCanvas" xmlns:cx="http://schemas.microsoft.com/office/drawing/2014/chartex" xmlns:cx1="http://schemas.microsoft.com/office/drawing/2015/9/8/chartex" xmlns:cx2="http://schemas.microsoft.com/office/drawing/2015/10/21/chartex" xmlns:cx3="http://schemas.microsoft.com/office/drawing/2016/5/9/chartex" xmlns:cx4="http://schemas.microsoft.com/office/drawing/2016/5/10/chartex" xmlns:cx5="http://schemas.microsoft.com/office/drawing/2016/5/11/chartex" xmlns:cx6="http://schemas.microsoft.com/office/drawing/2016/5/12/chartex" xmlns:cx7="http://schemas.microsoft.com/office/drawing/2016/5/13/chartex" xmlns:cx8="http://schemas.microsoft.com/office/drawing/2016/5/14/chartex" xmlns:mc="http://schemas.openxmlformats.org/markup-compatibility/2006" xmlns:aink="http://schemas.microsoft.com/office/drawing/2016/ink" xmlns:am3d="http://schemas.microsoft.com/office/drawing/2017/model3d" xmlns:o="urn:schemas-microsoft-com:office:office" xmlns:oel="http://schemas.microsoft.com/office/2019/extlst" xmlns:r="http://schemas.openxmlformats.org/officeDocument/2006/relationships" xmlns:m="http://schemas.openxmlformats.org/officeDocument/2006/math" xmlns:v="urn:schemas-microsoft-com:vml" xmlns:wp14="http://schemas.microsoft.com/office/word/2010/wordprocessingDrawing" xmlns:wp="http://schemas.openxmlformats.org/drawingml/2006/wordprocessingDrawing" xmlns:w10="urn:schemas-microsoft-com:office:word" xmlns:w="http://schemas.openxmlformats.org/wordprocessingml/2006/main" xmlns:w14="http://schemas.microsoft.com/office/word/2010/wordml" xmlns:w15="http://schemas.microsoft.com/office/word/2012/wordml" xmlns:w16cei="http://schemas.microsoft.com/office/word/2026/wordml/cei" xmlns:w16cex="http://schemas.microsoft.com/office/word/2018/wordml/cex" xmlns:w16cid="http://schemas.microsoft.com/office/word/2016/wordml/cid" xmlns:w16="http://schemas.microsoft.com/office/word/2018/wordml" xmlns:w16du="http://schemas.microsoft.com/office/word/2023/wordml/word16du" xmlns:w16sdtdh="http://schemas.microsoft.com/office/word/2020/wordml/sdtdatahash" xmlns:w16sdtfl="http://schemas.microsoft.com/office/word/2024/wordml/sdtformatlock" xmlns:w16se="http://schemas.microsoft.com/office/word/2015/wordml/symex" xmlns:wpg="http://schemas.microsoft.com/office/word/2010/wordprocessingGroup" xmlns:wpi="http://schemas.microsoft.com/office/word/2010/wordprocessingInk" xmlns:wne="http://schemas.microsoft.com/office/word/2006/wordml" xmlns:wps="http://schemas.microsoft.com/office/word/2010/wordprocessingShape" mc:Ignorable="w14 w15 w16se w16cid w16 w16cex w16sdtdh w16sdtfl w16du wp14">
+<w:numbering xmlns:wpc="http://schemas.microsoft.com/office/word/2010/wordprocessingCanvas" xmlns:cx="http://schemas.microsoft.com/office/drawing/2014/chartex" xmlns:cx1="http://schemas.microsoft.com/office/drawing/2015/9/8/chartex" xmlns:cx2="http://schemas.microsoft.com/office/drawing/2015/10/21/chartex" xmlns:cx3="http://schemas.microsoft.com/office/drawing/2016/5/9/chartex" xmlns:cx4="http://schemas.microsoft.com/office/drawing/2016/5/10/chartex" xmlns:cx5="http://schemas.microsoft.com/office/drawing/2016/5/11/chartex" xmlns:cx6="http://schemas.microsoft.com/office/drawing/2016/5/12/chartex" xmlns:cx7="http://schemas.microsoft.com/office/drawing/2016/5/13/chartex" xmlns:cx8="http://schemas.microsoft.com/office/drawing/2016/5/14/chartex" xmlns:mc="http://schemas.openxmlformats.org/markup-compatibility/2006" xmlns:aink="http://schemas.microsoft.com/office/drawing/2016/ink" xmlns:am3d="http://schemas.microsoft.com/office/drawing/2017/model3d" xmlns:o="urn:schemas-microsoft-com:office:office" xmlns:oel="http://schemas.microsoft.com/office/2019/extlst" xmlns:r="http://schemas.openxmlformats.org/officeDocument/2006/relationships" xmlns:m="http://schemas.openxmlformats.org/officeDocument/2006/math" xmlns:v="urn:schemas-microsoft-com:vml" xmlns:wp14="http://schemas.microsoft.com/office/word/2010/wordprocessingDrawing" xmlns:wp="http://schemas.openxmlformats.org/drawingml/2006/wordprocessingDrawing" xmlns:w10="urn:schemas-microsoft-com:office:word" xmlns:w="http://schemas.openxmlformats.org/wordprocessingml/2006/main" xmlns:w14="http://schemas.microsoft.com/office/word/2010/wordml" xmlns:w15="http://schemas.microsoft.com/office/word/2012/wordml" xmlns:w16cex="http://schemas.microsoft.com/office/word/2018/wordml/cex" xmlns:w16cid="http://schemas.microsoft.com/office/word/2016/wordml/cid" xmlns:w16="http://schemas.microsoft.com/office/word/2018/wordml" xmlns:w16du="http://schemas.microsoft.com/office/word/2023/wordml/word16du" xmlns:w16sdtdh="http://schemas.microsoft.com/office/word/2020/wordml/sdtdatahash" xmlns:w16sdtfl="http://schemas.microsoft.com/office/word/2024/wordml/sdtformatlock" xmlns:w16se="http://schemas.microsoft.com/office/word/2015/wordml/symex" xmlns:wpg="http://schemas.microsoft.com/office/word/2010/wordprocessingGroup" xmlns:wpi="http://schemas.microsoft.com/office/word/2010/wordprocessingInk" xmlns:wne="http://schemas.microsoft.com/office/word/2006/wordml" xmlns:wps="http://schemas.microsoft.com/office/word/2010/wordprocessingShape" mc:Ignorable="w14 w15 w16se w16cid w16 w16cex w16sdtdh w16sdtfl w16du wp14">
   <w:abstractNum w:abstractNumId="0" w15:restartNumberingAfterBreak="0">
     <w:nsid w:val="028A062C"/>
     <w:multiLevelType w:val="multilevel"/>
@@ -44148,10 +44316,10 @@
       <w:lang w:val="hr-HR"/>
     </w:rPr>
   </w:style>
-  <w:style w:type="paragraph" w:styleId="Heading1">
+  <w:style w:type="paragraph" w:styleId="Naslov1">
     <w:name w:val="heading 1"/>
     <w:basedOn w:val="Normal"/>
-    <w:link w:val="Heading1Char"/>
+    <w:link w:val="Naslov1Char"/>
     <w:uiPriority w:val="9"/>
     <w:qFormat/>
     <w:pPr>
@@ -44166,10 +44334,10 @@
       <w:szCs w:val="28"/>
     </w:rPr>
   </w:style>
-  <w:style w:type="paragraph" w:styleId="Heading2">
+  <w:style w:type="paragraph" w:styleId="Naslov2">
     <w:name w:val="heading 2"/>
     <w:basedOn w:val="Normal"/>
-    <w:link w:val="Heading2Char"/>
+    <w:link w:val="Naslov2Char"/>
     <w:uiPriority w:val="9"/>
     <w:unhideWhenUsed/>
     <w:qFormat/>
@@ -44184,13 +44352,13 @@
       <w:szCs w:val="24"/>
     </w:rPr>
   </w:style>
-  <w:style w:type="character" w:default="1" w:styleId="DefaultParagraphFont">
+  <w:style w:type="character" w:default="1" w:styleId="Zadanifontodlomka">
     <w:name w:val="Default Paragraph Font"/>
     <w:uiPriority w:val="1"/>
     <w:semiHidden/>
     <w:unhideWhenUsed/>
   </w:style>
-  <w:style w:type="table" w:default="1" w:styleId="TableNormal">
+  <w:style w:type="table" w:default="1" w:styleId="Obinatablica">
     <w:name w:val="Normal Table"/>
     <w:uiPriority w:val="99"/>
     <w:semiHidden/>
@@ -44205,7 +44373,7 @@
       </w:tblCellMar>
     </w:tblPr>
   </w:style>
-  <w:style w:type="numbering" w:default="1" w:styleId="NoList">
+  <w:style w:type="numbering" w:default="1" w:styleId="Bezpopisa">
     <w:name w:val="No List"/>
     <w:uiPriority w:val="99"/>
     <w:semiHidden/>
@@ -44227,7 +44395,7 @@
       </w:tblCellMar>
     </w:tblPr>
   </w:style>
-  <w:style w:type="paragraph" w:styleId="TOC1">
+  <w:style w:type="paragraph" w:styleId="Sadraj1">
     <w:name w:val="toc 1"/>
     <w:basedOn w:val="Normal"/>
     <w:uiPriority w:val="1"/>
@@ -44241,7 +44409,7 @@
       <w:szCs w:val="24"/>
     </w:rPr>
   </w:style>
-  <w:style w:type="paragraph" w:styleId="TOC2">
+  <w:style w:type="paragraph" w:styleId="Sadraj2">
     <w:name w:val="toc 2"/>
     <w:basedOn w:val="Normal"/>
     <w:uiPriority w:val="1"/>
@@ -44255,7 +44423,7 @@
       <w:szCs w:val="24"/>
     </w:rPr>
   </w:style>
-  <w:style w:type="paragraph" w:styleId="TOC3">
+  <w:style w:type="paragraph" w:styleId="Sadraj3">
     <w:name w:val="toc 3"/>
     <w:basedOn w:val="Normal"/>
     <w:uiPriority w:val="1"/>
@@ -44269,7 +44437,7 @@
       <w:szCs w:val="24"/>
     </w:rPr>
   </w:style>
-  <w:style w:type="paragraph" w:styleId="BodyText">
+  <w:style w:type="paragraph" w:styleId="Tijeloteksta">
     <w:name w:val="Body Text"/>
     <w:basedOn w:val="Normal"/>
     <w:uiPriority w:val="1"/>
@@ -44279,7 +44447,7 @@
       <w:szCs w:val="24"/>
     </w:rPr>
   </w:style>
-  <w:style w:type="paragraph" w:styleId="Title">
+  <w:style w:type="paragraph" w:styleId="Naslov">
     <w:name w:val="Title"/>
     <w:basedOn w:val="Normal"/>
     <w:uiPriority w:val="10"/>
@@ -44294,7 +44462,7 @@
       <w:szCs w:val="36"/>
     </w:rPr>
   </w:style>
-  <w:style w:type="paragraph" w:styleId="ListParagraph">
+  <w:style w:type="paragraph" w:styleId="Odlomakpopisa">
     <w:name w:val="List Paragraph"/>
     <w:basedOn w:val="Normal"/>
     <w:uiPriority w:val="1"/>
@@ -44313,10 +44481,10 @@
       <w:spacing w:before="2"/>
     </w:pPr>
   </w:style>
-  <w:style w:type="paragraph" w:styleId="Header">
+  <w:style w:type="paragraph" w:styleId="Zaglavlje">
     <w:name w:val="header"/>
     <w:basedOn w:val="Normal"/>
-    <w:link w:val="HeaderChar"/>
+    <w:link w:val="ZaglavljeChar"/>
     <w:uiPriority w:val="99"/>
     <w:unhideWhenUsed/>
     <w:rsid w:val="003B739B"/>
@@ -44327,10 +44495,10 @@
       </w:tabs>
     </w:pPr>
   </w:style>
-  <w:style w:type="character" w:customStyle="1" w:styleId="HeaderChar">
-    <w:name w:val="Header Char"/>
-    <w:basedOn w:val="DefaultParagraphFont"/>
-    <w:link w:val="Header"/>
+  <w:style w:type="character" w:customStyle="1" w:styleId="ZaglavljeChar">
+    <w:name w:val="Zaglavlje Char"/>
+    <w:basedOn w:val="Zadanifontodlomka"/>
+    <w:link w:val="Zaglavlje"/>
     <w:uiPriority w:val="99"/>
     <w:rsid w:val="003B739B"/>
     <w:rPr>
@@ -44338,10 +44506,10 @@
       <w:lang w:val="hr-HR"/>
     </w:rPr>
   </w:style>
-  <w:style w:type="paragraph" w:styleId="Footer">
+  <w:style w:type="paragraph" w:styleId="Podnoje">
     <w:name w:val="footer"/>
     <w:basedOn w:val="Normal"/>
-    <w:link w:val="FooterChar"/>
+    <w:link w:val="PodnojeChar"/>
     <w:uiPriority w:val="99"/>
     <w:unhideWhenUsed/>
     <w:rsid w:val="003B739B"/>
@@ -44352,10 +44520,10 @@
       </w:tabs>
     </w:pPr>
   </w:style>
-  <w:style w:type="character" w:customStyle="1" w:styleId="FooterChar">
-    <w:name w:val="Footer Char"/>
-    <w:basedOn w:val="DefaultParagraphFont"/>
-    <w:link w:val="Footer"/>
+  <w:style w:type="character" w:customStyle="1" w:styleId="PodnojeChar">
+    <w:name w:val="Podnožje Char"/>
+    <w:basedOn w:val="Zadanifontodlomka"/>
+    <w:link w:val="Podnoje"/>
     <w:uiPriority w:val="99"/>
     <w:rsid w:val="003B739B"/>
     <w:rPr>
@@ -44363,10 +44531,10 @@
       <w:lang w:val="hr-HR"/>
     </w:rPr>
   </w:style>
-  <w:style w:type="character" w:customStyle="1" w:styleId="Heading2Char">
-    <w:name w:val="Heading 2 Char"/>
-    <w:basedOn w:val="DefaultParagraphFont"/>
-    <w:link w:val="Heading2"/>
+  <w:style w:type="character" w:customStyle="1" w:styleId="Naslov2Char">
+    <w:name w:val="Naslov 2 Char"/>
+    <w:basedOn w:val="Zadanifontodlomka"/>
+    <w:link w:val="Naslov2"/>
     <w:uiPriority w:val="9"/>
     <w:rsid w:val="00B7598E"/>
     <w:rPr>
@@ -44378,10 +44546,10 @@
       <w:lang w:val="hr-HR"/>
     </w:rPr>
   </w:style>
-  <w:style w:type="character" w:customStyle="1" w:styleId="Heading1Char">
-    <w:name w:val="Heading 1 Char"/>
-    <w:basedOn w:val="DefaultParagraphFont"/>
-    <w:link w:val="Heading1"/>
+  <w:style w:type="character" w:customStyle="1" w:styleId="Naslov1Char">
+    <w:name w:val="Naslov 1 Char"/>
+    <w:basedOn w:val="Zadanifontodlomka"/>
+    <w:link w:val="Naslov1"/>
     <w:uiPriority w:val="9"/>
     <w:rsid w:val="00F7687D"/>
     <w:rPr>

</xml_diff>